<commit_message>
Release 1.0.0: refreshed screenshots, amenities in guide and landing page
</commit_message>
<xml_diff>
--- a/docs/FareLens.docx
+++ b/docs/FareLens.docx
@@ -17,7 +17,7 @@
           <w:noProof/>
         </w:rPr>
         <w:drawing>
-          <wp:inline distT="0" distB="0" distL="0" distR="0" wp14:anchorId="5D477A8C" wp14:editId="1A353A68">
+          <wp:inline distT="0" distB="0" distL="0" distR="0" wp14:anchorId="25B4B8CD" wp14:editId="21226751">
             <wp:extent cx="1905000" cy="266700"/>
             <wp:effectExtent l="0" t="0" r="0" b="0"/>
             <wp:docPr id="1" name="Picture 1"/>
@@ -173,13 +173,14 @@
           <w:sz w:val="40"/>
           <w:szCs w:val="40"/>
         </w:rPr>
+        <w:lastRenderedPageBreak/>
         <w:t>Contents</w:t>
       </w:r>
     </w:p>
     <w:sdt>
       <w:sdtPr>
         <w:alias w:val="Contents"/>
-        <w:id w:val="-1608953249"/>
+        <w:id w:val="1037696846"/>
       </w:sdtPr>
       <w:sdtEndPr/>
       <w:sdtContent>
@@ -208,7 +209,7 @@
           <w:r>
             <w:fldChar w:fldCharType="separate"/>
           </w:r>
-          <w:hyperlink w:anchor="_Toc241000473" w:history="1">
+          <w:hyperlink w:anchor="_Toc241913493" w:history="1">
             <w:r>
               <w:rPr>
                 <w:rStyle w:val="Hyperlink"/>
@@ -232,7 +233,7 @@
               <w:rPr>
                 <w:noProof/>
               </w:rPr>
-              <w:instrText xml:space="preserve"> PAGEREF _Toc241000473 \h </w:instrText>
+              <w:instrText xml:space="preserve"> PAGEREF _Toc241913493 \h </w:instrText>
             </w:r>
             <w:r>
               <w:rPr>
@@ -275,7 +276,7 @@
               <w14:ligatures w14:val="standardContextual"/>
             </w:rPr>
           </w:pPr>
-          <w:hyperlink w:anchor="_Toc241000474" w:history="1">
+          <w:hyperlink w:anchor="_Toc241913494" w:history="1">
             <w:r>
               <w:rPr>
                 <w:rStyle w:val="Hyperlink"/>
@@ -299,7 +300,7 @@
               <w:rPr>
                 <w:noProof/>
               </w:rPr>
-              <w:instrText xml:space="preserve"> PAGEREF _Toc241000474 \h </w:instrText>
+              <w:instrText xml:space="preserve"> PAGEREF _Toc241913494 \h </w:instrText>
             </w:r>
             <w:r>
               <w:rPr>
@@ -342,7 +343,7 @@
               <w14:ligatures w14:val="standardContextual"/>
             </w:rPr>
           </w:pPr>
-          <w:hyperlink w:anchor="_Toc241000475" w:history="1">
+          <w:hyperlink w:anchor="_Toc241913495" w:history="1">
             <w:r>
               <w:rPr>
                 <w:rStyle w:val="Hyperlink"/>
@@ -366,7 +367,7 @@
               <w:rPr>
                 <w:noProof/>
               </w:rPr>
-              <w:instrText xml:space="preserve"> PAGEREF _Toc241000475 \h </w:instrText>
+              <w:instrText xml:space="preserve"> PAGEREF _Toc241913495 \h </w:instrText>
             </w:r>
             <w:r>
               <w:rPr>
@@ -409,7 +410,7 @@
               <w14:ligatures w14:val="standardContextual"/>
             </w:rPr>
           </w:pPr>
-          <w:hyperlink w:anchor="_Toc241000476" w:history="1">
+          <w:hyperlink w:anchor="_Toc241913496" w:history="1">
             <w:r>
               <w:rPr>
                 <w:rStyle w:val="Hyperlink"/>
@@ -433,7 +434,7 @@
               <w:rPr>
                 <w:noProof/>
               </w:rPr>
-              <w:instrText xml:space="preserve"> PAGEREF _Toc241000476 \h </w:instrText>
+              <w:instrText xml:space="preserve"> PAGEREF _Toc241913496 \h </w:instrText>
             </w:r>
             <w:r>
               <w:rPr>
@@ -476,7 +477,7 @@
               <w14:ligatures w14:val="standardContextual"/>
             </w:rPr>
           </w:pPr>
-          <w:hyperlink w:anchor="_Toc241000477" w:history="1">
+          <w:hyperlink w:anchor="_Toc241913497" w:history="1">
             <w:r>
               <w:rPr>
                 <w:rStyle w:val="Hyperlink"/>
@@ -500,7 +501,7 @@
               <w:rPr>
                 <w:noProof/>
               </w:rPr>
-              <w:instrText xml:space="preserve"> PAGEREF _Toc241000477 \h </w:instrText>
+              <w:instrText xml:space="preserve"> PAGEREF _Toc241913497 \h </w:instrText>
             </w:r>
             <w:r>
               <w:rPr>
@@ -543,7 +544,7 @@
               <w14:ligatures w14:val="standardContextual"/>
             </w:rPr>
           </w:pPr>
-          <w:hyperlink w:anchor="_Toc241000478" w:history="1">
+          <w:hyperlink w:anchor="_Toc241913498" w:history="1">
             <w:r>
               <w:rPr>
                 <w:rStyle w:val="Hyperlink"/>
@@ -567,7 +568,7 @@
               <w:rPr>
                 <w:noProof/>
               </w:rPr>
-              <w:instrText xml:space="preserve"> PAGEREF _Toc241000478 \h </w:instrText>
+              <w:instrText xml:space="preserve"> PAGEREF _Toc241913498 \h </w:instrText>
             </w:r>
             <w:r>
               <w:rPr>
@@ -610,7 +611,7 @@
               <w14:ligatures w14:val="standardContextual"/>
             </w:rPr>
           </w:pPr>
-          <w:hyperlink w:anchor="_Toc241000479" w:history="1">
+          <w:hyperlink w:anchor="_Toc241913499" w:history="1">
             <w:r>
               <w:rPr>
                 <w:rStyle w:val="Hyperlink"/>
@@ -634,7 +635,7 @@
               <w:rPr>
                 <w:noProof/>
               </w:rPr>
-              <w:instrText xml:space="preserve"> PAGEREF _Toc241000479 \h </w:instrText>
+              <w:instrText xml:space="preserve"> PAGEREF _Toc241913499 \h </w:instrText>
             </w:r>
             <w:r>
               <w:rPr>
@@ -677,7 +678,7 @@
               <w14:ligatures w14:val="standardContextual"/>
             </w:rPr>
           </w:pPr>
-          <w:hyperlink w:anchor="_Toc241000480" w:history="1">
+          <w:hyperlink w:anchor="_Toc241913500" w:history="1">
             <w:r>
               <w:rPr>
                 <w:rStyle w:val="Hyperlink"/>
@@ -701,7 +702,7 @@
               <w:rPr>
                 <w:noProof/>
               </w:rPr>
-              <w:instrText xml:space="preserve"> PAGEREF _Toc241000480 \h </w:instrText>
+              <w:instrText xml:space="preserve"> PAGEREF _Toc241913500 \h </w:instrText>
             </w:r>
             <w:r>
               <w:rPr>
@@ -744,7 +745,7 @@
               <w14:ligatures w14:val="standardContextual"/>
             </w:rPr>
           </w:pPr>
-          <w:hyperlink w:anchor="_Toc241000481" w:history="1">
+          <w:hyperlink w:anchor="_Toc241913501" w:history="1">
             <w:r>
               <w:rPr>
                 <w:rStyle w:val="Hyperlink"/>
@@ -768,7 +769,7 @@
               <w:rPr>
                 <w:noProof/>
               </w:rPr>
-              <w:instrText xml:space="preserve"> PAGEREF _Toc241000481 \h </w:instrText>
+              <w:instrText xml:space="preserve"> PAGEREF _Toc241913501 \h </w:instrText>
             </w:r>
             <w:r>
               <w:rPr>
@@ -811,7 +812,7 @@
               <w14:ligatures w14:val="standardContextual"/>
             </w:rPr>
           </w:pPr>
-          <w:hyperlink w:anchor="_Toc241000482" w:history="1">
+          <w:hyperlink w:anchor="_Toc241913502" w:history="1">
             <w:r>
               <w:rPr>
                 <w:rStyle w:val="Hyperlink"/>
@@ -835,7 +836,7 @@
               <w:rPr>
                 <w:noProof/>
               </w:rPr>
-              <w:instrText xml:space="preserve"> PAGEREF _Toc241000482 \h </w:instrText>
+              <w:instrText xml:space="preserve"> PAGEREF _Toc241913502 \h </w:instrText>
             </w:r>
             <w:r>
               <w:rPr>
@@ -878,7 +879,7 @@
               <w14:ligatures w14:val="standardContextual"/>
             </w:rPr>
           </w:pPr>
-          <w:hyperlink w:anchor="_Toc241000483" w:history="1">
+          <w:hyperlink w:anchor="_Toc241913503" w:history="1">
             <w:r>
               <w:rPr>
                 <w:rStyle w:val="Hyperlink"/>
@@ -902,7 +903,7 @@
               <w:rPr>
                 <w:noProof/>
               </w:rPr>
-              <w:instrText xml:space="preserve"> PAGEREF _Toc241000483 \h </w:instrText>
+              <w:instrText xml:space="preserve"> PAGEREF _Toc241913503 \h </w:instrText>
             </w:r>
             <w:r>
               <w:rPr>
@@ -945,7 +946,7 @@
               <w14:ligatures w14:val="standardContextual"/>
             </w:rPr>
           </w:pPr>
-          <w:hyperlink w:anchor="_Toc241000484" w:history="1">
+          <w:hyperlink w:anchor="_Toc241913504" w:history="1">
             <w:r>
               <w:rPr>
                 <w:rStyle w:val="Hyperlink"/>
@@ -969,7 +970,7 @@
               <w:rPr>
                 <w:noProof/>
               </w:rPr>
-              <w:instrText xml:space="preserve"> PAGEREF _Toc241000484 \h </w:instrText>
+              <w:instrText xml:space="preserve"> PAGEREF _Toc241913504 \h </w:instrText>
             </w:r>
             <w:r>
               <w:rPr>
@@ -1012,7 +1013,7 @@
               <w14:ligatures w14:val="standardContextual"/>
             </w:rPr>
           </w:pPr>
-          <w:hyperlink w:anchor="_Toc241000485" w:history="1">
+          <w:hyperlink w:anchor="_Toc241913505" w:history="1">
             <w:r>
               <w:rPr>
                 <w:rStyle w:val="Hyperlink"/>
@@ -1036,7 +1037,7 @@
               <w:rPr>
                 <w:noProof/>
               </w:rPr>
-              <w:instrText xml:space="preserve"> PAGEREF _Toc241000485 \h </w:instrText>
+              <w:instrText xml:space="preserve"> PAGEREF _Toc241913505 \h </w:instrText>
             </w:r>
             <w:r>
               <w:rPr>
@@ -1079,7 +1080,7 @@
               <w14:ligatures w14:val="standardContextual"/>
             </w:rPr>
           </w:pPr>
-          <w:hyperlink w:anchor="_Toc241000486" w:history="1">
+          <w:hyperlink w:anchor="_Toc241913506" w:history="1">
             <w:r>
               <w:rPr>
                 <w:rStyle w:val="Hyperlink"/>
@@ -1103,7 +1104,7 @@
               <w:rPr>
                 <w:noProof/>
               </w:rPr>
-              <w:instrText xml:space="preserve"> PAGEREF _Toc241000486 \h </w:instrText>
+              <w:instrText xml:space="preserve"> PAGEREF _Toc241913506 \h </w:instrText>
             </w:r>
             <w:r>
               <w:rPr>
@@ -1146,7 +1147,7 @@
               <w14:ligatures w14:val="standardContextual"/>
             </w:rPr>
           </w:pPr>
-          <w:hyperlink w:anchor="_Toc241000487" w:history="1">
+          <w:hyperlink w:anchor="_Toc241913507" w:history="1">
             <w:r>
               <w:rPr>
                 <w:rStyle w:val="Hyperlink"/>
@@ -1170,7 +1171,7 @@
               <w:rPr>
                 <w:noProof/>
               </w:rPr>
-              <w:instrText xml:space="preserve"> PAGEREF _Toc241000487 \h </w:instrText>
+              <w:instrText xml:space="preserve"> PAGEREF _Toc241913507 \h </w:instrText>
             </w:r>
             <w:r>
               <w:rPr>
@@ -1213,7 +1214,7 @@
               <w14:ligatures w14:val="standardContextual"/>
             </w:rPr>
           </w:pPr>
-          <w:hyperlink w:anchor="_Toc241000488" w:history="1">
+          <w:hyperlink w:anchor="_Toc241913508" w:history="1">
             <w:r>
               <w:rPr>
                 <w:rStyle w:val="Hyperlink"/>
@@ -1237,7 +1238,7 @@
               <w:rPr>
                 <w:noProof/>
               </w:rPr>
-              <w:instrText xml:space="preserve"> PAGEREF _Toc241000488 \h </w:instrText>
+              <w:instrText xml:space="preserve"> PAGEREF _Toc241913508 \h </w:instrText>
             </w:r>
             <w:r>
               <w:rPr>
@@ -1280,13 +1281,13 @@
               <w14:ligatures w14:val="standardContextual"/>
             </w:rPr>
           </w:pPr>
-          <w:hyperlink w:anchor="_Toc241000489" w:history="1">
+          <w:hyperlink w:anchor="_Toc241913509" w:history="1">
             <w:r>
               <w:rPr>
                 <w:rStyle w:val="Hyperlink"/>
                 <w:noProof/>
               </w:rPr>
-              <w:t>3.5 Interactive documentation (Swagger UI)</w:t>
+              <w:t>3.5 POST /api/v1/amenities/summary</w:t>
             </w:r>
             <w:r>
               <w:rPr>
@@ -1304,7 +1305,7 @@
               <w:rPr>
                 <w:noProof/>
               </w:rPr>
-              <w:instrText xml:space="preserve"> PAGEREF _Toc241000489 \h </w:instrText>
+              <w:instrText xml:space="preserve"> PAGEREF _Toc241913509 \h </w:instrText>
             </w:r>
             <w:r>
               <w:rPr>
@@ -1322,6 +1323,140 @@
                 <w:noProof/>
               </w:rPr>
               <w:t>10</w:t>
+            </w:r>
+            <w:r>
+              <w:rPr>
+                <w:noProof/>
+              </w:rPr>
+              <w:fldChar w:fldCharType="end"/>
+            </w:r>
+          </w:hyperlink>
+        </w:p>
+        <w:p>
+          <w:pPr>
+            <w:pStyle w:val="TOC2"/>
+            <w:tabs>
+              <w:tab w:val="right" w:leader="dot" w:pos="10070"/>
+            </w:tabs>
+            <w:rPr>
+              <w:rFonts w:asciiTheme="minorHAnsi" w:eastAsiaTheme="minorEastAsia" w:hAnsiTheme="minorHAnsi" w:cstheme="minorBidi"/>
+              <w:noProof/>
+              <w:color w:val="auto"/>
+              <w:kern w:val="2"/>
+              <w:sz w:val="24"/>
+              <w:szCs w:val="24"/>
+              <w14:ligatures w14:val="standardContextual"/>
+            </w:rPr>
+          </w:pPr>
+          <w:hyperlink w:anchor="_Toc241913510" w:history="1">
+            <w:r>
+              <w:rPr>
+                <w:rStyle w:val="Hyperlink"/>
+                <w:noProof/>
+              </w:rPr>
+              <w:t>3.6 POST /api/v1/amenities/fare-names</w:t>
+            </w:r>
+            <w:r>
+              <w:rPr>
+                <w:noProof/>
+              </w:rPr>
+              <w:tab/>
+            </w:r>
+            <w:r>
+              <w:rPr>
+                <w:noProof/>
+              </w:rPr>
+              <w:fldChar w:fldCharType="begin"/>
+            </w:r>
+            <w:r>
+              <w:rPr>
+                <w:noProof/>
+              </w:rPr>
+              <w:instrText xml:space="preserve"> PAGEREF _Toc241913510 \h </w:instrText>
+            </w:r>
+            <w:r>
+              <w:rPr>
+                <w:noProof/>
+              </w:rPr>
+            </w:r>
+            <w:r>
+              <w:rPr>
+                <w:noProof/>
+              </w:rPr>
+              <w:fldChar w:fldCharType="separate"/>
+            </w:r>
+            <w:r>
+              <w:rPr>
+                <w:noProof/>
+              </w:rPr>
+              <w:t>12</w:t>
+            </w:r>
+            <w:r>
+              <w:rPr>
+                <w:noProof/>
+              </w:rPr>
+              <w:fldChar w:fldCharType="end"/>
+            </w:r>
+          </w:hyperlink>
+        </w:p>
+        <w:p>
+          <w:pPr>
+            <w:pStyle w:val="TOC2"/>
+            <w:tabs>
+              <w:tab w:val="right" w:leader="dot" w:pos="10070"/>
+            </w:tabs>
+            <w:rPr>
+              <w:rFonts w:asciiTheme="minorHAnsi" w:eastAsiaTheme="minorEastAsia" w:hAnsiTheme="minorHAnsi" w:cstheme="minorBidi"/>
+              <w:noProof/>
+              <w:color w:val="auto"/>
+              <w:kern w:val="2"/>
+              <w:sz w:val="24"/>
+              <w:szCs w:val="24"/>
+              <w14:ligatures w14:val="standardContextual"/>
+            </w:rPr>
+          </w:pPr>
+          <w:hyperlink w:anchor="_Toc241913511" w:history="1">
+            <w:r>
+              <w:rPr>
+                <w:rStyle w:val="Hyperlink"/>
+                <w:noProof/>
+              </w:rPr>
+              <w:t>3.7 Interactive documentation (Swagger UI)</w:t>
+            </w:r>
+            <w:r>
+              <w:rPr>
+                <w:noProof/>
+              </w:rPr>
+              <w:tab/>
+            </w:r>
+            <w:r>
+              <w:rPr>
+                <w:noProof/>
+              </w:rPr>
+              <w:fldChar w:fldCharType="begin"/>
+            </w:r>
+            <w:r>
+              <w:rPr>
+                <w:noProof/>
+              </w:rPr>
+              <w:instrText xml:space="preserve"> PAGEREF _Toc241913511 \h </w:instrText>
+            </w:r>
+            <w:r>
+              <w:rPr>
+                <w:noProof/>
+              </w:rPr>
+            </w:r>
+            <w:r>
+              <w:rPr>
+                <w:noProof/>
+              </w:rPr>
+              <w:fldChar w:fldCharType="separate"/>
+            </w:r>
+            <w:r>
+              <w:rPr>
+                <w:noProof/>
+              </w:rPr>
+              <w:t>13</w:t>
             </w:r>
             <w:r>
               <w:rPr>
@@ -1347,7 +1482,7 @@
               <w14:ligatures w14:val="standardContextual"/>
             </w:rPr>
           </w:pPr>
-          <w:hyperlink w:anchor="_Toc241000490" w:history="1">
+          <w:hyperlink w:anchor="_Toc241913512" w:history="1">
             <w:r>
               <w:rPr>
                 <w:rStyle w:val="Hyperlink"/>
@@ -1371,7 +1506,7 @@
               <w:rPr>
                 <w:noProof/>
               </w:rPr>
-              <w:instrText xml:space="preserve"> PAGEREF _Toc241000490 \h </w:instrText>
+              <w:instrText xml:space="preserve"> PAGEREF _Toc241913512 \h </w:instrText>
             </w:r>
             <w:r>
               <w:rPr>
@@ -1388,7 +1523,7 @@
               <w:rPr>
                 <w:noProof/>
               </w:rPr>
-              <w:t>13</w:t>
+              <w:t>16</w:t>
             </w:r>
             <w:r>
               <w:rPr>
@@ -1414,7 +1549,7 @@
               <w14:ligatures w14:val="standardContextual"/>
             </w:rPr>
           </w:pPr>
-          <w:hyperlink w:anchor="_Toc241000491" w:history="1">
+          <w:hyperlink w:anchor="_Toc241913513" w:history="1">
             <w:r>
               <w:rPr>
                 <w:rStyle w:val="Hyperlink"/>
@@ -1438,7 +1573,7 @@
               <w:rPr>
                 <w:noProof/>
               </w:rPr>
-              <w:instrText xml:space="preserve"> PAGEREF _Toc241000491 \h </w:instrText>
+              <w:instrText xml:space="preserve"> PAGEREF _Toc241913513 \h </w:instrText>
             </w:r>
             <w:r>
               <w:rPr>
@@ -1455,7 +1590,7 @@
               <w:rPr>
                 <w:noProof/>
               </w:rPr>
-              <w:t>13</w:t>
+              <w:t>16</w:t>
             </w:r>
             <w:r>
               <w:rPr>
@@ -1481,7 +1616,7 @@
               <w14:ligatures w14:val="standardContextual"/>
             </w:rPr>
           </w:pPr>
-          <w:hyperlink w:anchor="_Toc241000492" w:history="1">
+          <w:hyperlink w:anchor="_Toc241913514" w:history="1">
             <w:r>
               <w:rPr>
                 <w:rStyle w:val="Hyperlink"/>
@@ -1505,7 +1640,7 @@
               <w:rPr>
                 <w:noProof/>
               </w:rPr>
-              <w:instrText xml:space="preserve"> PAGEREF _Toc241000492 \h </w:instrText>
+              <w:instrText xml:space="preserve"> PAGEREF _Toc241913514 \h </w:instrText>
             </w:r>
             <w:r>
               <w:rPr>
@@ -1522,7 +1657,7 @@
               <w:rPr>
                 <w:noProof/>
               </w:rPr>
-              <w:t>13</w:t>
+              <w:t>16</w:t>
             </w:r>
             <w:r>
               <w:rPr>
@@ -1548,7 +1683,7 @@
               <w14:ligatures w14:val="standardContextual"/>
             </w:rPr>
           </w:pPr>
-          <w:hyperlink w:anchor="_Toc241000493" w:history="1">
+          <w:hyperlink w:anchor="_Toc241913515" w:history="1">
             <w:r>
               <w:rPr>
                 <w:rStyle w:val="Hyperlink"/>
@@ -1572,7 +1707,7 @@
               <w:rPr>
                 <w:noProof/>
               </w:rPr>
-              <w:instrText xml:space="preserve"> PAGEREF _Toc241000493 \h </w:instrText>
+              <w:instrText xml:space="preserve"> PAGEREF _Toc241913515 \h </w:instrText>
             </w:r>
             <w:r>
               <w:rPr>
@@ -1589,7 +1724,7 @@
               <w:rPr>
                 <w:noProof/>
               </w:rPr>
-              <w:t>14</w:t>
+              <w:t>17</w:t>
             </w:r>
             <w:r>
               <w:rPr>
@@ -1615,7 +1750,7 @@
               <w14:ligatures w14:val="standardContextual"/>
             </w:rPr>
           </w:pPr>
-          <w:hyperlink w:anchor="_Toc241000494" w:history="1">
+          <w:hyperlink w:anchor="_Toc241913516" w:history="1">
             <w:r>
               <w:rPr>
                 <w:rStyle w:val="Hyperlink"/>
@@ -1639,7 +1774,7 @@
               <w:rPr>
                 <w:noProof/>
               </w:rPr>
-              <w:instrText xml:space="preserve"> PAGEREF _Toc241000494 \h </w:instrText>
+              <w:instrText xml:space="preserve"> PAGEREF _Toc241913516 \h </w:instrText>
             </w:r>
             <w:r>
               <w:rPr>
@@ -1656,7 +1791,7 @@
               <w:rPr>
                 <w:noProof/>
               </w:rPr>
-              <w:t>14</w:t>
+              <w:t>17</w:t>
             </w:r>
             <w:r>
               <w:rPr>
@@ -1682,7 +1817,7 @@
               <w14:ligatures w14:val="standardContextual"/>
             </w:rPr>
           </w:pPr>
-          <w:hyperlink w:anchor="_Toc241000495" w:history="1">
+          <w:hyperlink w:anchor="_Toc241913517" w:history="1">
             <w:r>
               <w:rPr>
                 <w:rStyle w:val="Hyperlink"/>
@@ -1706,7 +1841,7 @@
               <w:rPr>
                 <w:noProof/>
               </w:rPr>
-              <w:instrText xml:space="preserve"> PAGEREF _Toc241000495 \h </w:instrText>
+              <w:instrText xml:space="preserve"> PAGEREF _Toc241913517 \h </w:instrText>
             </w:r>
             <w:r>
               <w:rPr>
@@ -1723,7 +1858,7 @@
               <w:rPr>
                 <w:noProof/>
               </w:rPr>
-              <w:t>16</w:t>
+              <w:t>19</w:t>
             </w:r>
             <w:r>
               <w:rPr>
@@ -1749,7 +1884,7 @@
               <w14:ligatures w14:val="standardContextual"/>
             </w:rPr>
           </w:pPr>
-          <w:hyperlink w:anchor="_Toc241000496" w:history="1">
+          <w:hyperlink w:anchor="_Toc241913518" w:history="1">
             <w:r>
               <w:rPr>
                 <w:rStyle w:val="Hyperlink"/>
@@ -1773,7 +1908,7 @@
               <w:rPr>
                 <w:noProof/>
               </w:rPr>
-              <w:instrText xml:space="preserve"> PAGEREF _Toc241000496 \h </w:instrText>
+              <w:instrText xml:space="preserve"> PAGEREF _Toc241913518 \h </w:instrText>
             </w:r>
             <w:r>
               <w:rPr>
@@ -1790,7 +1925,7 @@
               <w:rPr>
                 <w:noProof/>
               </w:rPr>
-              <w:t>16</w:t>
+              <w:t>19</w:t>
             </w:r>
             <w:r>
               <w:rPr>
@@ -1816,7 +1951,7 @@
               <w14:ligatures w14:val="standardContextual"/>
             </w:rPr>
           </w:pPr>
-          <w:hyperlink w:anchor="_Toc241000497" w:history="1">
+          <w:hyperlink w:anchor="_Toc241913519" w:history="1">
             <w:r>
               <w:rPr>
                 <w:rStyle w:val="Hyperlink"/>
@@ -1840,7 +1975,7 @@
               <w:rPr>
                 <w:noProof/>
               </w:rPr>
-              <w:instrText xml:space="preserve"> PAGEREF _Toc241000497 \h </w:instrText>
+              <w:instrText xml:space="preserve"> PAGEREF _Toc241913519 \h </w:instrText>
             </w:r>
             <w:r>
               <w:rPr>
@@ -1857,7 +1992,7 @@
               <w:rPr>
                 <w:noProof/>
               </w:rPr>
-              <w:t>16</w:t>
+              <w:t>19</w:t>
             </w:r>
             <w:r>
               <w:rPr>
@@ -1883,7 +2018,7 @@
               <w14:ligatures w14:val="standardContextual"/>
             </w:rPr>
           </w:pPr>
-          <w:hyperlink w:anchor="_Toc241000498" w:history="1">
+          <w:hyperlink w:anchor="_Toc241913520" w:history="1">
             <w:r>
               <w:rPr>
                 <w:rStyle w:val="Hyperlink"/>
@@ -1907,7 +2042,7 @@
               <w:rPr>
                 <w:noProof/>
               </w:rPr>
-              <w:instrText xml:space="preserve"> PAGEREF _Toc241000498 \h </w:instrText>
+              <w:instrText xml:space="preserve"> PAGEREF _Toc241913520 \h </w:instrText>
             </w:r>
             <w:r>
               <w:rPr>
@@ -1924,7 +2059,7 @@
               <w:rPr>
                 <w:noProof/>
               </w:rPr>
-              <w:t>16</w:t>
+              <w:t>19</w:t>
             </w:r>
             <w:r>
               <w:rPr>
@@ -1950,7 +2085,7 @@
               <w14:ligatures w14:val="standardContextual"/>
             </w:rPr>
           </w:pPr>
-          <w:hyperlink w:anchor="_Toc241000499" w:history="1">
+          <w:hyperlink w:anchor="_Toc241913521" w:history="1">
             <w:r>
               <w:rPr>
                 <w:rStyle w:val="Hyperlink"/>
@@ -1974,7 +2109,7 @@
               <w:rPr>
                 <w:noProof/>
               </w:rPr>
-              <w:instrText xml:space="preserve"> PAGEREF _Toc241000499 \h </w:instrText>
+              <w:instrText xml:space="preserve"> PAGEREF _Toc241913521 \h </w:instrText>
             </w:r>
             <w:r>
               <w:rPr>
@@ -1991,7 +2126,7 @@
               <w:rPr>
                 <w:noProof/>
               </w:rPr>
-              <w:t>17</w:t>
+              <w:t>20</w:t>
             </w:r>
             <w:r>
               <w:rPr>
@@ -2017,7 +2152,7 @@
               <w14:ligatures w14:val="standardContextual"/>
             </w:rPr>
           </w:pPr>
-          <w:hyperlink w:anchor="_Toc241000500" w:history="1">
+          <w:hyperlink w:anchor="_Toc241913522" w:history="1">
             <w:r>
               <w:rPr>
                 <w:rStyle w:val="Hyperlink"/>
@@ -2041,7 +2176,7 @@
               <w:rPr>
                 <w:noProof/>
               </w:rPr>
-              <w:instrText xml:space="preserve"> PAGEREF _Toc241000500 \h </w:instrText>
+              <w:instrText xml:space="preserve"> PAGEREF _Toc241913522 \h </w:instrText>
             </w:r>
             <w:r>
               <w:rPr>
@@ -2058,7 +2193,7 @@
               <w:rPr>
                 <w:noProof/>
               </w:rPr>
-              <w:t>17</w:t>
+              <w:t>20</w:t>
             </w:r>
             <w:r>
               <w:rPr>
@@ -2084,7 +2219,7 @@
               <w14:ligatures w14:val="standardContextual"/>
             </w:rPr>
           </w:pPr>
-          <w:hyperlink w:anchor="_Toc241000501" w:history="1">
+          <w:hyperlink w:anchor="_Toc241913523" w:history="1">
             <w:r>
               <w:rPr>
                 <w:rStyle w:val="Hyperlink"/>
@@ -2108,7 +2243,7 @@
               <w:rPr>
                 <w:noProof/>
               </w:rPr>
-              <w:instrText xml:space="preserve"> PAGEREF _Toc241000501 \h </w:instrText>
+              <w:instrText xml:space="preserve"> PAGEREF _Toc241913523 \h </w:instrText>
             </w:r>
             <w:r>
               <w:rPr>
@@ -2125,7 +2260,7 @@
               <w:rPr>
                 <w:noProof/>
               </w:rPr>
-              <w:t>17</w:t>
+              <w:t>20</w:t>
             </w:r>
             <w:r>
               <w:rPr>
@@ -2151,7 +2286,7 @@
               <w14:ligatures w14:val="standardContextual"/>
             </w:rPr>
           </w:pPr>
-          <w:hyperlink w:anchor="_Toc241000502" w:history="1">
+          <w:hyperlink w:anchor="_Toc241913524" w:history="1">
             <w:r>
               <w:rPr>
                 <w:rStyle w:val="Hyperlink"/>
@@ -2175,7 +2310,7 @@
               <w:rPr>
                 <w:noProof/>
               </w:rPr>
-              <w:instrText xml:space="preserve"> PAGEREF _Toc241000502 \h </w:instrText>
+              <w:instrText xml:space="preserve"> PAGEREF _Toc241913524 \h </w:instrText>
             </w:r>
             <w:r>
               <w:rPr>
@@ -2192,7 +2327,7 @@
               <w:rPr>
                 <w:noProof/>
               </w:rPr>
-              <w:t>17</w:t>
+              <w:t>20</w:t>
             </w:r>
             <w:r>
               <w:rPr>
@@ -2218,7 +2353,7 @@
               <w14:ligatures w14:val="standardContextual"/>
             </w:rPr>
           </w:pPr>
-          <w:hyperlink w:anchor="_Toc241000503" w:history="1">
+          <w:hyperlink w:anchor="_Toc241913525" w:history="1">
             <w:r>
               <w:rPr>
                 <w:rStyle w:val="Hyperlink"/>
@@ -2242,7 +2377,7 @@
               <w:rPr>
                 <w:noProof/>
               </w:rPr>
-              <w:instrText xml:space="preserve"> PAGEREF _Toc241000503 \h </w:instrText>
+              <w:instrText xml:space="preserve"> PAGEREF _Toc241913525 \h </w:instrText>
             </w:r>
             <w:r>
               <w:rPr>
@@ -2259,7 +2394,7 @@
               <w:rPr>
                 <w:noProof/>
               </w:rPr>
-              <w:t>18</w:t>
+              <w:t>21</w:t>
             </w:r>
             <w:r>
               <w:rPr>
@@ -2285,7 +2420,7 @@
               <w14:ligatures w14:val="standardContextual"/>
             </w:rPr>
           </w:pPr>
-          <w:hyperlink w:anchor="_Toc241000504" w:history="1">
+          <w:hyperlink w:anchor="_Toc241913526" w:history="1">
             <w:r>
               <w:rPr>
                 <w:rStyle w:val="Hyperlink"/>
@@ -2309,7 +2444,7 @@
               <w:rPr>
                 <w:noProof/>
               </w:rPr>
-              <w:instrText xml:space="preserve"> PAGEREF _Toc241000504 \h </w:instrText>
+              <w:instrText xml:space="preserve"> PAGEREF _Toc241913526 \h </w:instrText>
             </w:r>
             <w:r>
               <w:rPr>
@@ -2326,7 +2461,7 @@
               <w:rPr>
                 <w:noProof/>
               </w:rPr>
-              <w:t>19</w:t>
+              <w:t>22</w:t>
             </w:r>
             <w:r>
               <w:rPr>
@@ -2349,8 +2484,9 @@
         <w:keepNext/>
         <w:pageBreakBefore/>
       </w:pPr>
-      <w:bookmarkStart w:id="0" w:name="_Toc241000473"/>
-      <w:r>
+      <w:bookmarkStart w:id="0" w:name="_Toc241913493"/>
+      <w:r>
+        <w:lastRenderedPageBreak/>
         <w:t>1. Introduction</w:t>
       </w:r>
       <w:bookmarkEnd w:id="0"/>
@@ -2360,7 +2496,7 @@
         <w:pStyle w:val="Heading2"/>
         <w:keepNext/>
       </w:pPr>
-      <w:bookmarkStart w:id="1" w:name="_Toc241000474"/>
+      <w:bookmarkStart w:id="1" w:name="_Toc241913494"/>
       <w:r>
         <w:t>1.1 Why FareLens</w:t>
       </w:r>
@@ -2562,7 +2698,7 @@
         <w:pStyle w:val="Heading2"/>
         <w:keepNext/>
       </w:pPr>
-      <w:bookmarkStart w:id="2" w:name="_Toc241000475"/>
+      <w:bookmarkStart w:id="2" w:name="_Toc241913495"/>
       <w:r>
         <w:t>1.2 What you get</w:t>
       </w:r>
@@ -2825,7 +2961,7 @@
                 <w:sz w:val="19"/>
                 <w:szCs w:val="19"/>
               </w:rPr>
-              <w:t>Bring your own model</w:t>
+              <w:t>Amenities API</w:t>
             </w:r>
           </w:p>
         </w:tc>
@@ -2846,10 +2982,37 @@
             </w:pPr>
             <w:r>
               <w:rPr>
-                <w:sz w:val="19"/>
-                <w:szCs w:val="19"/>
-              </w:rPr>
-              <w:t>OpenAI · Azure AI (Azure OpenAI) · Anthropic Claude · Google Gemini · Groq · AWS Bedrock. Pick one in the UI, test it, switch any time.</w:t>
+                <w:rFonts w:ascii="Consolas" w:eastAsia="Consolas" w:hAnsi="Consolas" w:cs="Consolas"/>
+                <w:color w:val="442690"/>
+                <w:sz w:val="19"/>
+                <w:szCs w:val="19"/>
+                <w:shd w:val="clear" w:color="auto" w:fill="F6F4FF"/>
+              </w:rPr>
+              <w:t>POST /api/v1/amenities/summary</w:t>
+            </w:r>
+            <w:r>
+              <w:rPr>
+                <w:sz w:val="19"/>
+                <w:szCs w:val="19"/>
+              </w:rPr>
+              <w:t xml:space="preserve"> → raw fare-family benefit texts in; de-duplicated, classified, translated items out. </w:t>
+            </w:r>
+            <w:r>
+              <w:rPr>
+                <w:rFonts w:ascii="Consolas" w:eastAsia="Consolas" w:hAnsi="Consolas" w:cs="Consolas"/>
+                <w:color w:val="442690"/>
+                <w:sz w:val="19"/>
+                <w:szCs w:val="19"/>
+                <w:shd w:val="clear" w:color="auto" w:fill="F6F4FF"/>
+              </w:rPr>
+              <w:t>POST /api/v1/amenities/fare-names</w:t>
+            </w:r>
+            <w:r>
+              <w:rPr>
+                <w:sz w:val="19"/>
+                <w:szCs w:val="19"/>
+              </w:rPr>
+              <w:t xml:space="preserve"> → ECOLITE becomes "Economy Lite".</w:t>
             </w:r>
           </w:p>
         </w:tc>
@@ -2884,7 +3047,7 @@
                 <w:sz w:val="19"/>
                 <w:szCs w:val="19"/>
               </w:rPr>
-              <w:t>Multilingual</w:t>
+              <w:t>Bring your own model</w:t>
             </w:r>
           </w:p>
         </w:tc>
@@ -2908,7 +3071,7 @@
                 <w:sz w:val="19"/>
                 <w:szCs w:val="19"/>
               </w:rPr>
-              <w:t>Arabic, Urdu, French, German, Hindi, Chinese and more — the response language is a request parameter.</w:t>
+              <w:t>OpenAI · Azure AI (Azure OpenAI) · Anthropic Claude · Google Gemini · Groq · AWS Bedrock. Pick one in the UI, test it, switch any time.</w:t>
             </w:r>
           </w:p>
         </w:tc>
@@ -2943,7 +3106,7 @@
                 <w:sz w:val="19"/>
                 <w:szCs w:val="19"/>
               </w:rPr>
-              <w:t>Caching</w:t>
+              <w:t>Multilingual</w:t>
             </w:r>
           </w:p>
         </w:tc>
@@ -2967,7 +3130,7 @@
                 <w:sz w:val="19"/>
                 <w:szCs w:val="19"/>
               </w:rPr>
-              <w:t>Content-digest cache: Redis → Postgres → model. Identical rules never hit the LLM twice.</w:t>
+              <w:t>Arabic, Urdu, French, German, Hindi, Chinese and more — the response language is a request parameter.</w:t>
             </w:r>
           </w:p>
         </w:tc>
@@ -3002,7 +3165,7 @@
                 <w:sz w:val="19"/>
                 <w:szCs w:val="19"/>
               </w:rPr>
-              <w:t>Admin UI</w:t>
+              <w:t>Caching</w:t>
             </w:r>
           </w:p>
         </w:tc>
@@ -3026,7 +3189,7 @@
                 <w:sz w:val="19"/>
                 <w:szCs w:val="19"/>
               </w:rPr>
-              <w:t>Provider setup, API keys, usage dashboard, datastore management, playground, account.</w:t>
+              <w:t>Content-digest cache: Redis → Postgres → model. Identical rules never hit the LLM twice.</w:t>
             </w:r>
           </w:p>
         </w:tc>
@@ -3053,6 +3216,65 @@
             <w:vAlign w:val="center"/>
           </w:tcPr>
           <w:p>
+            <w:pPr>
+              <w:keepNext/>
+            </w:pPr>
+            <w:r>
+              <w:rPr>
+                <w:sz w:val="19"/>
+                <w:szCs w:val="19"/>
+              </w:rPr>
+              <w:t>Admin UI</w:t>
+            </w:r>
+          </w:p>
+        </w:tc>
+        <w:tc>
+          <w:tcPr>
+            <w:tcW w:w="7560" w:type="dxa"/>
+            <w:tcMar>
+              <w:top w:w="80" w:type="dxa"/>
+              <w:left w:w="110" w:type="dxa"/>
+              <w:bottom w:w="80" w:type="dxa"/>
+              <w:right w:w="110" w:type="dxa"/>
+            </w:tcMar>
+            <w:vAlign w:val="center"/>
+          </w:tcPr>
+          <w:p>
+            <w:pPr>
+              <w:keepNext/>
+            </w:pPr>
+            <w:r>
+              <w:rPr>
+                <w:sz w:val="19"/>
+                <w:szCs w:val="19"/>
+              </w:rPr>
+              <w:t>Provider setup, API keys, usage dashboard, datastore management, playground, account.</w:t>
+            </w:r>
+          </w:p>
+        </w:tc>
+      </w:tr>
+      <w:tr>
+        <w:tblPrEx>
+          <w:tblCellMar>
+            <w:top w:w="0" w:type="dxa"/>
+            <w:bottom w:w="0" w:type="dxa"/>
+          </w:tblCellMar>
+        </w:tblPrEx>
+        <w:trPr>
+          <w:cantSplit/>
+        </w:trPr>
+        <w:tc>
+          <w:tcPr>
+            <w:tcW w:w="2520" w:type="dxa"/>
+            <w:tcMar>
+              <w:top w:w="80" w:type="dxa"/>
+              <w:left w:w="110" w:type="dxa"/>
+              <w:bottom w:w="80" w:type="dxa"/>
+              <w:right w:w="110" w:type="dxa"/>
+            </w:tcMar>
+            <w:vAlign w:val="center"/>
+          </w:tcPr>
+          <w:p>
             <w:r>
               <w:rPr>
                 <w:sz w:val="19"/>
@@ -3105,8 +3327,9 @@
         <w:pStyle w:val="Heading2"/>
         <w:keepNext/>
       </w:pPr>
-      <w:bookmarkStart w:id="3" w:name="_Toc241000476"/>
-      <w:r>
+      <w:bookmarkStart w:id="3" w:name="_Toc241913496"/>
+      <w:r>
+        <w:lastRenderedPageBreak/>
         <w:t>1.3 The admin interface at a glance</w:t>
       </w:r>
       <w:bookmarkEnd w:id="3"/>
@@ -3122,10 +3345,10 @@
           <w:noProof/>
         </w:rPr>
         <w:drawing>
-          <wp:inline distT="0" distB="0" distL="0" distR="0" wp14:anchorId="070E70B1" wp14:editId="5005DFA9">
+          <wp:inline distT="0" distB="0" distL="0" distR="0" wp14:anchorId="3FE255E8" wp14:editId="69068A0F">
             <wp:extent cx="6400800" cy="4000500"/>
             <wp:effectExtent l="0" t="0" r="0" b="0"/>
-            <wp:docPr id="1982919607" name="Picture 1982919607"/>
+            <wp:docPr id="720778446" name="Picture 720778446"/>
             <wp:cNvGraphicFramePr>
               <a:graphicFrameLocks xmlns:a="http://schemas.openxmlformats.org/drawingml/2006/main" noChangeAspect="1"/>
             </wp:cNvGraphicFramePr>
@@ -3183,8 +3406,9 @@
         <w:keepNext/>
         <w:pageBreakBefore/>
       </w:pPr>
-      <w:bookmarkStart w:id="4" w:name="_Toc241000477"/>
-      <w:r>
+      <w:bookmarkStart w:id="4" w:name="_Toc241913497"/>
+      <w:r>
+        <w:lastRenderedPageBreak/>
         <w:t>2. Quick start</w:t>
       </w:r>
       <w:bookmarkEnd w:id="4"/>
@@ -3202,7 +3426,7 @@
         <w:pStyle w:val="Heading2"/>
         <w:keepNext/>
       </w:pPr>
-      <w:bookmarkStart w:id="5" w:name="_Toc241000478"/>
+      <w:bookmarkStart w:id="5" w:name="_Toc241913498"/>
       <w:r>
         <w:t>2.1 Run it</w:t>
       </w:r>
@@ -3307,7 +3531,7 @@
         <w:pStyle w:val="Heading2"/>
         <w:keepNext/>
       </w:pPr>
-      <w:bookmarkStart w:id="6" w:name="_Toc241000479"/>
+      <w:bookmarkStart w:id="6" w:name="_Toc241913499"/>
       <w:r>
         <w:t>2.2 Choose an LLM provider</w:t>
       </w:r>
@@ -3352,10 +3576,10 @@
           <w:noProof/>
         </w:rPr>
         <w:drawing>
-          <wp:inline distT="0" distB="0" distL="0" distR="0" wp14:anchorId="0C623A6D" wp14:editId="2F682DE2">
+          <wp:inline distT="0" distB="0" distL="0" distR="0" wp14:anchorId="3AEB470D" wp14:editId="6F11A33F">
             <wp:extent cx="6400800" cy="4000500"/>
             <wp:effectExtent l="0" t="0" r="0" b="0"/>
-            <wp:docPr id="1113995304" name="Picture 1113995304"/>
+            <wp:docPr id="125765721" name="Picture 125765721"/>
             <wp:cNvGraphicFramePr>
               <a:graphicFrameLocks xmlns:a="http://schemas.openxmlformats.org/drawingml/2006/main" noChangeAspect="1"/>
             </wp:cNvGraphicFramePr>
@@ -3412,7 +3636,7 @@
         <w:pStyle w:val="Heading2"/>
         <w:keepNext/>
       </w:pPr>
-      <w:bookmarkStart w:id="7" w:name="_Toc241000480"/>
+      <w:bookmarkStart w:id="7" w:name="_Toc241913500"/>
       <w:r>
         <w:t>2.3 Create an API key</w:t>
       </w:r>
@@ -3436,11 +3660,12 @@
         <w:rPr>
           <w:noProof/>
         </w:rPr>
+        <w:lastRenderedPageBreak/>
         <w:drawing>
-          <wp:inline distT="0" distB="0" distL="0" distR="0" wp14:anchorId="4AB4F91D" wp14:editId="1BC5A85A">
+          <wp:inline distT="0" distB="0" distL="0" distR="0" wp14:anchorId="12B0ACD0" wp14:editId="1EE26408">
             <wp:extent cx="6400800" cy="4000500"/>
             <wp:effectExtent l="0" t="0" r="0" b="0"/>
-            <wp:docPr id="1428262257" name="Picture 1428262257"/>
+            <wp:docPr id="1972657588" name="Picture 1972657588"/>
             <wp:cNvGraphicFramePr>
               <a:graphicFrameLocks xmlns:a="http://schemas.openxmlformats.org/drawingml/2006/main" noChangeAspect="1"/>
             </wp:cNvGraphicFramePr>
@@ -3497,7 +3722,7 @@
         <w:pStyle w:val="Heading2"/>
         <w:keepNext/>
       </w:pPr>
-      <w:bookmarkStart w:id="8" w:name="_Toc241000481"/>
+      <w:bookmarkStart w:id="8" w:name="_Toc241913501"/>
       <w:r>
         <w:t>2.4 Call the API</w:t>
       </w:r>
@@ -3591,7 +3816,7 @@
         <w:pStyle w:val="Heading2"/>
         <w:keepNext/>
       </w:pPr>
-      <w:bookmarkStart w:id="9" w:name="_Toc241000482"/>
+      <w:bookmarkStart w:id="9" w:name="_Toc241913502"/>
       <w:r>
         <w:t>2.5 Try it in the Playground</w:t>
       </w:r>
@@ -3615,11 +3840,12 @@
         <w:rPr>
           <w:noProof/>
         </w:rPr>
+        <w:lastRenderedPageBreak/>
         <w:drawing>
-          <wp:inline distT="0" distB="0" distL="0" distR="0" wp14:anchorId="08D83DDF" wp14:editId="6ACA37D3">
+          <wp:inline distT="0" distB="0" distL="0" distR="0" wp14:anchorId="6E2450C8" wp14:editId="023C0C9C">
             <wp:extent cx="6400800" cy="4000500"/>
             <wp:effectExtent l="0" t="0" r="0" b="0"/>
-            <wp:docPr id="1275995933" name="Picture 1275995933"/>
+            <wp:docPr id="995228162" name="Picture 995228162"/>
             <wp:cNvGraphicFramePr>
               <a:graphicFrameLocks xmlns:a="http://schemas.openxmlformats.org/drawingml/2006/main" noChangeAspect="1"/>
             </wp:cNvGraphicFramePr>
@@ -3682,10 +3908,10 @@
           <w:noProof/>
         </w:rPr>
         <w:drawing>
-          <wp:inline distT="0" distB="0" distL="0" distR="0" wp14:anchorId="6ACC931C" wp14:editId="453483F2">
+          <wp:inline distT="0" distB="0" distL="0" distR="0" wp14:anchorId="54BC6B34" wp14:editId="5B697C03">
             <wp:extent cx="6400800" cy="4000500"/>
             <wp:effectExtent l="0" t="0" r="0" b="0"/>
-            <wp:docPr id="1518840164" name="Picture 1518840164"/>
+            <wp:docPr id="1719000288" name="Picture 1719000288"/>
             <wp:cNvGraphicFramePr>
               <a:graphicFrameLocks xmlns:a="http://schemas.openxmlformats.org/drawingml/2006/main" noChangeAspect="1"/>
             </wp:cNvGraphicFramePr>
@@ -3742,8 +3968,9 @@
         <w:pStyle w:val="Heading2"/>
         <w:keepNext/>
       </w:pPr>
-      <w:bookmarkStart w:id="10" w:name="_Toc241000483"/>
-      <w:r>
+      <w:bookmarkStart w:id="10" w:name="_Toc241913503"/>
+      <w:r>
+        <w:lastRenderedPageBreak/>
         <w:t>2.6 Watch usage</w:t>
       </w:r>
       <w:bookmarkEnd w:id="10"/>
@@ -3767,10 +3994,10 @@
           <w:noProof/>
         </w:rPr>
         <w:drawing>
-          <wp:inline distT="0" distB="0" distL="0" distR="0" wp14:anchorId="0AB6AE9D" wp14:editId="1D556C64">
-            <wp:extent cx="6400800" cy="6143625"/>
+          <wp:inline distT="0" distB="0" distL="0" distR="0" wp14:anchorId="78C772ED" wp14:editId="1690E742">
+            <wp:extent cx="4648200" cy="7429500"/>
             <wp:effectExtent l="0" t="0" r="0" b="0"/>
-            <wp:docPr id="1307791038" name="Picture 1307791038"/>
+            <wp:docPr id="985089168" name="Picture 985089168"/>
             <wp:cNvGraphicFramePr>
               <a:graphicFrameLocks xmlns:a="http://schemas.openxmlformats.org/drawingml/2006/main" noChangeAspect="1"/>
             </wp:cNvGraphicFramePr>
@@ -3793,7 +4020,7 @@
                   <pic:spPr bwMode="auto">
                     <a:xfrm>
                       <a:off x="0" y="0"/>
-                      <a:ext cx="6400800" cy="6143625"/>
+                      <a:ext cx="4648200" cy="7429500"/>
                     </a:xfrm>
                     <a:prstGeom prst="rect">
                       <a:avLst/>
@@ -3828,8 +4055,9 @@
         <w:keepNext/>
         <w:pageBreakBefore/>
       </w:pPr>
-      <w:bookmarkStart w:id="11" w:name="_Toc241000484"/>
-      <w:r>
+      <w:bookmarkStart w:id="11" w:name="_Toc241913504"/>
+      <w:r>
+        <w:lastRenderedPageBreak/>
         <w:t>3. API reference</w:t>
       </w:r>
       <w:bookmarkEnd w:id="11"/>
@@ -3839,7 +4067,7 @@
         <w:pStyle w:val="Heading2"/>
         <w:keepNext/>
       </w:pPr>
-      <w:bookmarkStart w:id="12" w:name="_Toc241000485"/>
+      <w:bookmarkStart w:id="12" w:name="_Toc241913505"/>
       <w:r>
         <w:t>3.1 Authentication and errors</w:t>
       </w:r>
@@ -4547,7 +4775,7 @@
         <w:pStyle w:val="Heading2"/>
         <w:keepNext/>
       </w:pPr>
-      <w:bookmarkStart w:id="13" w:name="_Toc241000486"/>
+      <w:bookmarkStart w:id="13" w:name="_Toc241913506"/>
       <w:r>
         <w:t>3.2 POST /api/v1/fare-rules/summary</w:t>
       </w:r>
@@ -5182,8 +5410,9 @@
         <w:pStyle w:val="Heading2"/>
         <w:keepNext/>
       </w:pPr>
-      <w:bookmarkStart w:id="14" w:name="_Toc241000487"/>
-      <w:r>
+      <w:bookmarkStart w:id="14" w:name="_Toc241913507"/>
+      <w:r>
+        <w:lastRenderedPageBreak/>
         <w:t>3.3 POST /api/v1/fare-rules/chat/stream</w:t>
       </w:r>
       <w:bookmarkEnd w:id="14"/>
@@ -5537,7 +5766,7 @@
         <w:pStyle w:val="Heading2"/>
         <w:keepNext/>
       </w:pPr>
-      <w:bookmarkStart w:id="15" w:name="_Toc241000488"/>
+      <w:bookmarkStart w:id="15" w:name="_Toc241913508"/>
       <w:r>
         <w:t>3.4 Other endpoints</w:t>
       </w:r>
@@ -5885,9 +6114,9 @@
         <w:pStyle w:val="Heading2"/>
         <w:keepNext/>
       </w:pPr>
-      <w:bookmarkStart w:id="16" w:name="_Toc241000489"/>
-      <w:r>
-        <w:t>3.5 Interactive documentation (Swagger UI)</w:t>
+      <w:bookmarkStart w:id="16" w:name="_Toc241913509"/>
+      <w:r>
+        <w:t>3.5 POST /api/v1/amenities/summary</w:t>
       </w:r>
       <w:bookmarkEnd w:id="16"/>
     </w:p>
@@ -5896,8 +6125,574 @@
         <w:spacing w:after="120"/>
       </w:pPr>
       <w:r>
-        <w:t xml:space="preserve">The OpenAPI 3.1 specification is served at </w:t>
-      </w:r>
+        <w:t>The other half of the fare-family payload is the benefit list: baggage, seat, lounge, meal, miles and so on. Airlines send it as repetitive, unstandardised text. This endpoint returns a short, de-duplicated, classified list in the traveller's language. The body can be an object or a bare JSON array of strings.</w:t>
+      </w:r>
+    </w:p>
+    <w:tbl>
+      <w:tblPr>
+        <w:tblW w:w="10080" w:type="dxa"/>
+        <w:tblBorders>
+          <w:top w:val="single" w:sz="4" w:space="0" w:color="E8E3F5"/>
+          <w:left w:val="single" w:sz="4" w:space="0" w:color="E8E3F5"/>
+          <w:bottom w:val="single" w:sz="4" w:space="0" w:color="E8E3F5"/>
+          <w:right w:val="single" w:sz="4" w:space="0" w:color="E8E3F5"/>
+          <w:insideH w:val="single" w:sz="4" w:space="0" w:color="E8E3F5"/>
+          <w:insideV w:val="single" w:sz="4" w:space="0" w:color="E8E3F5"/>
+        </w:tblBorders>
+        <w:tblCellMar>
+          <w:left w:w="10" w:type="dxa"/>
+          <w:right w:w="10" w:type="dxa"/>
+        </w:tblCellMar>
+        <w:tblLook w:val="04A0" w:firstRow="1" w:lastRow="0" w:firstColumn="1" w:lastColumn="0" w:noHBand="0" w:noVBand="1"/>
+      </w:tblPr>
+      <w:tblGrid>
+        <w:gridCol w:w="2469"/>
+        <w:gridCol w:w="1440"/>
+        <w:gridCol w:w="6171"/>
+      </w:tblGrid>
+      <w:tr>
+        <w:tblPrEx>
+          <w:tblCellMar>
+            <w:top w:w="0" w:type="dxa"/>
+            <w:bottom w:w="0" w:type="dxa"/>
+          </w:tblCellMar>
+        </w:tblPrEx>
+        <w:trPr>
+          <w:cantSplit/>
+          <w:tblHeader/>
+        </w:trPr>
+        <w:tc>
+          <w:tcPr>
+            <w:tcW w:w="2469" w:type="dxa"/>
+            <w:shd w:val="clear" w:color="auto" w:fill="F6F4FF"/>
+            <w:tcMar>
+              <w:top w:w="80" w:type="dxa"/>
+              <w:left w:w="110" w:type="dxa"/>
+              <w:bottom w:w="80" w:type="dxa"/>
+              <w:right w:w="110" w:type="dxa"/>
+            </w:tcMar>
+            <w:vAlign w:val="center"/>
+          </w:tcPr>
+          <w:p>
+            <w:pPr>
+              <w:keepNext/>
+            </w:pPr>
+            <w:r>
+              <w:rPr>
+                <w:b/>
+                <w:bCs/>
+                <w:color w:val="442690"/>
+                <w:sz w:val="19"/>
+                <w:szCs w:val="19"/>
+              </w:rPr>
+              <w:lastRenderedPageBreak/>
+              <w:t>Field</w:t>
+            </w:r>
+          </w:p>
+        </w:tc>
+        <w:tc>
+          <w:tcPr>
+            <w:tcW w:w="1440" w:type="dxa"/>
+            <w:shd w:val="clear" w:color="auto" w:fill="F6F4FF"/>
+            <w:tcMar>
+              <w:top w:w="80" w:type="dxa"/>
+              <w:left w:w="110" w:type="dxa"/>
+              <w:bottom w:w="80" w:type="dxa"/>
+              <w:right w:w="110" w:type="dxa"/>
+            </w:tcMar>
+            <w:vAlign w:val="center"/>
+          </w:tcPr>
+          <w:p>
+            <w:pPr>
+              <w:keepNext/>
+            </w:pPr>
+            <w:r>
+              <w:rPr>
+                <w:b/>
+                <w:bCs/>
+                <w:color w:val="442690"/>
+                <w:sz w:val="19"/>
+                <w:szCs w:val="19"/>
+              </w:rPr>
+              <w:t>Type</w:t>
+            </w:r>
+          </w:p>
+        </w:tc>
+        <w:tc>
+          <w:tcPr>
+            <w:tcW w:w="6171" w:type="dxa"/>
+            <w:shd w:val="clear" w:color="auto" w:fill="F6F4FF"/>
+            <w:tcMar>
+              <w:top w:w="80" w:type="dxa"/>
+              <w:left w:w="110" w:type="dxa"/>
+              <w:bottom w:w="80" w:type="dxa"/>
+              <w:right w:w="110" w:type="dxa"/>
+            </w:tcMar>
+            <w:vAlign w:val="center"/>
+          </w:tcPr>
+          <w:p>
+            <w:pPr>
+              <w:keepNext/>
+            </w:pPr>
+            <w:r>
+              <w:rPr>
+                <w:b/>
+                <w:bCs/>
+                <w:color w:val="442690"/>
+                <w:sz w:val="19"/>
+                <w:szCs w:val="19"/>
+              </w:rPr>
+              <w:t>Notes</w:t>
+            </w:r>
+          </w:p>
+        </w:tc>
+      </w:tr>
+      <w:tr>
+        <w:tblPrEx>
+          <w:tblCellMar>
+            <w:top w:w="0" w:type="dxa"/>
+            <w:bottom w:w="0" w:type="dxa"/>
+          </w:tblCellMar>
+        </w:tblPrEx>
+        <w:trPr>
+          <w:cantSplit/>
+        </w:trPr>
+        <w:tc>
+          <w:tcPr>
+            <w:tcW w:w="2469" w:type="dxa"/>
+            <w:tcMar>
+              <w:top w:w="80" w:type="dxa"/>
+              <w:left w:w="110" w:type="dxa"/>
+              <w:bottom w:w="80" w:type="dxa"/>
+              <w:right w:w="110" w:type="dxa"/>
+            </w:tcMar>
+            <w:vAlign w:val="center"/>
+          </w:tcPr>
+          <w:p>
+            <w:pPr>
+              <w:keepNext/>
+            </w:pPr>
+            <w:r>
+              <w:rPr>
+                <w:rFonts w:ascii="Consolas" w:eastAsia="Consolas" w:hAnsi="Consolas" w:cs="Consolas"/>
+                <w:color w:val="442690"/>
+                <w:sz w:val="19"/>
+                <w:szCs w:val="19"/>
+                <w:shd w:val="clear" w:color="auto" w:fill="F6F4FF"/>
+              </w:rPr>
+              <w:t>amenities</w:t>
+            </w:r>
+          </w:p>
+        </w:tc>
+        <w:tc>
+          <w:tcPr>
+            <w:tcW w:w="1440" w:type="dxa"/>
+            <w:tcMar>
+              <w:top w:w="80" w:type="dxa"/>
+              <w:left w:w="110" w:type="dxa"/>
+              <w:bottom w:w="80" w:type="dxa"/>
+              <w:right w:w="110" w:type="dxa"/>
+            </w:tcMar>
+            <w:vAlign w:val="center"/>
+          </w:tcPr>
+          <w:p>
+            <w:pPr>
+              <w:keepNext/>
+            </w:pPr>
+            <w:r>
+              <w:rPr>
+                <w:sz w:val="19"/>
+                <w:szCs w:val="19"/>
+              </w:rPr>
+              <w:t>string[]</w:t>
+            </w:r>
+          </w:p>
+        </w:tc>
+        <w:tc>
+          <w:tcPr>
+            <w:tcW w:w="6171" w:type="dxa"/>
+            <w:tcMar>
+              <w:top w:w="80" w:type="dxa"/>
+              <w:left w:w="110" w:type="dxa"/>
+              <w:bottom w:w="80" w:type="dxa"/>
+              <w:right w:w="110" w:type="dxa"/>
+            </w:tcMar>
+            <w:vAlign w:val="center"/>
+          </w:tcPr>
+          <w:p>
+            <w:pPr>
+              <w:keepNext/>
+            </w:pPr>
+            <w:r>
+              <w:rPr>
+                <w:sz w:val="19"/>
+                <w:szCs w:val="19"/>
+              </w:rPr>
+              <w:t>Raw benefit texts, one per line item (max 200).</w:t>
+            </w:r>
+          </w:p>
+        </w:tc>
+      </w:tr>
+      <w:tr>
+        <w:tblPrEx>
+          <w:tblCellMar>
+            <w:top w:w="0" w:type="dxa"/>
+            <w:bottom w:w="0" w:type="dxa"/>
+          </w:tblCellMar>
+        </w:tblPrEx>
+        <w:trPr>
+          <w:cantSplit/>
+        </w:trPr>
+        <w:tc>
+          <w:tcPr>
+            <w:tcW w:w="2469" w:type="dxa"/>
+            <w:tcMar>
+              <w:top w:w="80" w:type="dxa"/>
+              <w:left w:w="110" w:type="dxa"/>
+              <w:bottom w:w="80" w:type="dxa"/>
+              <w:right w:w="110" w:type="dxa"/>
+            </w:tcMar>
+            <w:vAlign w:val="center"/>
+          </w:tcPr>
+          <w:p>
+            <w:pPr>
+              <w:keepNext/>
+            </w:pPr>
+            <w:r>
+              <w:rPr>
+                <w:rFonts w:ascii="Consolas" w:eastAsia="Consolas" w:hAnsi="Consolas" w:cs="Consolas"/>
+                <w:color w:val="442690"/>
+                <w:sz w:val="19"/>
+                <w:szCs w:val="19"/>
+                <w:shd w:val="clear" w:color="auto" w:fill="F6F4FF"/>
+              </w:rPr>
+              <w:t>lang</w:t>
+            </w:r>
+          </w:p>
+        </w:tc>
+        <w:tc>
+          <w:tcPr>
+            <w:tcW w:w="1440" w:type="dxa"/>
+            <w:tcMar>
+              <w:top w:w="80" w:type="dxa"/>
+              <w:left w:w="110" w:type="dxa"/>
+              <w:bottom w:w="80" w:type="dxa"/>
+              <w:right w:w="110" w:type="dxa"/>
+            </w:tcMar>
+            <w:vAlign w:val="center"/>
+          </w:tcPr>
+          <w:p>
+            <w:pPr>
+              <w:keepNext/>
+            </w:pPr>
+            <w:r>
+              <w:rPr>
+                <w:sz w:val="19"/>
+                <w:szCs w:val="19"/>
+              </w:rPr>
+              <w:t>string</w:t>
+            </w:r>
+          </w:p>
+        </w:tc>
+        <w:tc>
+          <w:tcPr>
+            <w:tcW w:w="6171" w:type="dxa"/>
+            <w:tcMar>
+              <w:top w:w="80" w:type="dxa"/>
+              <w:left w:w="110" w:type="dxa"/>
+              <w:bottom w:w="80" w:type="dxa"/>
+              <w:right w:w="110" w:type="dxa"/>
+            </w:tcMar>
+            <w:vAlign w:val="center"/>
+          </w:tcPr>
+          <w:p>
+            <w:pPr>
+              <w:keepNext/>
+            </w:pPr>
+            <w:r>
+              <w:rPr>
+                <w:sz w:val="19"/>
+                <w:szCs w:val="19"/>
+              </w:rPr>
+              <w:t xml:space="preserve">Output language code, default </w:t>
+            </w:r>
+            <w:r>
+              <w:rPr>
+                <w:rFonts w:ascii="Consolas" w:eastAsia="Consolas" w:hAnsi="Consolas" w:cs="Consolas"/>
+                <w:color w:val="442690"/>
+                <w:sz w:val="19"/>
+                <w:szCs w:val="19"/>
+                <w:shd w:val="clear" w:color="auto" w:fill="F6F4FF"/>
+              </w:rPr>
+              <w:t>en</w:t>
+            </w:r>
+            <w:r>
+              <w:rPr>
+                <w:sz w:val="19"/>
+                <w:szCs w:val="19"/>
+              </w:rPr>
+              <w:t>.</w:t>
+            </w:r>
+          </w:p>
+        </w:tc>
+      </w:tr>
+      <w:tr>
+        <w:tblPrEx>
+          <w:tblCellMar>
+            <w:top w:w="0" w:type="dxa"/>
+            <w:bottom w:w="0" w:type="dxa"/>
+          </w:tblCellMar>
+        </w:tblPrEx>
+        <w:trPr>
+          <w:cantSplit/>
+        </w:trPr>
+        <w:tc>
+          <w:tcPr>
+            <w:tcW w:w="2469" w:type="dxa"/>
+            <w:tcMar>
+              <w:top w:w="80" w:type="dxa"/>
+              <w:left w:w="110" w:type="dxa"/>
+              <w:bottom w:w="80" w:type="dxa"/>
+              <w:right w:w="110" w:type="dxa"/>
+            </w:tcMar>
+            <w:vAlign w:val="center"/>
+          </w:tcPr>
+          <w:p>
+            <w:r>
+              <w:rPr>
+                <w:rFonts w:ascii="Consolas" w:eastAsia="Consolas" w:hAnsi="Consolas" w:cs="Consolas"/>
+                <w:color w:val="442690"/>
+                <w:sz w:val="19"/>
+                <w:szCs w:val="19"/>
+                <w:shd w:val="clear" w:color="auto" w:fill="F6F4FF"/>
+              </w:rPr>
+              <w:t>summarize</w:t>
+            </w:r>
+          </w:p>
+        </w:tc>
+        <w:tc>
+          <w:tcPr>
+            <w:tcW w:w="1440" w:type="dxa"/>
+            <w:tcMar>
+              <w:top w:w="80" w:type="dxa"/>
+              <w:left w:w="110" w:type="dxa"/>
+              <w:bottom w:w="80" w:type="dxa"/>
+              <w:right w:w="110" w:type="dxa"/>
+            </w:tcMar>
+            <w:vAlign w:val="center"/>
+          </w:tcPr>
+          <w:p>
+            <w:r>
+              <w:rPr>
+                <w:sz w:val="19"/>
+                <w:szCs w:val="19"/>
+              </w:rPr>
+              <w:t>bool</w:t>
+            </w:r>
+          </w:p>
+        </w:tc>
+        <w:tc>
+          <w:tcPr>
+            <w:tcW w:w="6171" w:type="dxa"/>
+            <w:tcMar>
+              <w:top w:w="80" w:type="dxa"/>
+              <w:left w:w="110" w:type="dxa"/>
+              <w:bottom w:w="80" w:type="dxa"/>
+              <w:right w:w="110" w:type="dxa"/>
+            </w:tcMar>
+            <w:vAlign w:val="center"/>
+          </w:tcPr>
+          <w:p>
+            <w:r>
+              <w:rPr>
+                <w:rFonts w:ascii="Consolas" w:eastAsia="Consolas" w:hAnsi="Consolas" w:cs="Consolas"/>
+                <w:color w:val="442690"/>
+                <w:sz w:val="19"/>
+                <w:szCs w:val="19"/>
+                <w:shd w:val="clear" w:color="auto" w:fill="F6F4FF"/>
+              </w:rPr>
+              <w:t>true</w:t>
+            </w:r>
+            <w:r>
+              <w:rPr>
+                <w:sz w:val="19"/>
+                <w:szCs w:val="19"/>
+              </w:rPr>
+              <w:t xml:space="preserve"> (default): merge duplicates, classify, shorten. </w:t>
+            </w:r>
+            <w:r>
+              <w:rPr>
+                <w:rFonts w:ascii="Consolas" w:eastAsia="Consolas" w:hAnsi="Consolas" w:cs="Consolas"/>
+                <w:color w:val="442690"/>
+                <w:sz w:val="19"/>
+                <w:szCs w:val="19"/>
+                <w:shd w:val="clear" w:color="auto" w:fill="F6F4FF"/>
+              </w:rPr>
+              <w:t>false</w:t>
+            </w:r>
+            <w:r>
+              <w:rPr>
+                <w:sz w:val="19"/>
+                <w:szCs w:val="19"/>
+              </w:rPr>
+              <w:t>: literal translation, one output per input.</w:t>
+            </w:r>
+          </w:p>
+        </w:tc>
+      </w:tr>
+    </w:tbl>
+    <w:p>
+      <w:pPr>
+        <w:spacing w:after="160"/>
+      </w:pPr>
+    </w:p>
+    <w:p>
+      <w:pPr>
+        <w:shd w:val="clear" w:color="auto" w:fill="F3F0FB"/>
+        <w:spacing w:line="276" w:lineRule="auto"/>
+        <w:ind w:left="200" w:right="200"/>
+      </w:pPr>
+      <w:r>
+        <w:rPr>
+          <w:rFonts w:ascii="Consolas" w:eastAsia="Consolas" w:hAnsi="Consolas" w:cs="Consolas"/>
+          <w:sz w:val="18"/>
+          <w:szCs w:val="18"/>
+        </w:rPr>
+        <w:t>{</w:t>
+      </w:r>
+    </w:p>
+    <w:p>
+      <w:pPr>
+        <w:shd w:val="clear" w:color="auto" w:fill="F3F0FB"/>
+        <w:spacing w:line="276" w:lineRule="auto"/>
+        <w:ind w:left="200" w:right="200"/>
+      </w:pPr>
+      <w:r>
+        <w:rPr>
+          <w:rFonts w:ascii="Consolas" w:eastAsia="Consolas" w:hAnsi="Consolas" w:cs="Consolas"/>
+          <w:sz w:val="18"/>
+          <w:szCs w:val="18"/>
+        </w:rPr>
+        <w:t xml:space="preserve">  "amenities": [</w:t>
+      </w:r>
+    </w:p>
+    <w:p>
+      <w:pPr>
+        <w:shd w:val="clear" w:color="auto" w:fill="F3F0FB"/>
+        <w:spacing w:line="276" w:lineRule="auto"/>
+        <w:ind w:left="200" w:right="200"/>
+      </w:pPr>
+      <w:r>
+        <w:rPr>
+          <w:rFonts w:ascii="Consolas" w:eastAsia="Consolas" w:hAnsi="Consolas" w:cs="Consolas"/>
+          <w:sz w:val="18"/>
+          <w:szCs w:val="18"/>
+        </w:rPr>
+        <w:t xml:space="preserve">    {"type": "CabinBaggage", "description": "1 cabin bag up to 7 kg", "details": "max 56x45x25 cm", "included": true, "is_chargeable": false, "ref_url": ""},</w:t>
+      </w:r>
+    </w:p>
+    <w:p>
+      <w:pPr>
+        <w:shd w:val="clear" w:color="auto" w:fill="F3F0FB"/>
+        <w:spacing w:line="276" w:lineRule="auto"/>
+        <w:ind w:left="200" w:right="200"/>
+      </w:pPr>
+      <w:r>
+        <w:rPr>
+          <w:rFonts w:ascii="Consolas" w:eastAsia="Consolas" w:hAnsi="Consolas" w:cs="Consolas"/>
+          <w:sz w:val="18"/>
+          <w:szCs w:val="18"/>
+        </w:rPr>
+        <w:t xml:space="preserve">    {"type": "Lounge", "description": "Lounge access not included", "details": "", "included": false, "is_chargeable": false, "ref_url": ""},</w:t>
+      </w:r>
+    </w:p>
+    <w:p>
+      <w:pPr>
+        <w:shd w:val="clear" w:color="auto" w:fill="F3F0FB"/>
+        <w:spacing w:line="276" w:lineRule="auto"/>
+        <w:ind w:left="200" w:right="200"/>
+      </w:pPr>
+      <w:r>
+        <w:rPr>
+          <w:rFonts w:ascii="Consolas" w:eastAsia="Consolas" w:hAnsi="Consolas" w:cs="Consolas"/>
+          <w:sz w:val="18"/>
+          <w:szCs w:val="18"/>
+        </w:rPr>
+        <w:t xml:space="preserve">    {"type": "Seat", "description": "Seat selection for a fee", "details": "", "included": false, "is_chargeable": true, "ref_url": "https://airline.example/seats"}</w:t>
+      </w:r>
+    </w:p>
+    <w:p>
+      <w:pPr>
+        <w:shd w:val="clear" w:color="auto" w:fill="F3F0FB"/>
+        <w:spacing w:line="276" w:lineRule="auto"/>
+        <w:ind w:left="200" w:right="200"/>
+      </w:pPr>
+      <w:r>
+        <w:rPr>
+          <w:rFonts w:ascii="Consolas" w:eastAsia="Consolas" w:hAnsi="Consolas" w:cs="Consolas"/>
+          <w:sz w:val="18"/>
+          <w:szCs w:val="18"/>
+        </w:rPr>
+        <w:t xml:space="preserve">  ],</w:t>
+      </w:r>
+    </w:p>
+    <w:p>
+      <w:pPr>
+        <w:shd w:val="clear" w:color="auto" w:fill="F3F0FB"/>
+        <w:spacing w:line="276" w:lineRule="auto"/>
+        <w:ind w:left="200" w:right="200"/>
+      </w:pPr>
+      <w:r>
+        <w:rPr>
+          <w:rFonts w:ascii="Consolas" w:eastAsia="Consolas" w:hAnsi="Consolas" w:cs="Consolas"/>
+          <w:sz w:val="18"/>
+          <w:szCs w:val="18"/>
+        </w:rPr>
+        <w:t xml:space="preserve">  "cache": "mixed", "lang": "en", "summarize": true, "provider": "groq", "model": "openai/gpt-oss-120b", "latency_ms": 1420</w:t>
+      </w:r>
+    </w:p>
+    <w:p>
+      <w:pPr>
+        <w:shd w:val="clear" w:color="auto" w:fill="F3F0FB"/>
+        <w:spacing w:line="276" w:lineRule="auto"/>
+        <w:ind w:left="200" w:right="200"/>
+      </w:pPr>
+      <w:r>
+        <w:rPr>
+          <w:rFonts w:ascii="Consolas" w:eastAsia="Consolas" w:hAnsi="Consolas" w:cs="Consolas"/>
+          <w:sz w:val="18"/>
+          <w:szCs w:val="18"/>
+        </w:rPr>
+        <w:t>}</w:t>
+      </w:r>
+    </w:p>
+    <w:p>
+      <w:pPr>
+        <w:spacing w:after="120"/>
+      </w:pPr>
+    </w:p>
+    <w:p>
+      <w:pPr>
+        <w:pStyle w:val="ListParagraph"/>
+        <w:numPr>
+          <w:ilvl w:val="0"/>
+          <w:numId w:val="2"/>
+        </w:numPr>
+        <w:spacing w:after="60"/>
+      </w:pPr>
+      <w:r>
+        <w:t>Types: Baggage, CabinBaggage, Seat, Meal, Lounge, Priority, Wifi, Entertainment, Miles, Upgrade, Refund, Change, GroundServices, Insurance, Warning, Other.</w:t>
+      </w:r>
+    </w:p>
+    <w:p>
+      <w:pPr>
+        <w:pStyle w:val="ListParagraph"/>
+        <w:numPr>
+          <w:ilvl w:val="0"/>
+          <w:numId w:val="2"/>
+        </w:numPr>
+        <w:spacing w:after="60"/>
+      </w:pPr>
       <w:r>
         <w:rPr>
           <w:rFonts w:ascii="Consolas" w:eastAsia="Consolas" w:hAnsi="Consolas" w:cs="Consolas"/>
@@ -5906,10 +6701,10 @@
           <w:szCs w:val="20"/>
           <w:shd w:val="clear" w:color="auto" w:fill="F6F4FF"/>
         </w:rPr>
-        <w:t>/openapi.json</w:t>
-      </w:r>
-      <w:r>
-        <w:t xml:space="preserve"> and rendered at </w:t>
+        <w:t>included</w:t>
+      </w:r>
+      <w:r>
+        <w:t xml:space="preserve"> says whether the benefit is provided (true), explicitly not included (false) or unclear (null); </w:t>
       </w:r>
       <w:r>
         <w:rPr>
@@ -5919,10 +6714,10 @@
           <w:szCs w:val="20"/>
           <w:shd w:val="clear" w:color="auto" w:fill="F6F4FF"/>
         </w:rPr>
-        <w:t>/docs</w:t>
-      </w:r>
-      <w:r>
-        <w:t xml:space="preserve"> (Swagger UI) and </w:t>
+        <w:t>is_chargeable</w:t>
+      </w:r>
+      <w:r>
+        <w:t xml:space="preserve"> flags paid add-ons; URLs are moved to </w:t>
       </w:r>
       <w:r>
         <w:rPr>
@@ -5932,10 +6727,36 @@
           <w:szCs w:val="20"/>
           <w:shd w:val="clear" w:color="auto" w:fill="F6F4FF"/>
         </w:rPr>
-        <w:t>/redoc</w:t>
-      </w:r>
-      <w:r>
-        <w:t>. Every request and response schema can be inspected and tried live.</w:t>
+        <w:t>ref_url</w:t>
+      </w:r>
+      <w:r>
+        <w:t>.</w:t>
+      </w:r>
+    </w:p>
+    <w:p>
+      <w:pPr>
+        <w:pStyle w:val="ListParagraph"/>
+        <w:numPr>
+          <w:ilvl w:val="0"/>
+          <w:numId w:val="2"/>
+        </w:numPr>
+        <w:spacing w:after="60"/>
+      </w:pPr>
+      <w:r>
+        <w:t>Caching is per item and language: a batch of 20 where 18 were seen before sends only 2 texts to the model (</w:t>
+      </w:r>
+      <w:r>
+        <w:rPr>
+          <w:rFonts w:ascii="Consolas" w:eastAsia="Consolas" w:hAnsi="Consolas" w:cs="Consolas"/>
+          <w:color w:val="442690"/>
+          <w:sz w:val="20"/>
+          <w:szCs w:val="20"/>
+          <w:shd w:val="clear" w:color="auto" w:fill="F6F4FF"/>
+        </w:rPr>
+        <w:t>cache</w:t>
+      </w:r>
+      <w:r>
+        <w:t>: redis-hit, postgres-hit, generated or mixed).</w:t>
       </w:r>
     </w:p>
     <w:p>
@@ -5948,11 +6769,12 @@
         <w:rPr>
           <w:noProof/>
         </w:rPr>
+        <w:lastRenderedPageBreak/>
         <w:drawing>
-          <wp:inline distT="0" distB="0" distL="0" distR="0" wp14:anchorId="712C0A5F" wp14:editId="4196DABE">
-            <wp:extent cx="6400800" cy="5553075"/>
+          <wp:inline distT="0" distB="0" distL="0" distR="0" wp14:anchorId="50049DE0" wp14:editId="5C297E7A">
+            <wp:extent cx="6400800" cy="4000500"/>
             <wp:effectExtent l="0" t="0" r="0" b="0"/>
-            <wp:docPr id="647628897" name="Picture 647628897"/>
+            <wp:docPr id="243919041" name="Picture 243919041"/>
             <wp:cNvGraphicFramePr>
               <a:graphicFrameLocks xmlns:a="http://schemas.openxmlformats.org/drawingml/2006/main" noChangeAspect="1"/>
             </wp:cNvGraphicFramePr>
@@ -5975,7 +6797,7 @@
                   <pic:spPr bwMode="auto">
                     <a:xfrm>
                       <a:off x="0" y="0"/>
-                      <a:ext cx="6400800" cy="5553075"/>
+                      <a:ext cx="6400800" cy="4000500"/>
                     </a:xfrm>
                     <a:prstGeom prst="rect">
                       <a:avLst/>
@@ -6001,8 +6823,62 @@
           <w:sz w:val="18"/>
           <w:szCs w:val="18"/>
         </w:rPr>
-        <w:t>Figure 7 – Swagger UI at /docs</w:t>
-      </w:r>
+        <w:t>Figure 7 – Playground: amenities de-duplicated and classified</w:t>
+      </w:r>
+    </w:p>
+    <w:p>
+      <w:pPr>
+        <w:pStyle w:val="Heading2"/>
+        <w:keepNext/>
+      </w:pPr>
+      <w:bookmarkStart w:id="17" w:name="_Toc241913510"/>
+      <w:r>
+        <w:t>3.6 POST /api/v1/amenities/fare-names</w:t>
+      </w:r>
+      <w:bookmarkEnd w:id="17"/>
+    </w:p>
+    <w:p>
+      <w:pPr>
+        <w:spacing w:after="120"/>
+      </w:pPr>
+      <w:r>
+        <w:t>Converts technical fare-family codes into short, friendly labels in the requested language. Results are cached per code and language.</w:t>
+      </w:r>
+    </w:p>
+    <w:p>
+      <w:pPr>
+        <w:shd w:val="clear" w:color="auto" w:fill="F3F0FB"/>
+        <w:spacing w:line="276" w:lineRule="auto"/>
+        <w:ind w:left="200" w:right="200"/>
+      </w:pPr>
+      <w:r>
+        <w:rPr>
+          <w:rFonts w:ascii="Consolas" w:eastAsia="Consolas" w:hAnsi="Consolas" w:cs="Consolas"/>
+          <w:sz w:val="18"/>
+          <w:szCs w:val="18"/>
+        </w:rPr>
+        <w:t>{"names": ["ECOLITE", "BUSIFLEX", "PREMSAVR"], "lang": "en"}</w:t>
+      </w:r>
+    </w:p>
+    <w:p>
+      <w:pPr>
+        <w:shd w:val="clear" w:color="auto" w:fill="F3F0FB"/>
+        <w:spacing w:line="276" w:lineRule="auto"/>
+        <w:ind w:left="200" w:right="200"/>
+      </w:pPr>
+      <w:r>
+        <w:rPr>
+          <w:rFonts w:ascii="Consolas" w:eastAsia="Consolas" w:hAnsi="Consolas" w:cs="Consolas"/>
+          <w:sz w:val="18"/>
+          <w:szCs w:val="18"/>
+        </w:rPr>
+        <w:t>→ {"names": {"ECOLITE": "Economy Lite", "BUSIFLEX": "Business Flex", "PREMSAVR": "Premium Economy Saver"}, "cache": "generated", ...}</w:t>
+      </w:r>
+    </w:p>
+    <w:p>
+      <w:pPr>
+        <w:spacing w:after="120"/>
+      </w:pPr>
     </w:p>
     <w:p>
       <w:pPr>
@@ -6014,11 +6890,12 @@
         <w:rPr>
           <w:noProof/>
         </w:rPr>
+        <w:lastRenderedPageBreak/>
         <w:drawing>
-          <wp:inline distT="0" distB="0" distL="0" distR="0" wp14:anchorId="53528B28" wp14:editId="20B15919">
-            <wp:extent cx="4505325" cy="7429500"/>
+          <wp:inline distT="0" distB="0" distL="0" distR="0" wp14:anchorId="3EE601EF" wp14:editId="18E51215">
+            <wp:extent cx="6400800" cy="4000500"/>
             <wp:effectExtent l="0" t="0" r="0" b="0"/>
-            <wp:docPr id="1204415141" name="Picture 1204415141"/>
+            <wp:docPr id="1360336797" name="Picture 1360336797"/>
             <wp:cNvGraphicFramePr>
               <a:graphicFrameLocks xmlns:a="http://schemas.openxmlformats.org/drawingml/2006/main" noChangeAspect="1"/>
             </wp:cNvGraphicFramePr>
@@ -6041,7 +6918,7 @@
                   <pic:spPr bwMode="auto">
                     <a:xfrm>
                       <a:off x="0" y="0"/>
-                      <a:ext cx="4505325" cy="7429500"/>
+                      <a:ext cx="6400800" cy="4000500"/>
                     </a:xfrm>
                     <a:prstGeom prst="rect">
                       <a:avLst/>
@@ -6067,27 +6944,26 @@
           <w:sz w:val="18"/>
           <w:szCs w:val="18"/>
         </w:rPr>
-        <w:t>Figure 8 – Summary endpoint expanded: request schema and responses</w:t>
-      </w:r>
-    </w:p>
-    <w:p>
-      <w:pPr>
-        <w:pStyle w:val="Heading1"/>
+        <w:t>Figure 8 – Playground: fare-family codes to friendly labels</w:t>
+      </w:r>
+    </w:p>
+    <w:p>
+      <w:pPr>
+        <w:pStyle w:val="Heading2"/>
         <w:keepNext/>
-        <w:pageBreakBefore/>
-      </w:pPr>
-      <w:bookmarkStart w:id="17" w:name="_Toc241000490"/>
-      <w:r>
-        <w:t>4. Configuration</w:t>
-      </w:r>
-      <w:bookmarkEnd w:id="17"/>
+      </w:pPr>
+      <w:bookmarkStart w:id="18" w:name="_Toc241913511"/>
+      <w:r>
+        <w:t>3.7 Interactive documentation (Swagger UI)</w:t>
+      </w:r>
+      <w:bookmarkEnd w:id="18"/>
     </w:p>
     <w:p>
       <w:pPr>
         <w:spacing w:after="120"/>
       </w:pPr>
       <w:r>
-        <w:t xml:space="preserve">FareLens works with zero configuration. Copy </w:t>
+        <w:t xml:space="preserve">The OpenAPI 3.1 specification is served at </w:t>
       </w:r>
       <w:r>
         <w:rPr>
@@ -6097,10 +6973,10 @@
           <w:szCs w:val="20"/>
           <w:shd w:val="clear" w:color="auto" w:fill="F6F4FF"/>
         </w:rPr>
-        <w:t>.env.example</w:t>
-      </w:r>
-      <w:r>
-        <w:t xml:space="preserve"> to </w:t>
+        <w:t>/openapi.json</w:t>
+      </w:r>
+      <w:r>
+        <w:t xml:space="preserve"> and rendered at </w:t>
       </w:r>
       <w:r>
         <w:rPr>
@@ -6110,6 +6986,200 @@
           <w:szCs w:val="20"/>
           <w:shd w:val="clear" w:color="auto" w:fill="F6F4FF"/>
         </w:rPr>
+        <w:t>/docs</w:t>
+      </w:r>
+      <w:r>
+        <w:t xml:space="preserve"> (Swagger UI) and </w:t>
+      </w:r>
+      <w:r>
+        <w:rPr>
+          <w:rFonts w:ascii="Consolas" w:eastAsia="Consolas" w:hAnsi="Consolas" w:cs="Consolas"/>
+          <w:color w:val="442690"/>
+          <w:sz w:val="20"/>
+          <w:szCs w:val="20"/>
+          <w:shd w:val="clear" w:color="auto" w:fill="F6F4FF"/>
+        </w:rPr>
+        <w:t>/redoc</w:t>
+      </w:r>
+      <w:r>
+        <w:t>. Every request and response schema can be inspected and tried live.</w:t>
+      </w:r>
+    </w:p>
+    <w:p>
+      <w:pPr>
+        <w:keepNext/>
+        <w:spacing w:before="120" w:after="60"/>
+        <w:jc w:val="center"/>
+      </w:pPr>
+      <w:r>
+        <w:rPr>
+          <w:noProof/>
+        </w:rPr>
+        <w:lastRenderedPageBreak/>
+        <w:drawing>
+          <wp:inline distT="0" distB="0" distL="0" distR="0" wp14:anchorId="26F36475" wp14:editId="62619227">
+            <wp:extent cx="6400800" cy="7229475"/>
+            <wp:effectExtent l="0" t="0" r="0" b="0"/>
+            <wp:docPr id="1533665588" name="Picture 1533665588"/>
+            <wp:cNvGraphicFramePr>
+              <a:graphicFrameLocks xmlns:a="http://schemas.openxmlformats.org/drawingml/2006/main" noChangeAspect="1"/>
+            </wp:cNvGraphicFramePr>
+            <a:graphic xmlns:a="http://schemas.openxmlformats.org/drawingml/2006/main">
+              <a:graphicData uri="http://schemas.openxmlformats.org/drawingml/2006/picture">
+                <pic:pic xmlns:pic="http://schemas.openxmlformats.org/drawingml/2006/picture">
+                  <pic:nvPicPr>
+                    <pic:cNvPr id="0" name=""/>
+                    <pic:cNvPicPr>
+                      <a:picLocks noChangeAspect="1" noChangeArrowheads="1"/>
+                    </pic:cNvPicPr>
+                  </pic:nvPicPr>
+                  <pic:blipFill>
+                    <a:blip r:embed="rId16"/>
+                    <a:srcRect/>
+                    <a:stretch>
+                      <a:fillRect/>
+                    </a:stretch>
+                  </pic:blipFill>
+                  <pic:spPr bwMode="auto">
+                    <a:xfrm>
+                      <a:off x="0" y="0"/>
+                      <a:ext cx="6400800" cy="7229475"/>
+                    </a:xfrm>
+                    <a:prstGeom prst="rect">
+                      <a:avLst/>
+                    </a:prstGeom>
+                  </pic:spPr>
+                </pic:pic>
+              </a:graphicData>
+            </a:graphic>
+          </wp:inline>
+        </w:drawing>
+      </w:r>
+    </w:p>
+    <w:p>
+      <w:pPr>
+        <w:spacing w:after="200"/>
+        <w:jc w:val="center"/>
+      </w:pPr>
+      <w:r>
+        <w:rPr>
+          <w:i/>
+          <w:iCs/>
+          <w:color w:val="6B6482"/>
+          <w:sz w:val="18"/>
+          <w:szCs w:val="18"/>
+        </w:rPr>
+        <w:t>Figure 9 – Swagger UI at /docs</w:t>
+      </w:r>
+    </w:p>
+    <w:p>
+      <w:pPr>
+        <w:keepNext/>
+        <w:spacing w:before="120" w:after="60"/>
+        <w:jc w:val="center"/>
+      </w:pPr>
+      <w:r>
+        <w:rPr>
+          <w:noProof/>
+        </w:rPr>
+        <w:lastRenderedPageBreak/>
+        <w:drawing>
+          <wp:inline distT="0" distB="0" distL="0" distR="0" wp14:anchorId="5430BE1B" wp14:editId="6CF9E6C6">
+            <wp:extent cx="3886200" cy="7429500"/>
+            <wp:effectExtent l="0" t="0" r="0" b="0"/>
+            <wp:docPr id="968320092" name="Picture 968320092"/>
+            <wp:cNvGraphicFramePr>
+              <a:graphicFrameLocks xmlns:a="http://schemas.openxmlformats.org/drawingml/2006/main" noChangeAspect="1"/>
+            </wp:cNvGraphicFramePr>
+            <a:graphic xmlns:a="http://schemas.openxmlformats.org/drawingml/2006/main">
+              <a:graphicData uri="http://schemas.openxmlformats.org/drawingml/2006/picture">
+                <pic:pic xmlns:pic="http://schemas.openxmlformats.org/drawingml/2006/picture">
+                  <pic:nvPicPr>
+                    <pic:cNvPr id="0" name=""/>
+                    <pic:cNvPicPr>
+                      <a:picLocks noChangeAspect="1" noChangeArrowheads="1"/>
+                    </pic:cNvPicPr>
+                  </pic:nvPicPr>
+                  <pic:blipFill>
+                    <a:blip r:embed="rId17"/>
+                    <a:srcRect/>
+                    <a:stretch>
+                      <a:fillRect/>
+                    </a:stretch>
+                  </pic:blipFill>
+                  <pic:spPr bwMode="auto">
+                    <a:xfrm>
+                      <a:off x="0" y="0"/>
+                      <a:ext cx="3886200" cy="7429500"/>
+                    </a:xfrm>
+                    <a:prstGeom prst="rect">
+                      <a:avLst/>
+                    </a:prstGeom>
+                  </pic:spPr>
+                </pic:pic>
+              </a:graphicData>
+            </a:graphic>
+          </wp:inline>
+        </w:drawing>
+      </w:r>
+    </w:p>
+    <w:p>
+      <w:pPr>
+        <w:spacing w:after="200"/>
+        <w:jc w:val="center"/>
+      </w:pPr>
+      <w:r>
+        <w:rPr>
+          <w:i/>
+          <w:iCs/>
+          <w:color w:val="6B6482"/>
+          <w:sz w:val="18"/>
+          <w:szCs w:val="18"/>
+        </w:rPr>
+        <w:t>Figure 10 – Summary endpoint expanded: request schema and responses</w:t>
+      </w:r>
+    </w:p>
+    <w:p>
+      <w:pPr>
+        <w:pStyle w:val="Heading1"/>
+        <w:keepNext/>
+        <w:pageBreakBefore/>
+      </w:pPr>
+      <w:bookmarkStart w:id="19" w:name="_Toc241913512"/>
+      <w:r>
+        <w:lastRenderedPageBreak/>
+        <w:t>4. Configuration</w:t>
+      </w:r>
+      <w:bookmarkEnd w:id="19"/>
+    </w:p>
+    <w:p>
+      <w:pPr>
+        <w:spacing w:after="120"/>
+      </w:pPr>
+      <w:r>
+        <w:t xml:space="preserve">FareLens works with zero configuration. Copy </w:t>
+      </w:r>
+      <w:r>
+        <w:rPr>
+          <w:rFonts w:ascii="Consolas" w:eastAsia="Consolas" w:hAnsi="Consolas" w:cs="Consolas"/>
+          <w:color w:val="442690"/>
+          <w:sz w:val="20"/>
+          <w:szCs w:val="20"/>
+          <w:shd w:val="clear" w:color="auto" w:fill="F6F4FF"/>
+        </w:rPr>
+        <w:t>.env.example</w:t>
+      </w:r>
+      <w:r>
+        <w:t xml:space="preserve"> to </w:t>
+      </w:r>
+      <w:r>
+        <w:rPr>
+          <w:rFonts w:ascii="Consolas" w:eastAsia="Consolas" w:hAnsi="Consolas" w:cs="Consolas"/>
+          <w:color w:val="442690"/>
+          <w:sz w:val="20"/>
+          <w:szCs w:val="20"/>
+          <w:shd w:val="clear" w:color="auto" w:fill="F6F4FF"/>
+        </w:rPr>
         <w:t>.env</w:t>
       </w:r>
       <w:r>
@@ -6121,11 +7191,11 @@
         <w:pStyle w:val="Heading2"/>
         <w:keepNext/>
       </w:pPr>
-      <w:bookmarkStart w:id="18" w:name="_Toc241000491"/>
+      <w:bookmarkStart w:id="20" w:name="_Toc241913513"/>
       <w:r>
         <w:t>4.1 Environment variables</w:t>
       </w:r>
-      <w:bookmarkEnd w:id="18"/>
+      <w:bookmarkEnd w:id="20"/>
     </w:p>
     <w:tbl>
       <w:tblPr>
@@ -7362,11 +8432,11 @@
         <w:pStyle w:val="Heading2"/>
         <w:keepNext/>
       </w:pPr>
-      <w:bookmarkStart w:id="19" w:name="_Toc241000492"/>
+      <w:bookmarkStart w:id="21" w:name="_Toc241913514"/>
       <w:r>
         <w:t>4.2 LLM providers</w:t>
       </w:r>
-      <w:bookmarkEnd w:id="19"/>
+      <w:bookmarkEnd w:id="21"/>
     </w:p>
     <w:tbl>
       <w:tblPr>
@@ -8023,11 +9093,12 @@
         <w:pStyle w:val="Heading2"/>
         <w:keepNext/>
       </w:pPr>
-      <w:bookmarkStart w:id="20" w:name="_Toc241000493"/>
-      <w:r>
+      <w:bookmarkStart w:id="22" w:name="_Toc241913515"/>
+      <w:r>
+        <w:lastRenderedPageBreak/>
         <w:t>4.3 Using your own Postgres / Redis</w:t>
       </w:r>
-      <w:bookmarkEnd w:id="20"/>
+      <w:bookmarkEnd w:id="22"/>
     </w:p>
     <w:p>
       <w:pPr>
@@ -8058,10 +9129,10 @@
           <w:noProof/>
         </w:rPr>
         <w:drawing>
-          <wp:inline distT="0" distB="0" distL="0" distR="0" wp14:anchorId="4EB3C635" wp14:editId="61C7CCF2">
+          <wp:inline distT="0" distB="0" distL="0" distR="0" wp14:anchorId="4A173962" wp14:editId="78013D63">
             <wp:extent cx="6400800" cy="4000500"/>
             <wp:effectExtent l="0" t="0" r="0" b="0"/>
-            <wp:docPr id="802490175" name="Picture 802490175"/>
+            <wp:docPr id="1854707394" name="Picture 1854707394"/>
             <wp:cNvGraphicFramePr>
               <a:graphicFrameLocks xmlns:a="http://schemas.openxmlformats.org/drawingml/2006/main" noChangeAspect="1"/>
             </wp:cNvGraphicFramePr>
@@ -8075,7 +9146,7 @@
                     </pic:cNvPicPr>
                   </pic:nvPicPr>
                   <pic:blipFill>
-                    <a:blip r:embed="rId16"/>
+                    <a:blip r:embed="rId18"/>
                     <a:srcRect/>
                     <a:stretch>
                       <a:fillRect/>
@@ -8110,7 +9181,7 @@
           <w:sz w:val="18"/>
           <w:szCs w:val="18"/>
         </w:rPr>
-        <w:t>Figure 9 – Data stores: bundled or your own, with connection tests</w:t>
+        <w:t>Figure 11 – Data stores: bundled or your own, with connection tests</w:t>
       </w:r>
     </w:p>
     <w:p>
@@ -8118,18 +9189,18 @@
         <w:pStyle w:val="Heading2"/>
         <w:keepNext/>
       </w:pPr>
-      <w:bookmarkStart w:id="21" w:name="_Toc241000494"/>
+      <w:bookmarkStart w:id="23" w:name="_Toc241913516"/>
       <w:r>
         <w:t>4.4 Prompts</w:t>
       </w:r>
-      <w:bookmarkEnd w:id="21"/>
+      <w:bookmarkEnd w:id="23"/>
     </w:p>
     <w:p>
       <w:pPr>
         <w:spacing w:after="120"/>
       </w:pPr>
       <w:r>
-        <w:t>Prompts can be edited from the admin UI (</w:t>
+        <w:t>All prompts, including the amenities and fare-name ones, can be edited from the admin UI (</w:t>
       </w:r>
       <w:r>
         <w:rPr>
@@ -8152,11 +9223,12 @@
         <w:rPr>
           <w:noProof/>
         </w:rPr>
+        <w:lastRenderedPageBreak/>
         <w:drawing>
-          <wp:inline distT="0" distB="0" distL="0" distR="0" wp14:anchorId="490E5D1E" wp14:editId="471735BE">
+          <wp:inline distT="0" distB="0" distL="0" distR="0" wp14:anchorId="629D0888" wp14:editId="3D5D3621">
             <wp:extent cx="6400800" cy="4000500"/>
             <wp:effectExtent l="0" t="0" r="0" b="0"/>
-            <wp:docPr id="1292826444" name="Picture 1292826444"/>
+            <wp:docPr id="1828275227" name="Picture 1828275227"/>
             <wp:cNvGraphicFramePr>
               <a:graphicFrameLocks xmlns:a="http://schemas.openxmlformats.org/drawingml/2006/main" noChangeAspect="1"/>
             </wp:cNvGraphicFramePr>
@@ -8170,7 +9242,7 @@
                     </pic:cNvPicPr>
                   </pic:nvPicPr>
                   <pic:blipFill>
-                    <a:blip r:embed="rId17"/>
+                    <a:blip r:embed="rId19"/>
                     <a:srcRect/>
                     <a:stretch>
                       <a:fillRect/>
@@ -8205,7 +9277,7 @@
           <w:sz w:val="18"/>
           <w:szCs w:val="18"/>
         </w:rPr>
-        <w:t>Figure 8 – Prompt editor with live preview</w:t>
+        <w:t>Figure 12 – Prompt editor with live preview</w:t>
       </w:r>
     </w:p>
     <w:p>
@@ -8287,22 +9359,23 @@
         <w:keepNext/>
         <w:pageBreakBefore/>
       </w:pPr>
-      <w:bookmarkStart w:id="22" w:name="_Toc241000495"/>
-      <w:r>
+      <w:bookmarkStart w:id="24" w:name="_Toc241913517"/>
+      <w:r>
+        <w:lastRenderedPageBreak/>
         <w:t>5. Architecture</w:t>
       </w:r>
-      <w:bookmarkEnd w:id="22"/>
+      <w:bookmarkEnd w:id="24"/>
     </w:p>
     <w:p>
       <w:pPr>
         <w:pStyle w:val="Heading2"/>
         <w:keepNext/>
       </w:pPr>
-      <w:bookmarkStart w:id="23" w:name="_Toc241000496"/>
+      <w:bookmarkStart w:id="25" w:name="_Toc241913518"/>
       <w:r>
         <w:t>5.1 Request flow</w:t>
       </w:r>
-      <w:bookmarkEnd w:id="23"/>
+      <w:bookmarkEnd w:id="25"/>
     </w:p>
     <w:p>
       <w:pPr>
@@ -8421,11 +9494,11 @@
         <w:pStyle w:val="Heading2"/>
         <w:keepNext/>
       </w:pPr>
-      <w:bookmarkStart w:id="24" w:name="_Toc241000497"/>
+      <w:bookmarkStart w:id="26" w:name="_Toc241913519"/>
       <w:r>
         <w:t>5.2 Code layout</w:t>
       </w:r>
-      <w:bookmarkEnd w:id="24"/>
+      <w:bookmarkEnd w:id="26"/>
     </w:p>
     <w:p>
       <w:pPr>
@@ -8587,11 +9660,11 @@
         <w:pStyle w:val="Heading2"/>
         <w:keepNext/>
       </w:pPr>
-      <w:bookmarkStart w:id="25" w:name="_Toc241000498"/>
+      <w:bookmarkStart w:id="27" w:name="_Toc241913520"/>
       <w:r>
         <w:t>5.3 Technology</w:t>
       </w:r>
-      <w:bookmarkEnd w:id="25"/>
+      <w:bookmarkEnd w:id="27"/>
     </w:p>
     <w:tbl>
       <w:tblPr>
@@ -8983,22 +10056,23 @@
         <w:keepNext/>
         <w:pageBreakBefore/>
       </w:pPr>
-      <w:bookmarkStart w:id="26" w:name="_Toc241000499"/>
-      <w:r>
+      <w:bookmarkStart w:id="28" w:name="_Toc241913521"/>
+      <w:r>
+        <w:lastRenderedPageBreak/>
         <w:t>6. Deployment</w:t>
       </w:r>
-      <w:bookmarkEnd w:id="26"/>
+      <w:bookmarkEnd w:id="28"/>
     </w:p>
     <w:p>
       <w:pPr>
         <w:pStyle w:val="Heading2"/>
         <w:keepNext/>
       </w:pPr>
-      <w:bookmarkStart w:id="27" w:name="_Toc241000500"/>
+      <w:bookmarkStart w:id="29" w:name="_Toc241913522"/>
       <w:r>
         <w:t>6.1 Production checklist</w:t>
       </w:r>
-      <w:bookmarkEnd w:id="27"/>
+      <w:bookmarkEnd w:id="29"/>
     </w:p>
     <w:p>
       <w:pPr>
@@ -9122,11 +10196,11 @@
         <w:pStyle w:val="Heading2"/>
         <w:keepNext/>
       </w:pPr>
-      <w:bookmarkStart w:id="28" w:name="_Toc241000501"/>
+      <w:bookmarkStart w:id="30" w:name="_Toc241913523"/>
       <w:r>
         <w:t>6.2 Reverse proxy</w:t>
       </w:r>
-      <w:bookmarkEnd w:id="28"/>
+      <w:bookmarkEnd w:id="30"/>
     </w:p>
     <w:p>
       <w:pPr>
@@ -9304,11 +10378,11 @@
         <w:pStyle w:val="Heading2"/>
         <w:keepNext/>
       </w:pPr>
-      <w:bookmarkStart w:id="29" w:name="_Toc241000502"/>
+      <w:bookmarkStart w:id="31" w:name="_Toc241913524"/>
       <w:r>
         <w:t>6.3 Scaling, persistence and upgrades</w:t>
       </w:r>
-      <w:bookmarkEnd w:id="29"/>
+      <w:bookmarkEnd w:id="31"/>
     </w:p>
     <w:p>
       <w:pPr>
@@ -9445,11 +10519,12 @@
         <w:pStyle w:val="Heading2"/>
         <w:keepNext/>
       </w:pPr>
-      <w:bookmarkStart w:id="30" w:name="_Toc241000503"/>
-      <w:r>
+      <w:bookmarkStart w:id="32" w:name="_Toc241913525"/>
+      <w:r>
+        <w:lastRenderedPageBreak/>
         <w:t>6.4 What FareLens stores</w:t>
       </w:r>
-      <w:bookmarkEnd w:id="30"/>
+      <w:bookmarkEnd w:id="32"/>
     </w:p>
     <w:tbl>
       <w:tblPr>
@@ -10196,11 +11271,12 @@
         <w:keepNext/>
         <w:pageBreakBefore/>
       </w:pPr>
-      <w:bookmarkStart w:id="31" w:name="_Toc241000504"/>
-      <w:r>
+      <w:bookmarkStart w:id="33" w:name="_Toc241913526"/>
+      <w:r>
+        <w:lastRenderedPageBreak/>
         <w:t>7. Contributing, credits and license</w:t>
       </w:r>
-      <w:bookmarkEnd w:id="31"/>
+      <w:bookmarkEnd w:id="33"/>
     </w:p>
     <w:p>
       <w:pPr>
@@ -10308,8 +11384,8 @@
       </w:r>
     </w:p>
     <w:sectPr>
-      <w:headerReference w:type="default" r:id="rId18"/>
-      <w:footerReference w:type="default" r:id="rId19"/>
+      <w:headerReference w:type="default" r:id="rId20"/>
+      <w:footerReference w:type="default" r:id="rId21"/>
       <w:pgSz w:w="12240" w:h="15840"/>
       <w:pgMar w:top="1080" w:right="1080" w:bottom="1080" w:left="1080" w:header="708" w:footer="708" w:gutter="0"/>
       <w:cols w:space="720"/>
@@ -10498,273 +11574,273 @@
 <file path=word/numbering.xml><?xml version="1.0" encoding="utf-8"?>
 <w:numbering xmlns:wpc="http://schemas.microsoft.com/office/word/2010/wordprocessingCanvas" xmlns:cx="http://schemas.microsoft.com/office/drawing/2014/chartex" xmlns:cx1="http://schemas.microsoft.com/office/drawing/2015/9/8/chartex" xmlns:cx2="http://schemas.microsoft.com/office/drawing/2015/10/21/chartex" xmlns:cx3="http://schemas.microsoft.com/office/drawing/2016/5/9/chartex" xmlns:cx4="http://schemas.microsoft.com/office/drawing/2016/5/10/chartex" xmlns:cx5="http://schemas.microsoft.com/office/drawing/2016/5/11/chartex" xmlns:cx6="http://schemas.microsoft.com/office/drawing/2016/5/12/chartex" xmlns:cx7="http://schemas.microsoft.com/office/drawing/2016/5/13/chartex" xmlns:cx8="http://schemas.microsoft.com/office/drawing/2016/5/14/chartex" xmlns:mc="http://schemas.openxmlformats.org/markup-compatibility/2006" xmlns:aink="http://schemas.microsoft.com/office/drawing/2016/ink" xmlns:am3d="http://schemas.microsoft.com/office/drawing/2017/model3d" xmlns:o="urn:schemas-microsoft-com:office:office" xmlns:oel="http://schemas.microsoft.com/office/2019/extlst" xmlns:r="http://schemas.openxmlformats.org/officeDocument/2006/relationships" xmlns:m="http://schemas.openxmlformats.org/officeDocument/2006/math" xmlns:v="urn:schemas-microsoft-com:vml" xmlns:wp14="http://schemas.microsoft.com/office/word/2010/wordprocessingDrawing" xmlns:wp="http://schemas.openxmlformats.org/drawingml/2006/wordprocessingDrawing" xmlns:w10="urn:schemas-microsoft-com:office:word" xmlns:w="http://schemas.openxmlformats.org/wordprocessingml/2006/main" xmlns:w14="http://schemas.microsoft.com/office/word/2010/wordml" xmlns:w15="http://schemas.microsoft.com/office/word/2012/wordml" xmlns:w16cex="http://schemas.microsoft.com/office/word/2018/wordml/cex" xmlns:w16cid="http://schemas.microsoft.com/office/word/2016/wordml/cid" xmlns:w16="http://schemas.microsoft.com/office/word/2018/wordml" xmlns:w16du="http://schemas.microsoft.com/office/word/2023/wordml/word16du" xmlns:w16sdtdh="http://schemas.microsoft.com/office/word/2020/wordml/sdtdatahash" xmlns:w16sdtfl="http://schemas.microsoft.com/office/word/2024/wordml/sdtformatlock" xmlns:w16se="http://schemas.microsoft.com/office/word/2015/wordml/symex" xmlns:wpg="http://schemas.microsoft.com/office/word/2010/wordprocessingGroup" xmlns:wpi="http://schemas.microsoft.com/office/word/2010/wordprocessingInk" xmlns:wne="http://schemas.microsoft.com/office/word/2006/wordml" xmlns:wps="http://schemas.microsoft.com/office/word/2010/wordprocessingShape" mc:Ignorable="w14 w15 w16se w16cid w16 w16cex w16sdtdh w16sdtfl w16du wp14">
   <w:abstractNum w:abstractNumId="0" w15:restartNumberingAfterBreak="0">
-    <w:nsid w:val="22B711E7"/>
+    <w:nsid w:val="28C7117E"/>
     <w:multiLevelType w:val="hybridMultilevel"/>
-    <w:tmpl w:val="1220AB18"/>
-    <w:lvl w:ilvl="0" w:tplc="3F8A1620">
+    <w:tmpl w:val="EF02E978"/>
+    <w:lvl w:ilvl="0" w:tplc="5A62DE02">
       <w:start w:val="1"/>
       <w:numFmt w:val="bullet"/>
-      <w:lvlText w:val="•"/>
+      <w:lvlText w:val="●"/>
       <w:lvlJc w:val="left"/>
       <w:pPr>
-        <w:ind w:left="540" w:hanging="270"/>
+        <w:ind w:left="720" w:hanging="360"/>
       </w:pPr>
     </w:lvl>
-    <w:lvl w:ilvl="1" w:tplc="0D523F20">
+    <w:lvl w:ilvl="1" w:tplc="A7C0F58A">
+      <w:start w:val="1"/>
+      <w:numFmt w:val="bullet"/>
+      <w:lvlText w:val="○"/>
+      <w:lvlJc w:val="left"/>
+      <w:pPr>
+        <w:ind w:left="1440" w:hanging="360"/>
+      </w:pPr>
+    </w:lvl>
+    <w:lvl w:ilvl="2" w:tplc="54582E3C">
+      <w:start w:val="1"/>
+      <w:numFmt w:val="bullet"/>
+      <w:lvlText w:val="■"/>
+      <w:lvlJc w:val="left"/>
+      <w:pPr>
+        <w:ind w:left="2160" w:hanging="360"/>
+      </w:pPr>
+    </w:lvl>
+    <w:lvl w:ilvl="3" w:tplc="17E643A4">
+      <w:start w:val="1"/>
+      <w:numFmt w:val="bullet"/>
+      <w:lvlText w:val="●"/>
+      <w:lvlJc w:val="left"/>
+      <w:pPr>
+        <w:ind w:left="2880" w:hanging="360"/>
+      </w:pPr>
+    </w:lvl>
+    <w:lvl w:ilvl="4" w:tplc="5A40E350">
+      <w:start w:val="1"/>
+      <w:numFmt w:val="bullet"/>
+      <w:lvlText w:val="○"/>
+      <w:lvlJc w:val="left"/>
+      <w:pPr>
+        <w:ind w:left="3600" w:hanging="360"/>
+      </w:pPr>
+    </w:lvl>
+    <w:lvl w:ilvl="5" w:tplc="1402D02A">
+      <w:start w:val="1"/>
+      <w:numFmt w:val="bullet"/>
+      <w:lvlText w:val="■"/>
+      <w:lvlJc w:val="left"/>
+      <w:pPr>
+        <w:ind w:left="4320" w:hanging="360"/>
+      </w:pPr>
+    </w:lvl>
+    <w:lvl w:ilvl="6" w:tplc="70C6FD94">
+      <w:start w:val="1"/>
+      <w:numFmt w:val="bullet"/>
+      <w:lvlText w:val="●"/>
+      <w:lvlJc w:val="left"/>
+      <w:pPr>
+        <w:ind w:left="5040" w:hanging="360"/>
+      </w:pPr>
+    </w:lvl>
+    <w:lvl w:ilvl="7" w:tplc="D22A566C">
+      <w:start w:val="1"/>
+      <w:numFmt w:val="bullet"/>
+      <w:lvlText w:val="●"/>
+      <w:lvlJc w:val="left"/>
+      <w:pPr>
+        <w:ind w:left="5760" w:hanging="360"/>
+      </w:pPr>
+    </w:lvl>
+    <w:lvl w:ilvl="8" w:tplc="C4208E9A">
+      <w:start w:val="1"/>
+      <w:numFmt w:val="bullet"/>
+      <w:lvlText w:val="●"/>
+      <w:lvlJc w:val="left"/>
+      <w:pPr>
+        <w:ind w:left="6480" w:hanging="360"/>
+      </w:pPr>
+    </w:lvl>
+  </w:abstractNum>
+  <w:abstractNum w:abstractNumId="1" w15:restartNumberingAfterBreak="0">
+    <w:nsid w:val="380E39F8"/>
+    <w:multiLevelType w:val="hybridMultilevel"/>
+    <w:tmpl w:val="19B8EAD0"/>
+    <w:lvl w:ilvl="0" w:tplc="C0169422">
+      <w:start w:val="1"/>
+      <w:numFmt w:val="bullet"/>
+      <w:lvlText w:val="☐"/>
+      <w:lvlJc w:val="left"/>
+      <w:pPr>
+        <w:ind w:left="540" w:hanging="320"/>
+      </w:pPr>
+    </w:lvl>
+    <w:lvl w:ilvl="1" w:tplc="6832C986">
       <w:numFmt w:val="decimal"/>
       <w:lvlText w:val=""/>
       <w:lvlJc w:val="left"/>
     </w:lvl>
-    <w:lvl w:ilvl="2" w:tplc="43E88B1A">
+    <w:lvl w:ilvl="2" w:tplc="D24AE83E">
       <w:numFmt w:val="decimal"/>
       <w:lvlText w:val=""/>
       <w:lvlJc w:val="left"/>
     </w:lvl>
-    <w:lvl w:ilvl="3" w:tplc="FB78B93A">
+    <w:lvl w:ilvl="3" w:tplc="34A628DC">
       <w:numFmt w:val="decimal"/>
       <w:lvlText w:val=""/>
       <w:lvlJc w:val="left"/>
     </w:lvl>
-    <w:lvl w:ilvl="4" w:tplc="895C2880">
+    <w:lvl w:ilvl="4" w:tplc="D158B16E">
       <w:numFmt w:val="decimal"/>
       <w:lvlText w:val=""/>
       <w:lvlJc w:val="left"/>
     </w:lvl>
-    <w:lvl w:ilvl="5" w:tplc="2E106180">
+    <w:lvl w:ilvl="5" w:tplc="63866A8E">
       <w:numFmt w:val="decimal"/>
       <w:lvlText w:val=""/>
       <w:lvlJc w:val="left"/>
     </w:lvl>
-    <w:lvl w:ilvl="6" w:tplc="E6722C40">
+    <w:lvl w:ilvl="6" w:tplc="25CE9BDC">
       <w:numFmt w:val="decimal"/>
       <w:lvlText w:val=""/>
       <w:lvlJc w:val="left"/>
     </w:lvl>
-    <w:lvl w:ilvl="7" w:tplc="05443F7E">
+    <w:lvl w:ilvl="7" w:tplc="D270D2C2">
       <w:numFmt w:val="decimal"/>
       <w:lvlText w:val=""/>
       <w:lvlJc w:val="left"/>
     </w:lvl>
-    <w:lvl w:ilvl="8" w:tplc="36DAA65C">
-      <w:numFmt w:val="decimal"/>
-      <w:lvlText w:val=""/>
-      <w:lvlJc w:val="left"/>
-    </w:lvl>
-  </w:abstractNum>
-  <w:abstractNum w:abstractNumId="1" w15:restartNumberingAfterBreak="0">
-    <w:nsid w:val="4D300138"/>
-    <w:multiLevelType w:val="hybridMultilevel"/>
-    <w:tmpl w:val="FA3C74D8"/>
-    <w:lvl w:ilvl="0" w:tplc="E502044E">
-      <w:start w:val="1"/>
-      <w:numFmt w:val="decimal"/>
-      <w:lvlText w:val="%1."/>
-      <w:lvlJc w:val="left"/>
-      <w:pPr>
-        <w:ind w:left="540" w:hanging="360"/>
-      </w:pPr>
-    </w:lvl>
-    <w:lvl w:ilvl="1" w:tplc="9AF6438A">
-      <w:numFmt w:val="decimal"/>
-      <w:lvlText w:val=""/>
-      <w:lvlJc w:val="left"/>
-    </w:lvl>
-    <w:lvl w:ilvl="2" w:tplc="98EADA34">
-      <w:numFmt w:val="decimal"/>
-      <w:lvlText w:val=""/>
-      <w:lvlJc w:val="left"/>
-    </w:lvl>
-    <w:lvl w:ilvl="3" w:tplc="A844D7D8">
-      <w:numFmt w:val="decimal"/>
-      <w:lvlText w:val=""/>
-      <w:lvlJc w:val="left"/>
-    </w:lvl>
-    <w:lvl w:ilvl="4" w:tplc="1F8E140C">
-      <w:numFmt w:val="decimal"/>
-      <w:lvlText w:val=""/>
-      <w:lvlJc w:val="left"/>
-    </w:lvl>
-    <w:lvl w:ilvl="5" w:tplc="8F0E9752">
-      <w:numFmt w:val="decimal"/>
-      <w:lvlText w:val=""/>
-      <w:lvlJc w:val="left"/>
-    </w:lvl>
-    <w:lvl w:ilvl="6" w:tplc="9DF42A84">
-      <w:numFmt w:val="decimal"/>
-      <w:lvlText w:val=""/>
-      <w:lvlJc w:val="left"/>
-    </w:lvl>
-    <w:lvl w:ilvl="7" w:tplc="6692445A">
-      <w:numFmt w:val="decimal"/>
-      <w:lvlText w:val=""/>
-      <w:lvlJc w:val="left"/>
-    </w:lvl>
-    <w:lvl w:ilvl="8" w:tplc="83DAE076">
+    <w:lvl w:ilvl="8" w:tplc="E5384C0E">
       <w:numFmt w:val="decimal"/>
       <w:lvlText w:val=""/>
       <w:lvlJc w:val="left"/>
     </w:lvl>
   </w:abstractNum>
   <w:abstractNum w:abstractNumId="2" w15:restartNumberingAfterBreak="0">
-    <w:nsid w:val="610537E9"/>
+    <w:nsid w:val="6EC37EB8"/>
     <w:multiLevelType w:val="hybridMultilevel"/>
-    <w:tmpl w:val="36EC70AA"/>
-    <w:lvl w:ilvl="0" w:tplc="B0C278EA">
+    <w:tmpl w:val="3B00D578"/>
+    <w:lvl w:ilvl="0" w:tplc="1508208E">
       <w:start w:val="1"/>
       <w:numFmt w:val="bullet"/>
-      <w:lvlText w:val="☐"/>
+      <w:lvlText w:val="•"/>
       <w:lvlJc w:val="left"/>
       <w:pPr>
-        <w:ind w:left="540" w:hanging="320"/>
+        <w:ind w:left="540" w:hanging="270"/>
       </w:pPr>
     </w:lvl>
-    <w:lvl w:ilvl="1" w:tplc="0DD61346">
+    <w:lvl w:ilvl="1" w:tplc="2D162B2E">
       <w:numFmt w:val="decimal"/>
       <w:lvlText w:val=""/>
       <w:lvlJc w:val="left"/>
     </w:lvl>
-    <w:lvl w:ilvl="2" w:tplc="DF3472D8">
+    <w:lvl w:ilvl="2" w:tplc="E020C736">
       <w:numFmt w:val="decimal"/>
       <w:lvlText w:val=""/>
       <w:lvlJc w:val="left"/>
     </w:lvl>
-    <w:lvl w:ilvl="3" w:tplc="5E1A935C">
+    <w:lvl w:ilvl="3" w:tplc="05F295F4">
       <w:numFmt w:val="decimal"/>
       <w:lvlText w:val=""/>
       <w:lvlJc w:val="left"/>
     </w:lvl>
-    <w:lvl w:ilvl="4" w:tplc="DD8E21C4">
+    <w:lvl w:ilvl="4" w:tplc="2414A052">
       <w:numFmt w:val="decimal"/>
       <w:lvlText w:val=""/>
       <w:lvlJc w:val="left"/>
     </w:lvl>
-    <w:lvl w:ilvl="5" w:tplc="A9441DC6">
+    <w:lvl w:ilvl="5" w:tplc="D0969BD8">
       <w:numFmt w:val="decimal"/>
       <w:lvlText w:val=""/>
       <w:lvlJc w:val="left"/>
     </w:lvl>
-    <w:lvl w:ilvl="6" w:tplc="96A81034">
+    <w:lvl w:ilvl="6" w:tplc="349A7436">
       <w:numFmt w:val="decimal"/>
       <w:lvlText w:val=""/>
       <w:lvlJc w:val="left"/>
     </w:lvl>
-    <w:lvl w:ilvl="7" w:tplc="11E62028">
+    <w:lvl w:ilvl="7" w:tplc="DC0A1930">
       <w:numFmt w:val="decimal"/>
       <w:lvlText w:val=""/>
       <w:lvlJc w:val="left"/>
     </w:lvl>
-    <w:lvl w:ilvl="8" w:tplc="F9783CA8">
+    <w:lvl w:ilvl="8" w:tplc="C7BE7CC4">
       <w:numFmt w:val="decimal"/>
       <w:lvlText w:val=""/>
       <w:lvlJc w:val="left"/>
     </w:lvl>
   </w:abstractNum>
   <w:abstractNum w:abstractNumId="3" w15:restartNumberingAfterBreak="0">
-    <w:nsid w:val="7E891FA0"/>
+    <w:nsid w:val="7D1723BA"/>
     <w:multiLevelType w:val="hybridMultilevel"/>
-    <w:tmpl w:val="33A6EC02"/>
-    <w:lvl w:ilvl="0" w:tplc="BD781FC0">
+    <w:tmpl w:val="93082970"/>
+    <w:lvl w:ilvl="0" w:tplc="F22E9A12">
       <w:start w:val="1"/>
-      <w:numFmt w:val="bullet"/>
-      <w:lvlText w:val="●"/>
+      <w:numFmt w:val="decimal"/>
+      <w:lvlText w:val="%1."/>
       <w:lvlJc w:val="left"/>
       <w:pPr>
-        <w:ind w:left="720" w:hanging="360"/>
+        <w:ind w:left="540" w:hanging="360"/>
       </w:pPr>
     </w:lvl>
-    <w:lvl w:ilvl="1" w:tplc="4C527ACE">
-      <w:start w:val="1"/>
-      <w:numFmt w:val="bullet"/>
-      <w:lvlText w:val="○"/>
+    <w:lvl w:ilvl="1" w:tplc="3860034A">
+      <w:numFmt w:val="decimal"/>
+      <w:lvlText w:val=""/>
       <w:lvlJc w:val="left"/>
-      <w:pPr>
-        <w:ind w:left="1440" w:hanging="360"/>
-      </w:pPr>
     </w:lvl>
-    <w:lvl w:ilvl="2" w:tplc="8C46FB60">
-      <w:start w:val="1"/>
-      <w:numFmt w:val="bullet"/>
-      <w:lvlText w:val="■"/>
+    <w:lvl w:ilvl="2" w:tplc="9A60ED42">
+      <w:numFmt w:val="decimal"/>
+      <w:lvlText w:val=""/>
       <w:lvlJc w:val="left"/>
-      <w:pPr>
-        <w:ind w:left="2160" w:hanging="360"/>
-      </w:pPr>
     </w:lvl>
-    <w:lvl w:ilvl="3" w:tplc="17021332">
-      <w:start w:val="1"/>
-      <w:numFmt w:val="bullet"/>
-      <w:lvlText w:val="●"/>
+    <w:lvl w:ilvl="3" w:tplc="BB0E8744">
+      <w:numFmt w:val="decimal"/>
+      <w:lvlText w:val=""/>
       <w:lvlJc w:val="left"/>
-      <w:pPr>
-        <w:ind w:left="2880" w:hanging="360"/>
-      </w:pPr>
     </w:lvl>
-    <w:lvl w:ilvl="4" w:tplc="B796AE22">
-      <w:start w:val="1"/>
-      <w:numFmt w:val="bullet"/>
-      <w:lvlText w:val="○"/>
+    <w:lvl w:ilvl="4" w:tplc="DCD8066A">
+      <w:numFmt w:val="decimal"/>
+      <w:lvlText w:val=""/>
       <w:lvlJc w:val="left"/>
-      <w:pPr>
-        <w:ind w:left="3600" w:hanging="360"/>
-      </w:pPr>
     </w:lvl>
-    <w:lvl w:ilvl="5" w:tplc="FCC2215A">
-      <w:start w:val="1"/>
-      <w:numFmt w:val="bullet"/>
-      <w:lvlText w:val="■"/>
+    <w:lvl w:ilvl="5" w:tplc="88FA445C">
+      <w:numFmt w:val="decimal"/>
+      <w:lvlText w:val=""/>
       <w:lvlJc w:val="left"/>
-      <w:pPr>
-        <w:ind w:left="4320" w:hanging="360"/>
-      </w:pPr>
     </w:lvl>
-    <w:lvl w:ilvl="6" w:tplc="E256AFA2">
-      <w:start w:val="1"/>
-      <w:numFmt w:val="bullet"/>
-      <w:lvlText w:val="●"/>
+    <w:lvl w:ilvl="6" w:tplc="FD96F332">
+      <w:numFmt w:val="decimal"/>
+      <w:lvlText w:val=""/>
       <w:lvlJc w:val="left"/>
-      <w:pPr>
-        <w:ind w:left="5040" w:hanging="360"/>
-      </w:pPr>
     </w:lvl>
-    <w:lvl w:ilvl="7" w:tplc="77C2D3A6">
-      <w:start w:val="1"/>
-      <w:numFmt w:val="bullet"/>
-      <w:lvlText w:val="●"/>
+    <w:lvl w:ilvl="7" w:tplc="5DF638BA">
+      <w:numFmt w:val="decimal"/>
+      <w:lvlText w:val=""/>
       <w:lvlJc w:val="left"/>
-      <w:pPr>
-        <w:ind w:left="5760" w:hanging="360"/>
-      </w:pPr>
     </w:lvl>
-    <w:lvl w:ilvl="8" w:tplc="0B087C62">
-      <w:start w:val="1"/>
-      <w:numFmt w:val="bullet"/>
-      <w:lvlText w:val="●"/>
+    <w:lvl w:ilvl="8" w:tplc="AA308758">
+      <w:numFmt w:val="decimal"/>
+      <w:lvlText w:val=""/>
       <w:lvlJc w:val="left"/>
-      <w:pPr>
-        <w:ind w:left="6480" w:hanging="360"/>
-      </w:pPr>
     </w:lvl>
   </w:abstractNum>
-  <w:num w:numId="1" w16cid:durableId="1940062214">
+  <w:num w:numId="1" w16cid:durableId="683047502">
+    <w:abstractNumId w:val="0"/>
+    <w:lvlOverride w:ilvl="0">
+      <w:startOverride w:val="1"/>
+    </w:lvlOverride>
+  </w:num>
+  <w:num w:numId="2" w16cid:durableId="1025328805">
+    <w:abstractNumId w:val="2"/>
+    <w:lvlOverride w:ilvl="0">
+      <w:startOverride w:val="1"/>
+    </w:lvlOverride>
+  </w:num>
+  <w:num w:numId="3" w16cid:durableId="978073522">
     <w:abstractNumId w:val="3"/>
     <w:lvlOverride w:ilvl="0">
       <w:startOverride w:val="1"/>
     </w:lvlOverride>
   </w:num>
-  <w:num w:numId="2" w16cid:durableId="1658722242">
-    <w:abstractNumId w:val="0"/>
-    <w:lvlOverride w:ilvl="0">
-      <w:startOverride w:val="1"/>
-    </w:lvlOverride>
-  </w:num>
-  <w:num w:numId="3" w16cid:durableId="1290626799">
+  <w:num w:numId="4" w16cid:durableId="798763126">
     <w:abstractNumId w:val="1"/>
-    <w:lvlOverride w:ilvl="0">
-      <w:startOverride w:val="1"/>
-    </w:lvlOverride>
-  </w:num>
-  <w:num w:numId="4" w16cid:durableId="840311099">
-    <w:abstractNumId w:val="2"/>
     <w:lvlOverride w:ilvl="0">
       <w:startOverride w:val="1"/>
     </w:lvlOverride>
@@ -11384,7 +12460,7 @@
     <w:autoRedefine/>
     <w:uiPriority w:val="39"/>
     <w:unhideWhenUsed/>
-    <w:rsid w:val="005C6CB1"/>
+    <w:rsid w:val="00C80303"/>
     <w:pPr>
       <w:spacing w:after="100"/>
     </w:pPr>
@@ -11396,7 +12472,7 @@
     <w:autoRedefine/>
     <w:uiPriority w:val="39"/>
     <w:unhideWhenUsed/>
-    <w:rsid w:val="005C6CB1"/>
+    <w:rsid w:val="00C80303"/>
     <w:pPr>
       <w:spacing w:after="100"/>
       <w:ind w:left="210"/>

</xml_diff>

<commit_message>
Position for Amadeus NDC: fare rules and amenities given equal weight, GDS/Sabre/Travelport references removed
- Website, README, admin UI copy and Swagger description now speak only of Amadeus NDC
- Amenities moved next to fare-rules summary everywhere: playground tabs, prompt groups,
  usage charts, feature order, API reference, product guide
- Website: two-up showcase (summary + amenities), raw-vs-clean panels for both, four-step flow
</commit_message>
<xml_diff>
--- a/docs/FareLens.docx
+++ b/docs/FareLens.docx
@@ -17,7 +17,7 @@
           <w:noProof/>
         </w:rPr>
         <w:drawing>
-          <wp:inline distT="0" distB="0" distL="0" distR="0" wp14:anchorId="25B4B8CD" wp14:editId="21226751">
+          <wp:inline distT="0" distB="0" distL="0" distR="0" wp14:anchorId="5CC38955" wp14:editId="5478642F">
             <wp:extent cx="1905000" cy="266700"/>
             <wp:effectExtent l="0" t="0" r="0" b="0"/>
             <wp:docPr id="1" name="Picture 1"/>
@@ -83,7 +83,7 @@
           <w:sz w:val="32"/>
           <w:szCs w:val="32"/>
         </w:rPr>
-        <w:t>Airline fare rules, explained.</w:t>
+        <w:t>Amadeus NDC fare rules and amenities, explained.</w:t>
       </w:r>
     </w:p>
     <w:p>
@@ -97,7 +97,7 @@
           <w:sz w:val="22"/>
           <w:szCs w:val="22"/>
         </w:rPr>
-        <w:t>Self-hosted API + admin UI that turns raw airline fare-rules text into traveller-friendly summaries and answers questions about them — using the LLM provider you choose.</w:t>
+        <w:t>Self-hosted API + admin UI that turns the fare rules and fare-family amenities from Amadeus NDC responses into traveller-friendly summaries, amenity cards, friendly fare names and answers to traveller questions, using the LLM provider you choose.</w:t>
       </w:r>
     </w:p>
     <w:p>
@@ -180,7 +180,7 @@
     <w:sdt>
       <w:sdtPr>
         <w:alias w:val="Contents"/>
-        <w:id w:val="1037696846"/>
+        <w:id w:val="1576865652"/>
       </w:sdtPr>
       <w:sdtEndPr/>
       <w:sdtContent>
@@ -209,7 +209,7 @@
           <w:r>
             <w:fldChar w:fldCharType="separate"/>
           </w:r>
-          <w:hyperlink w:anchor="_Toc241913493" w:history="1">
+          <w:hyperlink w:anchor="_Toc241918369" w:history="1">
             <w:r>
               <w:rPr>
                 <w:rStyle w:val="Hyperlink"/>
@@ -233,7 +233,7 @@
               <w:rPr>
                 <w:noProof/>
               </w:rPr>
-              <w:instrText xml:space="preserve"> PAGEREF _Toc241913493 \h </w:instrText>
+              <w:instrText xml:space="preserve"> PAGEREF _Toc241918369 \h </w:instrText>
             </w:r>
             <w:r>
               <w:rPr>
@@ -276,7 +276,7 @@
               <w14:ligatures w14:val="standardContextual"/>
             </w:rPr>
           </w:pPr>
-          <w:hyperlink w:anchor="_Toc241913494" w:history="1">
+          <w:hyperlink w:anchor="_Toc241918370" w:history="1">
             <w:r>
               <w:rPr>
                 <w:rStyle w:val="Hyperlink"/>
@@ -300,7 +300,7 @@
               <w:rPr>
                 <w:noProof/>
               </w:rPr>
-              <w:instrText xml:space="preserve"> PAGEREF _Toc241913494 \h </w:instrText>
+              <w:instrText xml:space="preserve"> PAGEREF _Toc241918370 \h </w:instrText>
             </w:r>
             <w:r>
               <w:rPr>
@@ -343,7 +343,7 @@
               <w14:ligatures w14:val="standardContextual"/>
             </w:rPr>
           </w:pPr>
-          <w:hyperlink w:anchor="_Toc241913495" w:history="1">
+          <w:hyperlink w:anchor="_Toc241918371" w:history="1">
             <w:r>
               <w:rPr>
                 <w:rStyle w:val="Hyperlink"/>
@@ -367,7 +367,7 @@
               <w:rPr>
                 <w:noProof/>
               </w:rPr>
-              <w:instrText xml:space="preserve"> PAGEREF _Toc241913495 \h </w:instrText>
+              <w:instrText xml:space="preserve"> PAGEREF _Toc241918371 \h </w:instrText>
             </w:r>
             <w:r>
               <w:rPr>
@@ -410,7 +410,7 @@
               <w14:ligatures w14:val="standardContextual"/>
             </w:rPr>
           </w:pPr>
-          <w:hyperlink w:anchor="_Toc241913496" w:history="1">
+          <w:hyperlink w:anchor="_Toc241918372" w:history="1">
             <w:r>
               <w:rPr>
                 <w:rStyle w:val="Hyperlink"/>
@@ -434,7 +434,7 @@
               <w:rPr>
                 <w:noProof/>
               </w:rPr>
-              <w:instrText xml:space="preserve"> PAGEREF _Toc241913496 \h </w:instrText>
+              <w:instrText xml:space="preserve"> PAGEREF _Toc241918372 \h </w:instrText>
             </w:r>
             <w:r>
               <w:rPr>
@@ -477,7 +477,7 @@
               <w14:ligatures w14:val="standardContextual"/>
             </w:rPr>
           </w:pPr>
-          <w:hyperlink w:anchor="_Toc241913497" w:history="1">
+          <w:hyperlink w:anchor="_Toc241918373" w:history="1">
             <w:r>
               <w:rPr>
                 <w:rStyle w:val="Hyperlink"/>
@@ -501,7 +501,7 @@
               <w:rPr>
                 <w:noProof/>
               </w:rPr>
-              <w:instrText xml:space="preserve"> PAGEREF _Toc241913497 \h </w:instrText>
+              <w:instrText xml:space="preserve"> PAGEREF _Toc241918373 \h </w:instrText>
             </w:r>
             <w:r>
               <w:rPr>
@@ -544,7 +544,7 @@
               <w14:ligatures w14:val="standardContextual"/>
             </w:rPr>
           </w:pPr>
-          <w:hyperlink w:anchor="_Toc241913498" w:history="1">
+          <w:hyperlink w:anchor="_Toc241918374" w:history="1">
             <w:r>
               <w:rPr>
                 <w:rStyle w:val="Hyperlink"/>
@@ -568,7 +568,7 @@
               <w:rPr>
                 <w:noProof/>
               </w:rPr>
-              <w:instrText xml:space="preserve"> PAGEREF _Toc241913498 \h </w:instrText>
+              <w:instrText xml:space="preserve"> PAGEREF _Toc241918374 \h </w:instrText>
             </w:r>
             <w:r>
               <w:rPr>
@@ -611,7 +611,7 @@
               <w14:ligatures w14:val="standardContextual"/>
             </w:rPr>
           </w:pPr>
-          <w:hyperlink w:anchor="_Toc241913499" w:history="1">
+          <w:hyperlink w:anchor="_Toc241918375" w:history="1">
             <w:r>
               <w:rPr>
                 <w:rStyle w:val="Hyperlink"/>
@@ -635,7 +635,7 @@
               <w:rPr>
                 <w:noProof/>
               </w:rPr>
-              <w:instrText xml:space="preserve"> PAGEREF _Toc241913499 \h </w:instrText>
+              <w:instrText xml:space="preserve"> PAGEREF _Toc241918375 \h </w:instrText>
             </w:r>
             <w:r>
               <w:rPr>
@@ -678,7 +678,7 @@
               <w14:ligatures w14:val="standardContextual"/>
             </w:rPr>
           </w:pPr>
-          <w:hyperlink w:anchor="_Toc241913500" w:history="1">
+          <w:hyperlink w:anchor="_Toc241918376" w:history="1">
             <w:r>
               <w:rPr>
                 <w:rStyle w:val="Hyperlink"/>
@@ -702,7 +702,7 @@
               <w:rPr>
                 <w:noProof/>
               </w:rPr>
-              <w:instrText xml:space="preserve"> PAGEREF _Toc241913500 \h </w:instrText>
+              <w:instrText xml:space="preserve"> PAGEREF _Toc241918376 \h </w:instrText>
             </w:r>
             <w:r>
               <w:rPr>
@@ -745,7 +745,7 @@
               <w14:ligatures w14:val="standardContextual"/>
             </w:rPr>
           </w:pPr>
-          <w:hyperlink w:anchor="_Toc241913501" w:history="1">
+          <w:hyperlink w:anchor="_Toc241918377" w:history="1">
             <w:r>
               <w:rPr>
                 <w:rStyle w:val="Hyperlink"/>
@@ -769,7 +769,7 @@
               <w:rPr>
                 <w:noProof/>
               </w:rPr>
-              <w:instrText xml:space="preserve"> PAGEREF _Toc241913501 \h </w:instrText>
+              <w:instrText xml:space="preserve"> PAGEREF _Toc241918377 \h </w:instrText>
             </w:r>
             <w:r>
               <w:rPr>
@@ -812,7 +812,7 @@
               <w14:ligatures w14:val="standardContextual"/>
             </w:rPr>
           </w:pPr>
-          <w:hyperlink w:anchor="_Toc241913502" w:history="1">
+          <w:hyperlink w:anchor="_Toc241918378" w:history="1">
             <w:r>
               <w:rPr>
                 <w:rStyle w:val="Hyperlink"/>
@@ -836,7 +836,7 @@
               <w:rPr>
                 <w:noProof/>
               </w:rPr>
-              <w:instrText xml:space="preserve"> PAGEREF _Toc241913502 \h </w:instrText>
+              <w:instrText xml:space="preserve"> PAGEREF _Toc241918378 \h </w:instrText>
             </w:r>
             <w:r>
               <w:rPr>
@@ -879,7 +879,7 @@
               <w14:ligatures w14:val="standardContextual"/>
             </w:rPr>
           </w:pPr>
-          <w:hyperlink w:anchor="_Toc241913503" w:history="1">
+          <w:hyperlink w:anchor="_Toc241918379" w:history="1">
             <w:r>
               <w:rPr>
                 <w:rStyle w:val="Hyperlink"/>
@@ -903,7 +903,7 @@
               <w:rPr>
                 <w:noProof/>
               </w:rPr>
-              <w:instrText xml:space="preserve"> PAGEREF _Toc241913503 \h </w:instrText>
+              <w:instrText xml:space="preserve"> PAGEREF _Toc241918379 \h </w:instrText>
             </w:r>
             <w:r>
               <w:rPr>
@@ -946,7 +946,7 @@
               <w14:ligatures w14:val="standardContextual"/>
             </w:rPr>
           </w:pPr>
-          <w:hyperlink w:anchor="_Toc241913504" w:history="1">
+          <w:hyperlink w:anchor="_Toc241918380" w:history="1">
             <w:r>
               <w:rPr>
                 <w:rStyle w:val="Hyperlink"/>
@@ -970,7 +970,7 @@
               <w:rPr>
                 <w:noProof/>
               </w:rPr>
-              <w:instrText xml:space="preserve"> PAGEREF _Toc241913504 \h </w:instrText>
+              <w:instrText xml:space="preserve"> PAGEREF _Toc241918380 \h </w:instrText>
             </w:r>
             <w:r>
               <w:rPr>
@@ -1013,7 +1013,7 @@
               <w14:ligatures w14:val="standardContextual"/>
             </w:rPr>
           </w:pPr>
-          <w:hyperlink w:anchor="_Toc241913505" w:history="1">
+          <w:hyperlink w:anchor="_Toc241918381" w:history="1">
             <w:r>
               <w:rPr>
                 <w:rStyle w:val="Hyperlink"/>
@@ -1037,7 +1037,7 @@
               <w:rPr>
                 <w:noProof/>
               </w:rPr>
-              <w:instrText xml:space="preserve"> PAGEREF _Toc241913505 \h </w:instrText>
+              <w:instrText xml:space="preserve"> PAGEREF _Toc241918381 \h </w:instrText>
             </w:r>
             <w:r>
               <w:rPr>
@@ -1080,7 +1080,7 @@
               <w14:ligatures w14:val="standardContextual"/>
             </w:rPr>
           </w:pPr>
-          <w:hyperlink w:anchor="_Toc241913506" w:history="1">
+          <w:hyperlink w:anchor="_Toc241918382" w:history="1">
             <w:r>
               <w:rPr>
                 <w:rStyle w:val="Hyperlink"/>
@@ -1104,7 +1104,7 @@
               <w:rPr>
                 <w:noProof/>
               </w:rPr>
-              <w:instrText xml:space="preserve"> PAGEREF _Toc241913506 \h </w:instrText>
+              <w:instrText xml:space="preserve"> PAGEREF _Toc241918382 \h </w:instrText>
             </w:r>
             <w:r>
               <w:rPr>
@@ -1147,7 +1147,7 @@
               <w14:ligatures w14:val="standardContextual"/>
             </w:rPr>
           </w:pPr>
-          <w:hyperlink w:anchor="_Toc241913507" w:history="1">
+          <w:hyperlink w:anchor="_Toc241918383" w:history="1">
             <w:r>
               <w:rPr>
                 <w:rStyle w:val="Hyperlink"/>
@@ -1171,7 +1171,7 @@
               <w:rPr>
                 <w:noProof/>
               </w:rPr>
-              <w:instrText xml:space="preserve"> PAGEREF _Toc241913507 \h </w:instrText>
+              <w:instrText xml:space="preserve"> PAGEREF _Toc241918383 \h </w:instrText>
             </w:r>
             <w:r>
               <w:rPr>
@@ -1214,7 +1214,7 @@
               <w14:ligatures w14:val="standardContextual"/>
             </w:rPr>
           </w:pPr>
-          <w:hyperlink w:anchor="_Toc241913508" w:history="1">
+          <w:hyperlink w:anchor="_Toc241918384" w:history="1">
             <w:r>
               <w:rPr>
                 <w:rStyle w:val="Hyperlink"/>
@@ -1238,7 +1238,7 @@
               <w:rPr>
                 <w:noProof/>
               </w:rPr>
-              <w:instrText xml:space="preserve"> PAGEREF _Toc241913508 \h </w:instrText>
+              <w:instrText xml:space="preserve"> PAGEREF _Toc241918384 \h </w:instrText>
             </w:r>
             <w:r>
               <w:rPr>
@@ -1281,7 +1281,7 @@
               <w14:ligatures w14:val="standardContextual"/>
             </w:rPr>
           </w:pPr>
-          <w:hyperlink w:anchor="_Toc241913509" w:history="1">
+          <w:hyperlink w:anchor="_Toc241918385" w:history="1">
             <w:r>
               <w:rPr>
                 <w:rStyle w:val="Hyperlink"/>
@@ -1305,7 +1305,7 @@
               <w:rPr>
                 <w:noProof/>
               </w:rPr>
-              <w:instrText xml:space="preserve"> PAGEREF _Toc241913509 \h </w:instrText>
+              <w:instrText xml:space="preserve"> PAGEREF _Toc241918385 \h </w:instrText>
             </w:r>
             <w:r>
               <w:rPr>
@@ -1348,7 +1348,7 @@
               <w14:ligatures w14:val="standardContextual"/>
             </w:rPr>
           </w:pPr>
-          <w:hyperlink w:anchor="_Toc241913510" w:history="1">
+          <w:hyperlink w:anchor="_Toc241918386" w:history="1">
             <w:r>
               <w:rPr>
                 <w:rStyle w:val="Hyperlink"/>
@@ -1372,7 +1372,7 @@
               <w:rPr>
                 <w:noProof/>
               </w:rPr>
-              <w:instrText xml:space="preserve"> PAGEREF _Toc241913510 \h </w:instrText>
+              <w:instrText xml:space="preserve"> PAGEREF _Toc241918386 \h </w:instrText>
             </w:r>
             <w:r>
               <w:rPr>
@@ -1415,7 +1415,7 @@
               <w14:ligatures w14:val="standardContextual"/>
             </w:rPr>
           </w:pPr>
-          <w:hyperlink w:anchor="_Toc241913511" w:history="1">
+          <w:hyperlink w:anchor="_Toc241918387" w:history="1">
             <w:r>
               <w:rPr>
                 <w:rStyle w:val="Hyperlink"/>
@@ -1439,7 +1439,7 @@
               <w:rPr>
                 <w:noProof/>
               </w:rPr>
-              <w:instrText xml:space="preserve"> PAGEREF _Toc241913511 \h </w:instrText>
+              <w:instrText xml:space="preserve"> PAGEREF _Toc241918387 \h </w:instrText>
             </w:r>
             <w:r>
               <w:rPr>
@@ -1482,7 +1482,7 @@
               <w14:ligatures w14:val="standardContextual"/>
             </w:rPr>
           </w:pPr>
-          <w:hyperlink w:anchor="_Toc241913512" w:history="1">
+          <w:hyperlink w:anchor="_Toc241918388" w:history="1">
             <w:r>
               <w:rPr>
                 <w:rStyle w:val="Hyperlink"/>
@@ -1506,7 +1506,7 @@
               <w:rPr>
                 <w:noProof/>
               </w:rPr>
-              <w:instrText xml:space="preserve"> PAGEREF _Toc241913512 \h </w:instrText>
+              <w:instrText xml:space="preserve"> PAGEREF _Toc241918388 \h </w:instrText>
             </w:r>
             <w:r>
               <w:rPr>
@@ -1549,7 +1549,7 @@
               <w14:ligatures w14:val="standardContextual"/>
             </w:rPr>
           </w:pPr>
-          <w:hyperlink w:anchor="_Toc241913513" w:history="1">
+          <w:hyperlink w:anchor="_Toc241918389" w:history="1">
             <w:r>
               <w:rPr>
                 <w:rStyle w:val="Hyperlink"/>
@@ -1573,7 +1573,7 @@
               <w:rPr>
                 <w:noProof/>
               </w:rPr>
-              <w:instrText xml:space="preserve"> PAGEREF _Toc241913513 \h </w:instrText>
+              <w:instrText xml:space="preserve"> PAGEREF _Toc241918389 \h </w:instrText>
             </w:r>
             <w:r>
               <w:rPr>
@@ -1616,7 +1616,7 @@
               <w14:ligatures w14:val="standardContextual"/>
             </w:rPr>
           </w:pPr>
-          <w:hyperlink w:anchor="_Toc241913514" w:history="1">
+          <w:hyperlink w:anchor="_Toc241918390" w:history="1">
             <w:r>
               <w:rPr>
                 <w:rStyle w:val="Hyperlink"/>
@@ -1640,7 +1640,7 @@
               <w:rPr>
                 <w:noProof/>
               </w:rPr>
-              <w:instrText xml:space="preserve"> PAGEREF _Toc241913514 \h </w:instrText>
+              <w:instrText xml:space="preserve"> PAGEREF _Toc241918390 \h </w:instrText>
             </w:r>
             <w:r>
               <w:rPr>
@@ -1683,7 +1683,7 @@
               <w14:ligatures w14:val="standardContextual"/>
             </w:rPr>
           </w:pPr>
-          <w:hyperlink w:anchor="_Toc241913515" w:history="1">
+          <w:hyperlink w:anchor="_Toc241918391" w:history="1">
             <w:r>
               <w:rPr>
                 <w:rStyle w:val="Hyperlink"/>
@@ -1707,7 +1707,7 @@
               <w:rPr>
                 <w:noProof/>
               </w:rPr>
-              <w:instrText xml:space="preserve"> PAGEREF _Toc241913515 \h </w:instrText>
+              <w:instrText xml:space="preserve"> PAGEREF _Toc241918391 \h </w:instrText>
             </w:r>
             <w:r>
               <w:rPr>
@@ -1750,7 +1750,7 @@
               <w14:ligatures w14:val="standardContextual"/>
             </w:rPr>
           </w:pPr>
-          <w:hyperlink w:anchor="_Toc241913516" w:history="1">
+          <w:hyperlink w:anchor="_Toc241918392" w:history="1">
             <w:r>
               <w:rPr>
                 <w:rStyle w:val="Hyperlink"/>
@@ -1774,7 +1774,7 @@
               <w:rPr>
                 <w:noProof/>
               </w:rPr>
-              <w:instrText xml:space="preserve"> PAGEREF _Toc241913516 \h </w:instrText>
+              <w:instrText xml:space="preserve"> PAGEREF _Toc241918392 \h </w:instrText>
             </w:r>
             <w:r>
               <w:rPr>
@@ -1817,7 +1817,7 @@
               <w14:ligatures w14:val="standardContextual"/>
             </w:rPr>
           </w:pPr>
-          <w:hyperlink w:anchor="_Toc241913517" w:history="1">
+          <w:hyperlink w:anchor="_Toc241918393" w:history="1">
             <w:r>
               <w:rPr>
                 <w:rStyle w:val="Hyperlink"/>
@@ -1841,7 +1841,7 @@
               <w:rPr>
                 <w:noProof/>
               </w:rPr>
-              <w:instrText xml:space="preserve"> PAGEREF _Toc241913517 \h </w:instrText>
+              <w:instrText xml:space="preserve"> PAGEREF _Toc241918393 \h </w:instrText>
             </w:r>
             <w:r>
               <w:rPr>
@@ -1884,7 +1884,7 @@
               <w14:ligatures w14:val="standardContextual"/>
             </w:rPr>
           </w:pPr>
-          <w:hyperlink w:anchor="_Toc241913518" w:history="1">
+          <w:hyperlink w:anchor="_Toc241918394" w:history="1">
             <w:r>
               <w:rPr>
                 <w:rStyle w:val="Hyperlink"/>
@@ -1908,7 +1908,7 @@
               <w:rPr>
                 <w:noProof/>
               </w:rPr>
-              <w:instrText xml:space="preserve"> PAGEREF _Toc241913518 \h </w:instrText>
+              <w:instrText xml:space="preserve"> PAGEREF _Toc241918394 \h </w:instrText>
             </w:r>
             <w:r>
               <w:rPr>
@@ -1951,7 +1951,7 @@
               <w14:ligatures w14:val="standardContextual"/>
             </w:rPr>
           </w:pPr>
-          <w:hyperlink w:anchor="_Toc241913519" w:history="1">
+          <w:hyperlink w:anchor="_Toc241918395" w:history="1">
             <w:r>
               <w:rPr>
                 <w:rStyle w:val="Hyperlink"/>
@@ -1975,7 +1975,7 @@
               <w:rPr>
                 <w:noProof/>
               </w:rPr>
-              <w:instrText xml:space="preserve"> PAGEREF _Toc241913519 \h </w:instrText>
+              <w:instrText xml:space="preserve"> PAGEREF _Toc241918395 \h </w:instrText>
             </w:r>
             <w:r>
               <w:rPr>
@@ -2018,7 +2018,7 @@
               <w14:ligatures w14:val="standardContextual"/>
             </w:rPr>
           </w:pPr>
-          <w:hyperlink w:anchor="_Toc241913520" w:history="1">
+          <w:hyperlink w:anchor="_Toc241918396" w:history="1">
             <w:r>
               <w:rPr>
                 <w:rStyle w:val="Hyperlink"/>
@@ -2042,7 +2042,7 @@
               <w:rPr>
                 <w:noProof/>
               </w:rPr>
-              <w:instrText xml:space="preserve"> PAGEREF _Toc241913520 \h </w:instrText>
+              <w:instrText xml:space="preserve"> PAGEREF _Toc241918396 \h </w:instrText>
             </w:r>
             <w:r>
               <w:rPr>
@@ -2085,7 +2085,7 @@
               <w14:ligatures w14:val="standardContextual"/>
             </w:rPr>
           </w:pPr>
-          <w:hyperlink w:anchor="_Toc241913521" w:history="1">
+          <w:hyperlink w:anchor="_Toc241918397" w:history="1">
             <w:r>
               <w:rPr>
                 <w:rStyle w:val="Hyperlink"/>
@@ -2109,7 +2109,7 @@
               <w:rPr>
                 <w:noProof/>
               </w:rPr>
-              <w:instrText xml:space="preserve"> PAGEREF _Toc241913521 \h </w:instrText>
+              <w:instrText xml:space="preserve"> PAGEREF _Toc241918397 \h </w:instrText>
             </w:r>
             <w:r>
               <w:rPr>
@@ -2152,7 +2152,7 @@
               <w14:ligatures w14:val="standardContextual"/>
             </w:rPr>
           </w:pPr>
-          <w:hyperlink w:anchor="_Toc241913522" w:history="1">
+          <w:hyperlink w:anchor="_Toc241918398" w:history="1">
             <w:r>
               <w:rPr>
                 <w:rStyle w:val="Hyperlink"/>
@@ -2176,7 +2176,7 @@
               <w:rPr>
                 <w:noProof/>
               </w:rPr>
-              <w:instrText xml:space="preserve"> PAGEREF _Toc241913522 \h </w:instrText>
+              <w:instrText xml:space="preserve"> PAGEREF _Toc241918398 \h </w:instrText>
             </w:r>
             <w:r>
               <w:rPr>
@@ -2219,7 +2219,7 @@
               <w14:ligatures w14:val="standardContextual"/>
             </w:rPr>
           </w:pPr>
-          <w:hyperlink w:anchor="_Toc241913523" w:history="1">
+          <w:hyperlink w:anchor="_Toc241918399" w:history="1">
             <w:r>
               <w:rPr>
                 <w:rStyle w:val="Hyperlink"/>
@@ -2243,7 +2243,7 @@
               <w:rPr>
                 <w:noProof/>
               </w:rPr>
-              <w:instrText xml:space="preserve"> PAGEREF _Toc241913523 \h </w:instrText>
+              <w:instrText xml:space="preserve"> PAGEREF _Toc241918399 \h </w:instrText>
             </w:r>
             <w:r>
               <w:rPr>
@@ -2286,7 +2286,7 @@
               <w14:ligatures w14:val="standardContextual"/>
             </w:rPr>
           </w:pPr>
-          <w:hyperlink w:anchor="_Toc241913524" w:history="1">
+          <w:hyperlink w:anchor="_Toc241918400" w:history="1">
             <w:r>
               <w:rPr>
                 <w:rStyle w:val="Hyperlink"/>
@@ -2310,7 +2310,7 @@
               <w:rPr>
                 <w:noProof/>
               </w:rPr>
-              <w:instrText xml:space="preserve"> PAGEREF _Toc241913524 \h </w:instrText>
+              <w:instrText xml:space="preserve"> PAGEREF _Toc241918400 \h </w:instrText>
             </w:r>
             <w:r>
               <w:rPr>
@@ -2353,7 +2353,7 @@
               <w14:ligatures w14:val="standardContextual"/>
             </w:rPr>
           </w:pPr>
-          <w:hyperlink w:anchor="_Toc241913525" w:history="1">
+          <w:hyperlink w:anchor="_Toc241918401" w:history="1">
             <w:r>
               <w:rPr>
                 <w:rStyle w:val="Hyperlink"/>
@@ -2377,7 +2377,7 @@
               <w:rPr>
                 <w:noProof/>
               </w:rPr>
-              <w:instrText xml:space="preserve"> PAGEREF _Toc241913525 \h </w:instrText>
+              <w:instrText xml:space="preserve"> PAGEREF _Toc241918401 \h </w:instrText>
             </w:r>
             <w:r>
               <w:rPr>
@@ -2420,7 +2420,7 @@
               <w14:ligatures w14:val="standardContextual"/>
             </w:rPr>
           </w:pPr>
-          <w:hyperlink w:anchor="_Toc241913526" w:history="1">
+          <w:hyperlink w:anchor="_Toc241918402" w:history="1">
             <w:r>
               <w:rPr>
                 <w:rStyle w:val="Hyperlink"/>
@@ -2444,7 +2444,7 @@
               <w:rPr>
                 <w:noProof/>
               </w:rPr>
-              <w:instrText xml:space="preserve"> PAGEREF _Toc241913526 \h </w:instrText>
+              <w:instrText xml:space="preserve"> PAGEREF _Toc241918402 \h </w:instrText>
             </w:r>
             <w:r>
               <w:rPr>
@@ -2484,7 +2484,7 @@
         <w:keepNext/>
         <w:pageBreakBefore/>
       </w:pPr>
-      <w:bookmarkStart w:id="0" w:name="_Toc241913493"/>
+      <w:bookmarkStart w:id="0" w:name="_Toc241918369"/>
       <w:r>
         <w:lastRenderedPageBreak/>
         <w:t>1. Introduction</w:t>
@@ -2496,7 +2496,7 @@
         <w:pStyle w:val="Heading2"/>
         <w:keepNext/>
       </w:pPr>
-      <w:bookmarkStart w:id="1" w:name="_Toc241913494"/>
+      <w:bookmarkStart w:id="1" w:name="_Toc241918370"/>
       <w:r>
         <w:t>1.1 Why FareLens</w:t>
       </w:r>
@@ -2507,7 +2507,7 @@
         <w:spacing w:after="120"/>
       </w:pPr>
       <w:r>
-        <w:t>Airline fare rules are long, uppercase, telegraphic and full of ATPCO jargon (</w:t>
+        <w:t>Amadeus NDC fare rules are long, uppercase, telegraphic and full of ATPCO jargon (</w:t>
       </w:r>
       <w:r>
         <w:rPr>
@@ -2586,7 +2586,7 @@
         <w:keepNext/>
       </w:pPr>
       <w:r>
-        <w:t>The problem this solves for GDS / NDC integrators</w:t>
+        <w:t>The problem this solves for Amadeus NDC integrators</w:t>
       </w:r>
     </w:p>
     <w:p>
@@ -2594,7 +2594,7 @@
         <w:spacing w:after="120"/>
       </w:pPr>
       <w:r>
-        <w:t>If you consume airline content through a GDS (TravelSwitch runs on Amadeus), you will have hit this in NDC flows:</w:t>
+        <w:t>If you consume airline content through Amadeus NDC, you will have hit this:</w:t>
       </w:r>
     </w:p>
     <w:p>
@@ -2611,10 +2611,10 @@
           <w:b/>
           <w:bCs/>
         </w:rPr>
-        <w:t>Fare-family, price-class and fare-rule text is passed through exactly as the airline supplies it.</w:t>
-      </w:r>
-      <w:r>
-        <w:t xml:space="preserve"> The GDS does not generate a short version the way it does for EDIFACT.</w:t>
+        <w:t>Fare-family names, amenity lists and fare-rule text are passed through exactly as the airline supplies them.</w:t>
+      </w:r>
+      <w:r>
+        <w:t xml:space="preserve"> There is no Amadeus-generated short version the way there is for EDIFACT content.</w:t>
       </w:r>
     </w:p>
     <w:p>
@@ -2674,7 +2674,7 @@
         <w:t>This is by design.</w:t>
       </w:r>
       <w:r>
-        <w:t xml:space="preserve"> When raised with the GDS, the position is that the behaviour is compliant with the NDC standard, so the integrator has to solve it.</w:t>
+        <w:t xml:space="preserve"> When raised with Amadeus, the position is that the behaviour is compliant with the NDC standard, so the integrator has to solve it.</w:t>
       </w:r>
     </w:p>
     <w:p>
@@ -2690,7 +2690,7 @@
         <w:spacing w:after="120"/>
       </w:pPr>
       <w:r>
-        <w:t>It is content-source agnostic: Amadeus, Sabre, Travelport, direct-connect NDC or an airline API all produce the same clean output.</w:t>
+        <w:t>FareLens is that solution for both halves of the fare-family payload: the rules and the amenity list, plus friendly fare-family names.</w:t>
       </w:r>
     </w:p>
     <w:p>
@@ -2698,7 +2698,7 @@
         <w:pStyle w:val="Heading2"/>
         <w:keepNext/>
       </w:pPr>
-      <w:bookmarkStart w:id="2" w:name="_Toc241913495"/>
+      <w:bookmarkStart w:id="2" w:name="_Toc241918371"/>
       <w:r>
         <w:t>1.2 What you get</w:t>
       </w:r>
@@ -3327,7 +3327,7 @@
         <w:pStyle w:val="Heading2"/>
         <w:keepNext/>
       </w:pPr>
-      <w:bookmarkStart w:id="3" w:name="_Toc241913496"/>
+      <w:bookmarkStart w:id="3" w:name="_Toc241918372"/>
       <w:r>
         <w:lastRenderedPageBreak/>
         <w:t>1.3 The admin interface at a glance</w:t>
@@ -3345,10 +3345,10 @@
           <w:noProof/>
         </w:rPr>
         <w:drawing>
-          <wp:inline distT="0" distB="0" distL="0" distR="0" wp14:anchorId="3FE255E8" wp14:editId="69068A0F">
+          <wp:inline distT="0" distB="0" distL="0" distR="0" wp14:anchorId="29A844E7" wp14:editId="376825FD">
             <wp:extent cx="6400800" cy="4000500"/>
             <wp:effectExtent l="0" t="0" r="0" b="0"/>
-            <wp:docPr id="720778446" name="Picture 720778446"/>
+            <wp:docPr id="814982188" name="Picture 814982188"/>
             <wp:cNvGraphicFramePr>
               <a:graphicFrameLocks xmlns:a="http://schemas.openxmlformats.org/drawingml/2006/main" noChangeAspect="1"/>
             </wp:cNvGraphicFramePr>
@@ -3406,7 +3406,7 @@
         <w:keepNext/>
         <w:pageBreakBefore/>
       </w:pPr>
-      <w:bookmarkStart w:id="4" w:name="_Toc241913497"/>
+      <w:bookmarkStart w:id="4" w:name="_Toc241918373"/>
       <w:r>
         <w:lastRenderedPageBreak/>
         <w:t>2. Quick start</w:t>
@@ -3426,7 +3426,7 @@
         <w:pStyle w:val="Heading2"/>
         <w:keepNext/>
       </w:pPr>
-      <w:bookmarkStart w:id="5" w:name="_Toc241913498"/>
+      <w:bookmarkStart w:id="5" w:name="_Toc241918374"/>
       <w:r>
         <w:t>2.1 Run it</w:t>
       </w:r>
@@ -3531,7 +3531,7 @@
         <w:pStyle w:val="Heading2"/>
         <w:keepNext/>
       </w:pPr>
-      <w:bookmarkStart w:id="6" w:name="_Toc241913499"/>
+      <w:bookmarkStart w:id="6" w:name="_Toc241918375"/>
       <w:r>
         <w:t>2.2 Choose an LLM provider</w:t>
       </w:r>
@@ -3576,10 +3576,10 @@
           <w:noProof/>
         </w:rPr>
         <w:drawing>
-          <wp:inline distT="0" distB="0" distL="0" distR="0" wp14:anchorId="3AEB470D" wp14:editId="6F11A33F">
+          <wp:inline distT="0" distB="0" distL="0" distR="0" wp14:anchorId="31862D1C" wp14:editId="037D489E">
             <wp:extent cx="6400800" cy="4000500"/>
             <wp:effectExtent l="0" t="0" r="0" b="0"/>
-            <wp:docPr id="125765721" name="Picture 125765721"/>
+            <wp:docPr id="1930040239" name="Picture 1930040239"/>
             <wp:cNvGraphicFramePr>
               <a:graphicFrameLocks xmlns:a="http://schemas.openxmlformats.org/drawingml/2006/main" noChangeAspect="1"/>
             </wp:cNvGraphicFramePr>
@@ -3636,7 +3636,7 @@
         <w:pStyle w:val="Heading2"/>
         <w:keepNext/>
       </w:pPr>
-      <w:bookmarkStart w:id="7" w:name="_Toc241913500"/>
+      <w:bookmarkStart w:id="7" w:name="_Toc241918376"/>
       <w:r>
         <w:t>2.3 Create an API key</w:t>
       </w:r>
@@ -3662,10 +3662,10 @@
         </w:rPr>
         <w:lastRenderedPageBreak/>
         <w:drawing>
-          <wp:inline distT="0" distB="0" distL="0" distR="0" wp14:anchorId="12B0ACD0" wp14:editId="1EE26408">
+          <wp:inline distT="0" distB="0" distL="0" distR="0" wp14:anchorId="785786C6" wp14:editId="50DA4EAB">
             <wp:extent cx="6400800" cy="4000500"/>
             <wp:effectExtent l="0" t="0" r="0" b="0"/>
-            <wp:docPr id="1972657588" name="Picture 1972657588"/>
+            <wp:docPr id="137923603" name="Picture 137923603"/>
             <wp:cNvGraphicFramePr>
               <a:graphicFrameLocks xmlns:a="http://schemas.openxmlformats.org/drawingml/2006/main" noChangeAspect="1"/>
             </wp:cNvGraphicFramePr>
@@ -3722,7 +3722,7 @@
         <w:pStyle w:val="Heading2"/>
         <w:keepNext/>
       </w:pPr>
-      <w:bookmarkStart w:id="8" w:name="_Toc241913501"/>
+      <w:bookmarkStart w:id="8" w:name="_Toc241918377"/>
       <w:r>
         <w:t>2.4 Call the API</w:t>
       </w:r>
@@ -3816,7 +3816,7 @@
         <w:pStyle w:val="Heading2"/>
         <w:keepNext/>
       </w:pPr>
-      <w:bookmarkStart w:id="9" w:name="_Toc241913502"/>
+      <w:bookmarkStart w:id="9" w:name="_Toc241918378"/>
       <w:r>
         <w:t>2.5 Try it in the Playground</w:t>
       </w:r>
@@ -3842,10 +3842,10 @@
         </w:rPr>
         <w:lastRenderedPageBreak/>
         <w:drawing>
-          <wp:inline distT="0" distB="0" distL="0" distR="0" wp14:anchorId="6E2450C8" wp14:editId="023C0C9C">
+          <wp:inline distT="0" distB="0" distL="0" distR="0" wp14:anchorId="6208CFF5" wp14:editId="071EE20B">
             <wp:extent cx="6400800" cy="4000500"/>
             <wp:effectExtent l="0" t="0" r="0" b="0"/>
-            <wp:docPr id="995228162" name="Picture 995228162"/>
+            <wp:docPr id="1605656372" name="Picture 1605656372"/>
             <wp:cNvGraphicFramePr>
               <a:graphicFrameLocks xmlns:a="http://schemas.openxmlformats.org/drawingml/2006/main" noChangeAspect="1"/>
             </wp:cNvGraphicFramePr>
@@ -3908,10 +3908,10 @@
           <w:noProof/>
         </w:rPr>
         <w:drawing>
-          <wp:inline distT="0" distB="0" distL="0" distR="0" wp14:anchorId="54BC6B34" wp14:editId="5B697C03">
+          <wp:inline distT="0" distB="0" distL="0" distR="0" wp14:anchorId="46D27306" wp14:editId="12937B68">
             <wp:extent cx="6400800" cy="4000500"/>
             <wp:effectExtent l="0" t="0" r="0" b="0"/>
-            <wp:docPr id="1719000288" name="Picture 1719000288"/>
+            <wp:docPr id="829117773" name="Picture 829117773"/>
             <wp:cNvGraphicFramePr>
               <a:graphicFrameLocks xmlns:a="http://schemas.openxmlformats.org/drawingml/2006/main" noChangeAspect="1"/>
             </wp:cNvGraphicFramePr>
@@ -3968,7 +3968,7 @@
         <w:pStyle w:val="Heading2"/>
         <w:keepNext/>
       </w:pPr>
-      <w:bookmarkStart w:id="10" w:name="_Toc241913503"/>
+      <w:bookmarkStart w:id="10" w:name="_Toc241918379"/>
       <w:r>
         <w:lastRenderedPageBreak/>
         <w:t>2.6 Watch usage</w:t>
@@ -3994,10 +3994,10 @@
           <w:noProof/>
         </w:rPr>
         <w:drawing>
-          <wp:inline distT="0" distB="0" distL="0" distR="0" wp14:anchorId="78C772ED" wp14:editId="1690E742">
+          <wp:inline distT="0" distB="0" distL="0" distR="0" wp14:anchorId="3EF21089" wp14:editId="677123BF">
             <wp:extent cx="4648200" cy="7429500"/>
             <wp:effectExtent l="0" t="0" r="0" b="0"/>
-            <wp:docPr id="985089168" name="Picture 985089168"/>
+            <wp:docPr id="77828352" name="Picture 77828352"/>
             <wp:cNvGraphicFramePr>
               <a:graphicFrameLocks xmlns:a="http://schemas.openxmlformats.org/drawingml/2006/main" noChangeAspect="1"/>
             </wp:cNvGraphicFramePr>
@@ -4055,7 +4055,7 @@
         <w:keepNext/>
         <w:pageBreakBefore/>
       </w:pPr>
-      <w:bookmarkStart w:id="11" w:name="_Toc241913504"/>
+      <w:bookmarkStart w:id="11" w:name="_Toc241918380"/>
       <w:r>
         <w:lastRenderedPageBreak/>
         <w:t>3. API reference</w:t>
@@ -4067,7 +4067,7 @@
         <w:pStyle w:val="Heading2"/>
         <w:keepNext/>
       </w:pPr>
-      <w:bookmarkStart w:id="12" w:name="_Toc241913505"/>
+      <w:bookmarkStart w:id="12" w:name="_Toc241918381"/>
       <w:r>
         <w:t>3.1 Authentication and errors</w:t>
       </w:r>
@@ -4775,7 +4775,7 @@
         <w:pStyle w:val="Heading2"/>
         <w:keepNext/>
       </w:pPr>
-      <w:bookmarkStart w:id="13" w:name="_Toc241913506"/>
+      <w:bookmarkStart w:id="13" w:name="_Toc241918382"/>
       <w:r>
         <w:t>3.2 POST /api/v1/fare-rules/summary</w:t>
       </w:r>
@@ -5410,7 +5410,7 @@
         <w:pStyle w:val="Heading2"/>
         <w:keepNext/>
       </w:pPr>
-      <w:bookmarkStart w:id="14" w:name="_Toc241913507"/>
+      <w:bookmarkStart w:id="14" w:name="_Toc241918383"/>
       <w:r>
         <w:lastRenderedPageBreak/>
         <w:t>3.3 POST /api/v1/fare-rules/chat/stream</w:t>
@@ -5766,7 +5766,7 @@
         <w:pStyle w:val="Heading2"/>
         <w:keepNext/>
       </w:pPr>
-      <w:bookmarkStart w:id="15" w:name="_Toc241913508"/>
+      <w:bookmarkStart w:id="15" w:name="_Toc241918384"/>
       <w:r>
         <w:t>3.4 Other endpoints</w:t>
       </w:r>
@@ -6114,7 +6114,7 @@
         <w:pStyle w:val="Heading2"/>
         <w:keepNext/>
       </w:pPr>
-      <w:bookmarkStart w:id="16" w:name="_Toc241913509"/>
+      <w:bookmarkStart w:id="16" w:name="_Toc241918385"/>
       <w:r>
         <w:t>3.5 POST /api/v1/amenities/summary</w:t>
       </w:r>
@@ -6771,10 +6771,10 @@
         </w:rPr>
         <w:lastRenderedPageBreak/>
         <w:drawing>
-          <wp:inline distT="0" distB="0" distL="0" distR="0" wp14:anchorId="50049DE0" wp14:editId="5C297E7A">
+          <wp:inline distT="0" distB="0" distL="0" distR="0" wp14:anchorId="7A753744" wp14:editId="7DD62695">
             <wp:extent cx="6400800" cy="4000500"/>
             <wp:effectExtent l="0" t="0" r="0" b="0"/>
-            <wp:docPr id="243919041" name="Picture 243919041"/>
+            <wp:docPr id="2119467919" name="Picture 2119467919"/>
             <wp:cNvGraphicFramePr>
               <a:graphicFrameLocks xmlns:a="http://schemas.openxmlformats.org/drawingml/2006/main" noChangeAspect="1"/>
             </wp:cNvGraphicFramePr>
@@ -6831,7 +6831,7 @@
         <w:pStyle w:val="Heading2"/>
         <w:keepNext/>
       </w:pPr>
-      <w:bookmarkStart w:id="17" w:name="_Toc241913510"/>
+      <w:bookmarkStart w:id="17" w:name="_Toc241918386"/>
       <w:r>
         <w:t>3.6 POST /api/v1/amenities/fare-names</w:t>
       </w:r>
@@ -6892,10 +6892,10 @@
         </w:rPr>
         <w:lastRenderedPageBreak/>
         <w:drawing>
-          <wp:inline distT="0" distB="0" distL="0" distR="0" wp14:anchorId="3EE601EF" wp14:editId="18E51215">
+          <wp:inline distT="0" distB="0" distL="0" distR="0" wp14:anchorId="1B931E23" wp14:editId="75F7EFDD">
             <wp:extent cx="6400800" cy="4000500"/>
             <wp:effectExtent l="0" t="0" r="0" b="0"/>
-            <wp:docPr id="1360336797" name="Picture 1360336797"/>
+            <wp:docPr id="1123450796" name="Picture 1123450796"/>
             <wp:cNvGraphicFramePr>
               <a:graphicFrameLocks xmlns:a="http://schemas.openxmlformats.org/drawingml/2006/main" noChangeAspect="1"/>
             </wp:cNvGraphicFramePr>
@@ -6952,7 +6952,7 @@
         <w:pStyle w:val="Heading2"/>
         <w:keepNext/>
       </w:pPr>
-      <w:bookmarkStart w:id="18" w:name="_Toc241913511"/>
+      <w:bookmarkStart w:id="18" w:name="_Toc241918387"/>
       <w:r>
         <w:t>3.7 Interactive documentation (Swagger UI)</w:t>
       </w:r>
@@ -7017,10 +7017,10 @@
         </w:rPr>
         <w:lastRenderedPageBreak/>
         <w:drawing>
-          <wp:inline distT="0" distB="0" distL="0" distR="0" wp14:anchorId="26F36475" wp14:editId="62619227">
+          <wp:inline distT="0" distB="0" distL="0" distR="0" wp14:anchorId="43B9F89B" wp14:editId="50832DF2">
             <wp:extent cx="6400800" cy="7229475"/>
             <wp:effectExtent l="0" t="0" r="0" b="0"/>
-            <wp:docPr id="1533665588" name="Picture 1533665588"/>
+            <wp:docPr id="119085353" name="Picture 119085353"/>
             <wp:cNvGraphicFramePr>
               <a:graphicFrameLocks xmlns:a="http://schemas.openxmlformats.org/drawingml/2006/main" noChangeAspect="1"/>
             </wp:cNvGraphicFramePr>
@@ -7084,10 +7084,10 @@
         </w:rPr>
         <w:lastRenderedPageBreak/>
         <w:drawing>
-          <wp:inline distT="0" distB="0" distL="0" distR="0" wp14:anchorId="5430BE1B" wp14:editId="6CF9E6C6">
+          <wp:inline distT="0" distB="0" distL="0" distR="0" wp14:anchorId="53867C5F" wp14:editId="695E3215">
             <wp:extent cx="3886200" cy="7429500"/>
             <wp:effectExtent l="0" t="0" r="0" b="0"/>
-            <wp:docPr id="968320092" name="Picture 968320092"/>
+            <wp:docPr id="2118858544" name="Picture 2118858544"/>
             <wp:cNvGraphicFramePr>
               <a:graphicFrameLocks xmlns:a="http://schemas.openxmlformats.org/drawingml/2006/main" noChangeAspect="1"/>
             </wp:cNvGraphicFramePr>
@@ -7145,7 +7145,7 @@
         <w:keepNext/>
         <w:pageBreakBefore/>
       </w:pPr>
-      <w:bookmarkStart w:id="19" w:name="_Toc241913512"/>
+      <w:bookmarkStart w:id="19" w:name="_Toc241918388"/>
       <w:r>
         <w:lastRenderedPageBreak/>
         <w:t>4. Configuration</w:t>
@@ -7191,7 +7191,7 @@
         <w:pStyle w:val="Heading2"/>
         <w:keepNext/>
       </w:pPr>
-      <w:bookmarkStart w:id="20" w:name="_Toc241913513"/>
+      <w:bookmarkStart w:id="20" w:name="_Toc241918389"/>
       <w:r>
         <w:t>4.1 Environment variables</w:t>
       </w:r>
@@ -8432,7 +8432,7 @@
         <w:pStyle w:val="Heading2"/>
         <w:keepNext/>
       </w:pPr>
-      <w:bookmarkStart w:id="21" w:name="_Toc241913514"/>
+      <w:bookmarkStart w:id="21" w:name="_Toc241918390"/>
       <w:r>
         <w:t>4.2 LLM providers</w:t>
       </w:r>
@@ -9093,7 +9093,7 @@
         <w:pStyle w:val="Heading2"/>
         <w:keepNext/>
       </w:pPr>
-      <w:bookmarkStart w:id="22" w:name="_Toc241913515"/>
+      <w:bookmarkStart w:id="22" w:name="_Toc241918391"/>
       <w:r>
         <w:lastRenderedPageBreak/>
         <w:t>4.3 Using your own Postgres / Redis</w:t>
@@ -9129,10 +9129,10 @@
           <w:noProof/>
         </w:rPr>
         <w:drawing>
-          <wp:inline distT="0" distB="0" distL="0" distR="0" wp14:anchorId="4A173962" wp14:editId="78013D63">
+          <wp:inline distT="0" distB="0" distL="0" distR="0" wp14:anchorId="5DB44D35" wp14:editId="6902D493">
             <wp:extent cx="6400800" cy="4000500"/>
             <wp:effectExtent l="0" t="0" r="0" b="0"/>
-            <wp:docPr id="1854707394" name="Picture 1854707394"/>
+            <wp:docPr id="2122846218" name="Picture 2122846218"/>
             <wp:cNvGraphicFramePr>
               <a:graphicFrameLocks xmlns:a="http://schemas.openxmlformats.org/drawingml/2006/main" noChangeAspect="1"/>
             </wp:cNvGraphicFramePr>
@@ -9189,7 +9189,7 @@
         <w:pStyle w:val="Heading2"/>
         <w:keepNext/>
       </w:pPr>
-      <w:bookmarkStart w:id="23" w:name="_Toc241913516"/>
+      <w:bookmarkStart w:id="23" w:name="_Toc241918392"/>
       <w:r>
         <w:t>4.4 Prompts</w:t>
       </w:r>
@@ -9225,10 +9225,10 @@
         </w:rPr>
         <w:lastRenderedPageBreak/>
         <w:drawing>
-          <wp:inline distT="0" distB="0" distL="0" distR="0" wp14:anchorId="629D0888" wp14:editId="3D5D3621">
+          <wp:inline distT="0" distB="0" distL="0" distR="0" wp14:anchorId="2CA201F1" wp14:editId="5E313BA9">
             <wp:extent cx="6400800" cy="4000500"/>
             <wp:effectExtent l="0" t="0" r="0" b="0"/>
-            <wp:docPr id="1828275227" name="Picture 1828275227"/>
+            <wp:docPr id="1485963577" name="Picture 1485963577"/>
             <wp:cNvGraphicFramePr>
               <a:graphicFrameLocks xmlns:a="http://schemas.openxmlformats.org/drawingml/2006/main" noChangeAspect="1"/>
             </wp:cNvGraphicFramePr>
@@ -9359,7 +9359,7 @@
         <w:keepNext/>
         <w:pageBreakBefore/>
       </w:pPr>
-      <w:bookmarkStart w:id="24" w:name="_Toc241913517"/>
+      <w:bookmarkStart w:id="24" w:name="_Toc241918393"/>
       <w:r>
         <w:lastRenderedPageBreak/>
         <w:t>5. Architecture</w:t>
@@ -9371,7 +9371,7 @@
         <w:pStyle w:val="Heading2"/>
         <w:keepNext/>
       </w:pPr>
-      <w:bookmarkStart w:id="25" w:name="_Toc241913518"/>
+      <w:bookmarkStart w:id="25" w:name="_Toc241918394"/>
       <w:r>
         <w:t>5.1 Request flow</w:t>
       </w:r>
@@ -9494,7 +9494,7 @@
         <w:pStyle w:val="Heading2"/>
         <w:keepNext/>
       </w:pPr>
-      <w:bookmarkStart w:id="26" w:name="_Toc241913519"/>
+      <w:bookmarkStart w:id="26" w:name="_Toc241918395"/>
       <w:r>
         <w:t>5.2 Code layout</w:t>
       </w:r>
@@ -9660,7 +9660,7 @@
         <w:pStyle w:val="Heading2"/>
         <w:keepNext/>
       </w:pPr>
-      <w:bookmarkStart w:id="27" w:name="_Toc241913520"/>
+      <w:bookmarkStart w:id="27" w:name="_Toc241918396"/>
       <w:r>
         <w:t>5.3 Technology</w:t>
       </w:r>
@@ -10056,7 +10056,7 @@
         <w:keepNext/>
         <w:pageBreakBefore/>
       </w:pPr>
-      <w:bookmarkStart w:id="28" w:name="_Toc241913521"/>
+      <w:bookmarkStart w:id="28" w:name="_Toc241918397"/>
       <w:r>
         <w:lastRenderedPageBreak/>
         <w:t>6. Deployment</w:t>
@@ -10068,7 +10068,7 @@
         <w:pStyle w:val="Heading2"/>
         <w:keepNext/>
       </w:pPr>
-      <w:bookmarkStart w:id="29" w:name="_Toc241913522"/>
+      <w:bookmarkStart w:id="29" w:name="_Toc241918398"/>
       <w:r>
         <w:t>6.1 Production checklist</w:t>
       </w:r>
@@ -10196,7 +10196,7 @@
         <w:pStyle w:val="Heading2"/>
         <w:keepNext/>
       </w:pPr>
-      <w:bookmarkStart w:id="30" w:name="_Toc241913523"/>
+      <w:bookmarkStart w:id="30" w:name="_Toc241918399"/>
       <w:r>
         <w:t>6.2 Reverse proxy</w:t>
       </w:r>
@@ -10378,7 +10378,7 @@
         <w:pStyle w:val="Heading2"/>
         <w:keepNext/>
       </w:pPr>
-      <w:bookmarkStart w:id="31" w:name="_Toc241913524"/>
+      <w:bookmarkStart w:id="31" w:name="_Toc241918400"/>
       <w:r>
         <w:t>6.3 Scaling, persistence and upgrades</w:t>
       </w:r>
@@ -10519,7 +10519,7 @@
         <w:pStyle w:val="Heading2"/>
         <w:keepNext/>
       </w:pPr>
-      <w:bookmarkStart w:id="32" w:name="_Toc241913525"/>
+      <w:bookmarkStart w:id="32" w:name="_Toc241918401"/>
       <w:r>
         <w:lastRenderedPageBreak/>
         <w:t>6.4 What FareLens stores</w:t>
@@ -11271,7 +11271,7 @@
         <w:keepNext/>
         <w:pageBreakBefore/>
       </w:pPr>
-      <w:bookmarkStart w:id="33" w:name="_Toc241913526"/>
+      <w:bookmarkStart w:id="33" w:name="_Toc241918402"/>
       <w:r>
         <w:lastRenderedPageBreak/>
         <w:t>7. Contributing, credits and license</w:t>
@@ -11574,10 +11574,10 @@
 <file path=word/numbering.xml><?xml version="1.0" encoding="utf-8"?>
 <w:numbering xmlns:wpc="http://schemas.microsoft.com/office/word/2010/wordprocessingCanvas" xmlns:cx="http://schemas.microsoft.com/office/drawing/2014/chartex" xmlns:cx1="http://schemas.microsoft.com/office/drawing/2015/9/8/chartex" xmlns:cx2="http://schemas.microsoft.com/office/drawing/2015/10/21/chartex" xmlns:cx3="http://schemas.microsoft.com/office/drawing/2016/5/9/chartex" xmlns:cx4="http://schemas.microsoft.com/office/drawing/2016/5/10/chartex" xmlns:cx5="http://schemas.microsoft.com/office/drawing/2016/5/11/chartex" xmlns:cx6="http://schemas.microsoft.com/office/drawing/2016/5/12/chartex" xmlns:cx7="http://schemas.microsoft.com/office/drawing/2016/5/13/chartex" xmlns:cx8="http://schemas.microsoft.com/office/drawing/2016/5/14/chartex" xmlns:mc="http://schemas.openxmlformats.org/markup-compatibility/2006" xmlns:aink="http://schemas.microsoft.com/office/drawing/2016/ink" xmlns:am3d="http://schemas.microsoft.com/office/drawing/2017/model3d" xmlns:o="urn:schemas-microsoft-com:office:office" xmlns:oel="http://schemas.microsoft.com/office/2019/extlst" xmlns:r="http://schemas.openxmlformats.org/officeDocument/2006/relationships" xmlns:m="http://schemas.openxmlformats.org/officeDocument/2006/math" xmlns:v="urn:schemas-microsoft-com:vml" xmlns:wp14="http://schemas.microsoft.com/office/word/2010/wordprocessingDrawing" xmlns:wp="http://schemas.openxmlformats.org/drawingml/2006/wordprocessingDrawing" xmlns:w10="urn:schemas-microsoft-com:office:word" xmlns:w="http://schemas.openxmlformats.org/wordprocessingml/2006/main" xmlns:w14="http://schemas.microsoft.com/office/word/2010/wordml" xmlns:w15="http://schemas.microsoft.com/office/word/2012/wordml" xmlns:w16cex="http://schemas.microsoft.com/office/word/2018/wordml/cex" xmlns:w16cid="http://schemas.microsoft.com/office/word/2016/wordml/cid" xmlns:w16="http://schemas.microsoft.com/office/word/2018/wordml" xmlns:w16du="http://schemas.microsoft.com/office/word/2023/wordml/word16du" xmlns:w16sdtdh="http://schemas.microsoft.com/office/word/2020/wordml/sdtdatahash" xmlns:w16sdtfl="http://schemas.microsoft.com/office/word/2024/wordml/sdtformatlock" xmlns:w16se="http://schemas.microsoft.com/office/word/2015/wordml/symex" xmlns:wpg="http://schemas.microsoft.com/office/word/2010/wordprocessingGroup" xmlns:wpi="http://schemas.microsoft.com/office/word/2010/wordprocessingInk" xmlns:wne="http://schemas.microsoft.com/office/word/2006/wordml" xmlns:wps="http://schemas.microsoft.com/office/word/2010/wordprocessingShape" mc:Ignorable="w14 w15 w16se w16cid w16 w16cex w16sdtdh w16sdtfl w16du wp14">
   <w:abstractNum w:abstractNumId="0" w15:restartNumberingAfterBreak="0">
-    <w:nsid w:val="28C7117E"/>
+    <w:nsid w:val="3C071659"/>
     <w:multiLevelType w:val="hybridMultilevel"/>
-    <w:tmpl w:val="EF02E978"/>
-    <w:lvl w:ilvl="0" w:tplc="5A62DE02">
+    <w:tmpl w:val="D79E63C8"/>
+    <w:lvl w:ilvl="0" w:tplc="79BC9E08">
       <w:start w:val="1"/>
       <w:numFmt w:val="bullet"/>
       <w:lvlText w:val="●"/>
@@ -11586,7 +11586,7 @@
         <w:ind w:left="720" w:hanging="360"/>
       </w:pPr>
     </w:lvl>
-    <w:lvl w:ilvl="1" w:tplc="A7C0F58A">
+    <w:lvl w:ilvl="1" w:tplc="0C660BBA">
       <w:start w:val="1"/>
       <w:numFmt w:val="bullet"/>
       <w:lvlText w:val="○"/>
@@ -11595,7 +11595,7 @@
         <w:ind w:left="1440" w:hanging="360"/>
       </w:pPr>
     </w:lvl>
-    <w:lvl w:ilvl="2" w:tplc="54582E3C">
+    <w:lvl w:ilvl="2" w:tplc="59A43F2A">
       <w:start w:val="1"/>
       <w:numFmt w:val="bullet"/>
       <w:lvlText w:val="■"/>
@@ -11604,7 +11604,7 @@
         <w:ind w:left="2160" w:hanging="360"/>
       </w:pPr>
     </w:lvl>
-    <w:lvl w:ilvl="3" w:tplc="17E643A4">
+    <w:lvl w:ilvl="3" w:tplc="A160703E">
       <w:start w:val="1"/>
       <w:numFmt w:val="bullet"/>
       <w:lvlText w:val="●"/>
@@ -11613,7 +11613,7 @@
         <w:ind w:left="2880" w:hanging="360"/>
       </w:pPr>
     </w:lvl>
-    <w:lvl w:ilvl="4" w:tplc="5A40E350">
+    <w:lvl w:ilvl="4" w:tplc="9506B670">
       <w:start w:val="1"/>
       <w:numFmt w:val="bullet"/>
       <w:lvlText w:val="○"/>
@@ -11622,7 +11622,7 @@
         <w:ind w:left="3600" w:hanging="360"/>
       </w:pPr>
     </w:lvl>
-    <w:lvl w:ilvl="5" w:tplc="1402D02A">
+    <w:lvl w:ilvl="5" w:tplc="992E0C32">
       <w:start w:val="1"/>
       <w:numFmt w:val="bullet"/>
       <w:lvlText w:val="■"/>
@@ -11631,7 +11631,7 @@
         <w:ind w:left="4320" w:hanging="360"/>
       </w:pPr>
     </w:lvl>
-    <w:lvl w:ilvl="6" w:tplc="70C6FD94">
+    <w:lvl w:ilvl="6" w:tplc="35A44466">
       <w:start w:val="1"/>
       <w:numFmt w:val="bullet"/>
       <w:lvlText w:val="●"/>
@@ -11640,7 +11640,7 @@
         <w:ind w:left="5040" w:hanging="360"/>
       </w:pPr>
     </w:lvl>
-    <w:lvl w:ilvl="7" w:tplc="D22A566C">
+    <w:lvl w:ilvl="7" w:tplc="8B98A9F6">
       <w:start w:val="1"/>
       <w:numFmt w:val="bullet"/>
       <w:lvlText w:val="●"/>
@@ -11649,7 +11649,7 @@
         <w:ind w:left="5760" w:hanging="360"/>
       </w:pPr>
     </w:lvl>
-    <w:lvl w:ilvl="8" w:tplc="C4208E9A">
+    <w:lvl w:ilvl="8" w:tplc="CA7C7084">
       <w:start w:val="1"/>
       <w:numFmt w:val="bullet"/>
       <w:lvlText w:val="●"/>
@@ -11660,10 +11660,10 @@
     </w:lvl>
   </w:abstractNum>
   <w:abstractNum w:abstractNumId="1" w15:restartNumberingAfterBreak="0">
-    <w:nsid w:val="380E39F8"/>
+    <w:nsid w:val="41D706F7"/>
     <w:multiLevelType w:val="hybridMultilevel"/>
-    <w:tmpl w:val="19B8EAD0"/>
-    <w:lvl w:ilvl="0" w:tplc="C0169422">
+    <w:tmpl w:val="D0B6786E"/>
+    <w:lvl w:ilvl="0" w:tplc="7A36D116">
       <w:start w:val="1"/>
       <w:numFmt w:val="bullet"/>
       <w:lvlText w:val="☐"/>
@@ -11672,174 +11672,174 @@
         <w:ind w:left="540" w:hanging="320"/>
       </w:pPr>
     </w:lvl>
-    <w:lvl w:ilvl="1" w:tplc="6832C986">
+    <w:lvl w:ilvl="1" w:tplc="CA9EC15A">
       <w:numFmt w:val="decimal"/>
       <w:lvlText w:val=""/>
       <w:lvlJc w:val="left"/>
     </w:lvl>
-    <w:lvl w:ilvl="2" w:tplc="D24AE83E">
+    <w:lvl w:ilvl="2" w:tplc="460E1366">
       <w:numFmt w:val="decimal"/>
       <w:lvlText w:val=""/>
       <w:lvlJc w:val="left"/>
     </w:lvl>
-    <w:lvl w:ilvl="3" w:tplc="34A628DC">
+    <w:lvl w:ilvl="3" w:tplc="A22CF70E">
       <w:numFmt w:val="decimal"/>
       <w:lvlText w:val=""/>
       <w:lvlJc w:val="left"/>
     </w:lvl>
-    <w:lvl w:ilvl="4" w:tplc="D158B16E">
+    <w:lvl w:ilvl="4" w:tplc="562ADF6C">
       <w:numFmt w:val="decimal"/>
       <w:lvlText w:val=""/>
       <w:lvlJc w:val="left"/>
     </w:lvl>
-    <w:lvl w:ilvl="5" w:tplc="63866A8E">
+    <w:lvl w:ilvl="5" w:tplc="E21CC672">
       <w:numFmt w:val="decimal"/>
       <w:lvlText w:val=""/>
       <w:lvlJc w:val="left"/>
     </w:lvl>
-    <w:lvl w:ilvl="6" w:tplc="25CE9BDC">
+    <w:lvl w:ilvl="6" w:tplc="8F1EDA0A">
       <w:numFmt w:val="decimal"/>
       <w:lvlText w:val=""/>
       <w:lvlJc w:val="left"/>
     </w:lvl>
-    <w:lvl w:ilvl="7" w:tplc="D270D2C2">
+    <w:lvl w:ilvl="7" w:tplc="4820556A">
       <w:numFmt w:val="decimal"/>
       <w:lvlText w:val=""/>
       <w:lvlJc w:val="left"/>
     </w:lvl>
-    <w:lvl w:ilvl="8" w:tplc="E5384C0E">
+    <w:lvl w:ilvl="8" w:tplc="23D04A58">
       <w:numFmt w:val="decimal"/>
       <w:lvlText w:val=""/>
       <w:lvlJc w:val="left"/>
     </w:lvl>
   </w:abstractNum>
   <w:abstractNum w:abstractNumId="2" w15:restartNumberingAfterBreak="0">
-    <w:nsid w:val="6EC37EB8"/>
+    <w:nsid w:val="449E247C"/>
     <w:multiLevelType w:val="hybridMultilevel"/>
-    <w:tmpl w:val="3B00D578"/>
-    <w:lvl w:ilvl="0" w:tplc="1508208E">
+    <w:tmpl w:val="A03C8B36"/>
+    <w:lvl w:ilvl="0" w:tplc="17F807C6">
       <w:start w:val="1"/>
-      <w:numFmt w:val="bullet"/>
-      <w:lvlText w:val="•"/>
+      <w:numFmt w:val="decimal"/>
+      <w:lvlText w:val="%1."/>
       <w:lvlJc w:val="left"/>
       <w:pPr>
-        <w:ind w:left="540" w:hanging="270"/>
+        <w:ind w:left="540" w:hanging="360"/>
       </w:pPr>
     </w:lvl>
-    <w:lvl w:ilvl="1" w:tplc="2D162B2E">
+    <w:lvl w:ilvl="1" w:tplc="8822EA02">
       <w:numFmt w:val="decimal"/>
       <w:lvlText w:val=""/>
       <w:lvlJc w:val="left"/>
     </w:lvl>
-    <w:lvl w:ilvl="2" w:tplc="E020C736">
+    <w:lvl w:ilvl="2" w:tplc="CFA47FFE">
       <w:numFmt w:val="decimal"/>
       <w:lvlText w:val=""/>
       <w:lvlJc w:val="left"/>
     </w:lvl>
-    <w:lvl w:ilvl="3" w:tplc="05F295F4">
+    <w:lvl w:ilvl="3" w:tplc="CB6A2E26">
       <w:numFmt w:val="decimal"/>
       <w:lvlText w:val=""/>
       <w:lvlJc w:val="left"/>
     </w:lvl>
-    <w:lvl w:ilvl="4" w:tplc="2414A052">
+    <w:lvl w:ilvl="4" w:tplc="EC9A522E">
       <w:numFmt w:val="decimal"/>
       <w:lvlText w:val=""/>
       <w:lvlJc w:val="left"/>
     </w:lvl>
-    <w:lvl w:ilvl="5" w:tplc="D0969BD8">
+    <w:lvl w:ilvl="5" w:tplc="10E0C17A">
       <w:numFmt w:val="decimal"/>
       <w:lvlText w:val=""/>
       <w:lvlJc w:val="left"/>
     </w:lvl>
-    <w:lvl w:ilvl="6" w:tplc="349A7436">
+    <w:lvl w:ilvl="6" w:tplc="FF7CD0CE">
       <w:numFmt w:val="decimal"/>
       <w:lvlText w:val=""/>
       <w:lvlJc w:val="left"/>
     </w:lvl>
-    <w:lvl w:ilvl="7" w:tplc="DC0A1930">
+    <w:lvl w:ilvl="7" w:tplc="E5CC3F10">
       <w:numFmt w:val="decimal"/>
       <w:lvlText w:val=""/>
       <w:lvlJc w:val="left"/>
     </w:lvl>
-    <w:lvl w:ilvl="8" w:tplc="C7BE7CC4">
+    <w:lvl w:ilvl="8" w:tplc="981AA3EA">
       <w:numFmt w:val="decimal"/>
       <w:lvlText w:val=""/>
       <w:lvlJc w:val="left"/>
     </w:lvl>
   </w:abstractNum>
   <w:abstractNum w:abstractNumId="3" w15:restartNumberingAfterBreak="0">
-    <w:nsid w:val="7D1723BA"/>
+    <w:nsid w:val="6470608E"/>
     <w:multiLevelType w:val="hybridMultilevel"/>
-    <w:tmpl w:val="93082970"/>
-    <w:lvl w:ilvl="0" w:tplc="F22E9A12">
+    <w:tmpl w:val="D16243E8"/>
+    <w:lvl w:ilvl="0" w:tplc="7B2E29BE">
       <w:start w:val="1"/>
-      <w:numFmt w:val="decimal"/>
-      <w:lvlText w:val="%1."/>
+      <w:numFmt w:val="bullet"/>
+      <w:lvlText w:val="•"/>
       <w:lvlJc w:val="left"/>
       <w:pPr>
-        <w:ind w:left="540" w:hanging="360"/>
+        <w:ind w:left="540" w:hanging="270"/>
       </w:pPr>
     </w:lvl>
-    <w:lvl w:ilvl="1" w:tplc="3860034A">
+    <w:lvl w:ilvl="1" w:tplc="A7AE2834">
       <w:numFmt w:val="decimal"/>
       <w:lvlText w:val=""/>
       <w:lvlJc w:val="left"/>
     </w:lvl>
-    <w:lvl w:ilvl="2" w:tplc="9A60ED42">
+    <w:lvl w:ilvl="2" w:tplc="CE5A0E68">
       <w:numFmt w:val="decimal"/>
       <w:lvlText w:val=""/>
       <w:lvlJc w:val="left"/>
     </w:lvl>
-    <w:lvl w:ilvl="3" w:tplc="BB0E8744">
+    <w:lvl w:ilvl="3" w:tplc="0F9878F6">
       <w:numFmt w:val="decimal"/>
       <w:lvlText w:val=""/>
       <w:lvlJc w:val="left"/>
     </w:lvl>
-    <w:lvl w:ilvl="4" w:tplc="DCD8066A">
+    <w:lvl w:ilvl="4" w:tplc="E49A9AD6">
       <w:numFmt w:val="decimal"/>
       <w:lvlText w:val=""/>
       <w:lvlJc w:val="left"/>
     </w:lvl>
-    <w:lvl w:ilvl="5" w:tplc="88FA445C">
+    <w:lvl w:ilvl="5" w:tplc="AB24F30A">
       <w:numFmt w:val="decimal"/>
       <w:lvlText w:val=""/>
       <w:lvlJc w:val="left"/>
     </w:lvl>
-    <w:lvl w:ilvl="6" w:tplc="FD96F332">
+    <w:lvl w:ilvl="6" w:tplc="6BF27AF0">
       <w:numFmt w:val="decimal"/>
       <w:lvlText w:val=""/>
       <w:lvlJc w:val="left"/>
     </w:lvl>
-    <w:lvl w:ilvl="7" w:tplc="5DF638BA">
+    <w:lvl w:ilvl="7" w:tplc="A9FE021A">
       <w:numFmt w:val="decimal"/>
       <w:lvlText w:val=""/>
       <w:lvlJc w:val="left"/>
     </w:lvl>
-    <w:lvl w:ilvl="8" w:tplc="AA308758">
+    <w:lvl w:ilvl="8" w:tplc="0ED0A1E6">
       <w:numFmt w:val="decimal"/>
       <w:lvlText w:val=""/>
       <w:lvlJc w:val="left"/>
     </w:lvl>
   </w:abstractNum>
-  <w:num w:numId="1" w16cid:durableId="683047502">
+  <w:num w:numId="1" w16cid:durableId="1869567115">
     <w:abstractNumId w:val="0"/>
     <w:lvlOverride w:ilvl="0">
       <w:startOverride w:val="1"/>
     </w:lvlOverride>
   </w:num>
-  <w:num w:numId="2" w16cid:durableId="1025328805">
+  <w:num w:numId="2" w16cid:durableId="171993729">
+    <w:abstractNumId w:val="3"/>
+    <w:lvlOverride w:ilvl="0">
+      <w:startOverride w:val="1"/>
+    </w:lvlOverride>
+  </w:num>
+  <w:num w:numId="3" w16cid:durableId="873079966">
     <w:abstractNumId w:val="2"/>
     <w:lvlOverride w:ilvl="0">
       <w:startOverride w:val="1"/>
     </w:lvlOverride>
   </w:num>
-  <w:num w:numId="3" w16cid:durableId="978073522">
-    <w:abstractNumId w:val="3"/>
-    <w:lvlOverride w:ilvl="0">
-      <w:startOverride w:val="1"/>
-    </w:lvlOverride>
-  </w:num>
-  <w:num w:numId="4" w16cid:durableId="798763126">
+  <w:num w:numId="4" w16cid:durableId="961838796">
     <w:abstractNumId w:val="1"/>
     <w:lvlOverride w:ilvl="0">
       <w:startOverride w:val="1"/>
@@ -12460,7 +12460,7 @@
     <w:autoRedefine/>
     <w:uiPriority w:val="39"/>
     <w:unhideWhenUsed/>
-    <w:rsid w:val="00C80303"/>
+    <w:rsid w:val="00D7327C"/>
     <w:pPr>
       <w:spacing w:after="100"/>
     </w:pPr>
@@ -12472,7 +12472,7 @@
     <w:autoRedefine/>
     <w:uiPriority w:val="39"/>
     <w:unhideWhenUsed/>
-    <w:rsid w:val="00C80303"/>
+    <w:rsid w:val="00D7327C"/>
     <w:pPr>
       <w:spacing w:after="100"/>
       <w:ind w:left="210"/>

</xml_diff>